<commit_message>
feat: título con geoquímica y enlaces al nuevo dueño del repo (crisrumiguano-art)
Reemplaza el cambio de título del PR #1 (química de la tierra) por el pedido
(geoquímica), en la pestaña y en la portada. Actualiza URLs del repo y de la web
en páginas, wiki, README e informe.

Co-Authored-By: Claude Opus 5.5 <noreply@anthropic.com>
</commit_message>
<xml_diff>
--- a/docs/informe_proyecto.docx
+++ b/docs/informe_proyecto.docx
@@ -94,7 +94,7 @@
           <w:rFonts w:ascii="Consolas" w:hAnsi="Consolas"/>
           <w:sz w:val="19"/>
         </w:rPr>
-        <w:t>https://dalemberv.github.io/geoquimica-earthchem-ml/</w:t>
+        <w:t>https://crisrumiguano-art.github.io/geoquimica-earthchem-ml/</w:t>
       </w:r>
     </w:p>
     <w:p>
@@ -106,7 +106,7 @@
           <w:rFonts w:ascii="Consolas" w:hAnsi="Consolas"/>
           <w:sz w:val="19"/>
         </w:rPr>
-        <w:t>https://github.com/DalemberV/geoquimica-earthchem-ml</w:t>
+        <w:t>https://github.com/crisrumiguano-art/geoquimica-earthchem-ml</w:t>
       </w:r>
     </w:p>
     <w:p>
@@ -149,7 +149,7 @@
       <w:r>
         <w:fldChar w:fldCharType="separate"/>
       </w:r>
-      <w:hyperlink w:anchor="_Toc242909124" w:history="1">
+      <w:hyperlink w:anchor="_Toc242968106" w:history="1">
         <w:r>
           <w:rPr>
             <w:rStyle w:val="Hipervnculo"/>
@@ -176,7 +176,7 @@
             <w:noProof/>
             <w:webHidden/>
           </w:rPr>
-          <w:instrText xml:space="preserve"> PAGEREF _Toc242909124 \h </w:instrText>
+          <w:instrText xml:space="preserve"> PAGEREF _Toc242968106 \h </w:instrText>
         </w:r>
         <w:r>
           <w:rPr>
@@ -217,7 +217,7 @@
           <w:noProof/>
         </w:rPr>
       </w:pPr>
-      <w:hyperlink w:anchor="_Toc242909125" w:history="1">
+      <w:hyperlink w:anchor="_Toc242968107" w:history="1">
         <w:r>
           <w:rPr>
             <w:rStyle w:val="Hipervnculo"/>
@@ -244,7 +244,7 @@
             <w:noProof/>
             <w:webHidden/>
           </w:rPr>
-          <w:instrText xml:space="preserve"> PAGEREF _Toc242909125 \h </w:instrText>
+          <w:instrText xml:space="preserve"> PAGEREF _Toc242968107 \h </w:instrText>
         </w:r>
         <w:r>
           <w:rPr>
@@ -285,7 +285,7 @@
           <w:noProof/>
         </w:rPr>
       </w:pPr>
-      <w:hyperlink w:anchor="_Toc242909126" w:history="1">
+      <w:hyperlink w:anchor="_Toc242968108" w:history="1">
         <w:r>
           <w:rPr>
             <w:rStyle w:val="Hipervnculo"/>
@@ -312,7 +312,7 @@
             <w:noProof/>
             <w:webHidden/>
           </w:rPr>
-          <w:instrText xml:space="preserve"> PAGEREF _Toc242909126 \h </w:instrText>
+          <w:instrText xml:space="preserve"> PAGEREF _Toc242968108 \h </w:instrText>
         </w:r>
         <w:r>
           <w:rPr>
@@ -353,7 +353,7 @@
           <w:noProof/>
         </w:rPr>
       </w:pPr>
-      <w:hyperlink w:anchor="_Toc242909127" w:history="1">
+      <w:hyperlink w:anchor="_Toc242968109" w:history="1">
         <w:r>
           <w:rPr>
             <w:rStyle w:val="Hipervnculo"/>
@@ -380,7 +380,7 @@
             <w:noProof/>
             <w:webHidden/>
           </w:rPr>
-          <w:instrText xml:space="preserve"> PAGEREF _Toc242909127 \h </w:instrText>
+          <w:instrText xml:space="preserve"> PAGEREF _Toc242968109 \h </w:instrText>
         </w:r>
         <w:r>
           <w:rPr>
@@ -421,7 +421,7 @@
           <w:noProof/>
         </w:rPr>
       </w:pPr>
-      <w:hyperlink w:anchor="_Toc242909128" w:history="1">
+      <w:hyperlink w:anchor="_Toc242968110" w:history="1">
         <w:r>
           <w:rPr>
             <w:rStyle w:val="Hipervnculo"/>
@@ -448,7 +448,7 @@
             <w:noProof/>
             <w:webHidden/>
           </w:rPr>
-          <w:instrText xml:space="preserve"> PAGEREF _Toc242909128 \h </w:instrText>
+          <w:instrText xml:space="preserve"> PAGEREF _Toc242968110 \h </w:instrText>
         </w:r>
         <w:r>
           <w:rPr>
@@ -489,7 +489,7 @@
           <w:noProof/>
         </w:rPr>
       </w:pPr>
-      <w:hyperlink w:anchor="_Toc242909129" w:history="1">
+      <w:hyperlink w:anchor="_Toc242968111" w:history="1">
         <w:r>
           <w:rPr>
             <w:rStyle w:val="Hipervnculo"/>
@@ -516,7 +516,7 @@
             <w:noProof/>
             <w:webHidden/>
           </w:rPr>
-          <w:instrText xml:space="preserve"> PAGEREF _Toc242909129 \h </w:instrText>
+          <w:instrText xml:space="preserve"> PAGEREF _Toc242968111 \h </w:instrText>
         </w:r>
         <w:r>
           <w:rPr>
@@ -557,7 +557,7 @@
           <w:noProof/>
         </w:rPr>
       </w:pPr>
-      <w:hyperlink w:anchor="_Toc242909130" w:history="1">
+      <w:hyperlink w:anchor="_Toc242968112" w:history="1">
         <w:r>
           <w:rPr>
             <w:rStyle w:val="Hipervnculo"/>
@@ -584,7 +584,7 @@
             <w:noProof/>
             <w:webHidden/>
           </w:rPr>
-          <w:instrText xml:space="preserve"> PAGEREF _Toc242909130 \h </w:instrText>
+          <w:instrText xml:space="preserve"> PAGEREF _Toc242968112 \h </w:instrText>
         </w:r>
         <w:r>
           <w:rPr>
@@ -625,7 +625,7 @@
           <w:noProof/>
         </w:rPr>
       </w:pPr>
-      <w:hyperlink w:anchor="_Toc242909131" w:history="1">
+      <w:hyperlink w:anchor="_Toc242968113" w:history="1">
         <w:r>
           <w:rPr>
             <w:rStyle w:val="Hipervnculo"/>
@@ -652,7 +652,7 @@
             <w:noProof/>
             <w:webHidden/>
           </w:rPr>
-          <w:instrText xml:space="preserve"> PAGEREF _Toc242909131 \h </w:instrText>
+          <w:instrText xml:space="preserve"> PAGEREF _Toc242968113 \h </w:instrText>
         </w:r>
         <w:r>
           <w:rPr>
@@ -693,7 +693,7 @@
           <w:noProof/>
         </w:rPr>
       </w:pPr>
-      <w:hyperlink w:anchor="_Toc242909132" w:history="1">
+      <w:hyperlink w:anchor="_Toc242968114" w:history="1">
         <w:r>
           <w:rPr>
             <w:rStyle w:val="Hipervnculo"/>
@@ -720,7 +720,7 @@
             <w:noProof/>
             <w:webHidden/>
           </w:rPr>
-          <w:instrText xml:space="preserve"> PAGEREF _Toc242909132 \h </w:instrText>
+          <w:instrText xml:space="preserve"> PAGEREF _Toc242968114 \h </w:instrText>
         </w:r>
         <w:r>
           <w:rPr>
@@ -761,7 +761,7 @@
           <w:noProof/>
         </w:rPr>
       </w:pPr>
-      <w:hyperlink w:anchor="_Toc242909133" w:history="1">
+      <w:hyperlink w:anchor="_Toc242968115" w:history="1">
         <w:r>
           <w:rPr>
             <w:rStyle w:val="Hipervnculo"/>
@@ -788,7 +788,7 @@
             <w:noProof/>
             <w:webHidden/>
           </w:rPr>
-          <w:instrText xml:space="preserve"> PAGEREF _Toc242909133 \h </w:instrText>
+          <w:instrText xml:space="preserve"> PAGEREF _Toc242968115 \h </w:instrText>
         </w:r>
         <w:r>
           <w:rPr>
@@ -829,7 +829,7 @@
           <w:noProof/>
         </w:rPr>
       </w:pPr>
-      <w:hyperlink w:anchor="_Toc242909134" w:history="1">
+      <w:hyperlink w:anchor="_Toc242968116" w:history="1">
         <w:r>
           <w:rPr>
             <w:rStyle w:val="Hipervnculo"/>
@@ -856,7 +856,7 @@
             <w:noProof/>
             <w:webHidden/>
           </w:rPr>
-          <w:instrText xml:space="preserve"> PAGEREF _Toc242909134 \h </w:instrText>
+          <w:instrText xml:space="preserve"> PAGEREF _Toc242968116 \h </w:instrText>
         </w:r>
         <w:r>
           <w:rPr>
@@ -897,7 +897,7 @@
           <w:noProof/>
         </w:rPr>
       </w:pPr>
-      <w:hyperlink w:anchor="_Toc242909135" w:history="1">
+      <w:hyperlink w:anchor="_Toc242968117" w:history="1">
         <w:r>
           <w:rPr>
             <w:rStyle w:val="Hipervnculo"/>
@@ -924,7 +924,7 @@
             <w:noProof/>
             <w:webHidden/>
           </w:rPr>
-          <w:instrText xml:space="preserve"> PAGEREF _Toc242909135 \h </w:instrText>
+          <w:instrText xml:space="preserve"> PAGEREF _Toc242968117 \h </w:instrText>
         </w:r>
         <w:r>
           <w:rPr>
@@ -965,7 +965,7 @@
           <w:noProof/>
         </w:rPr>
       </w:pPr>
-      <w:hyperlink w:anchor="_Toc242909136" w:history="1">
+      <w:hyperlink w:anchor="_Toc242968118" w:history="1">
         <w:r>
           <w:rPr>
             <w:rStyle w:val="Hipervnculo"/>
@@ -992,7 +992,7 @@
             <w:noProof/>
             <w:webHidden/>
           </w:rPr>
-          <w:instrText xml:space="preserve"> PAGEREF _Toc242909136 \h </w:instrText>
+          <w:instrText xml:space="preserve"> PAGEREF _Toc242968118 \h </w:instrText>
         </w:r>
         <w:r>
           <w:rPr>
@@ -1033,7 +1033,7 @@
           <w:noProof/>
         </w:rPr>
       </w:pPr>
-      <w:hyperlink w:anchor="_Toc242909137" w:history="1">
+      <w:hyperlink w:anchor="_Toc242968119" w:history="1">
         <w:r>
           <w:rPr>
             <w:rStyle w:val="Hipervnculo"/>
@@ -1060,7 +1060,7 @@
             <w:noProof/>
             <w:webHidden/>
           </w:rPr>
-          <w:instrText xml:space="preserve"> PAGEREF _Toc242909137 \h </w:instrText>
+          <w:instrText xml:space="preserve"> PAGEREF _Toc242968119 \h </w:instrText>
         </w:r>
         <w:r>
           <w:rPr>
@@ -1101,7 +1101,7 @@
           <w:noProof/>
         </w:rPr>
       </w:pPr>
-      <w:hyperlink w:anchor="_Toc242909138" w:history="1">
+      <w:hyperlink w:anchor="_Toc242968120" w:history="1">
         <w:r>
           <w:rPr>
             <w:rStyle w:val="Hipervnculo"/>
@@ -1128,7 +1128,7 @@
             <w:noProof/>
             <w:webHidden/>
           </w:rPr>
-          <w:instrText xml:space="preserve"> PAGEREF _Toc242909138 \h </w:instrText>
+          <w:instrText xml:space="preserve"> PAGEREF _Toc242968120 \h </w:instrText>
         </w:r>
         <w:r>
           <w:rPr>
@@ -1169,7 +1169,7 @@
           <w:noProof/>
         </w:rPr>
       </w:pPr>
-      <w:hyperlink w:anchor="_Toc242909139" w:history="1">
+      <w:hyperlink w:anchor="_Toc242968121" w:history="1">
         <w:r>
           <w:rPr>
             <w:rStyle w:val="Hipervnculo"/>
@@ -1196,7 +1196,7 @@
             <w:noProof/>
             <w:webHidden/>
           </w:rPr>
-          <w:instrText xml:space="preserve"> PAGEREF _Toc242909139 \h </w:instrText>
+          <w:instrText xml:space="preserve"> PAGEREF _Toc242968121 \h </w:instrText>
         </w:r>
         <w:r>
           <w:rPr>
@@ -1237,7 +1237,7 @@
           <w:noProof/>
         </w:rPr>
       </w:pPr>
-      <w:hyperlink w:anchor="_Toc242909140" w:history="1">
+      <w:hyperlink w:anchor="_Toc242968122" w:history="1">
         <w:r>
           <w:rPr>
             <w:rStyle w:val="Hipervnculo"/>
@@ -1264,7 +1264,7 @@
             <w:noProof/>
             <w:webHidden/>
           </w:rPr>
-          <w:instrText xml:space="preserve"> PAGEREF _Toc242909140 \h </w:instrText>
+          <w:instrText xml:space="preserve"> PAGEREF _Toc242968122 \h </w:instrText>
         </w:r>
         <w:r>
           <w:rPr>
@@ -1305,7 +1305,7 @@
           <w:noProof/>
         </w:rPr>
       </w:pPr>
-      <w:hyperlink w:anchor="_Toc242909141" w:history="1">
+      <w:hyperlink w:anchor="_Toc242968123" w:history="1">
         <w:r>
           <w:rPr>
             <w:rStyle w:val="Hipervnculo"/>
@@ -1332,7 +1332,7 @@
             <w:noProof/>
             <w:webHidden/>
           </w:rPr>
-          <w:instrText xml:space="preserve"> PAGEREF _Toc242909141 \h </w:instrText>
+          <w:instrText xml:space="preserve"> PAGEREF _Toc242968123 \h </w:instrText>
         </w:r>
         <w:r>
           <w:rPr>
@@ -1373,7 +1373,7 @@
           <w:noProof/>
         </w:rPr>
       </w:pPr>
-      <w:hyperlink w:anchor="_Toc242909142" w:history="1">
+      <w:hyperlink w:anchor="_Toc242968124" w:history="1">
         <w:r>
           <w:rPr>
             <w:rStyle w:val="Hipervnculo"/>
@@ -1400,7 +1400,7 @@
             <w:noProof/>
             <w:webHidden/>
           </w:rPr>
-          <w:instrText xml:space="preserve"> PAGEREF _Toc242909142 \h </w:instrText>
+          <w:instrText xml:space="preserve"> PAGEREF _Toc242968124 \h </w:instrText>
         </w:r>
         <w:r>
           <w:rPr>
@@ -1441,7 +1441,7 @@
           <w:noProof/>
         </w:rPr>
       </w:pPr>
-      <w:hyperlink w:anchor="_Toc242909143" w:history="1">
+      <w:hyperlink w:anchor="_Toc242968125" w:history="1">
         <w:r>
           <w:rPr>
             <w:rStyle w:val="Hipervnculo"/>
@@ -1468,7 +1468,7 @@
             <w:noProof/>
             <w:webHidden/>
           </w:rPr>
-          <w:instrText xml:space="preserve"> PAGEREF _Toc242909143 \h </w:instrText>
+          <w:instrText xml:space="preserve"> PAGEREF _Toc242968125 \h </w:instrText>
         </w:r>
         <w:r>
           <w:rPr>
@@ -1509,7 +1509,7 @@
           <w:noProof/>
         </w:rPr>
       </w:pPr>
-      <w:hyperlink w:anchor="_Toc242909144" w:history="1">
+      <w:hyperlink w:anchor="_Toc242968126" w:history="1">
         <w:r>
           <w:rPr>
             <w:rStyle w:val="Hipervnculo"/>
@@ -1536,7 +1536,7 @@
             <w:noProof/>
             <w:webHidden/>
           </w:rPr>
-          <w:instrText xml:space="preserve"> PAGEREF _Toc242909144 \h </w:instrText>
+          <w:instrText xml:space="preserve"> PAGEREF _Toc242968126 \h </w:instrText>
         </w:r>
         <w:r>
           <w:rPr>
@@ -1577,7 +1577,7 @@
           <w:noProof/>
         </w:rPr>
       </w:pPr>
-      <w:hyperlink w:anchor="_Toc242909145" w:history="1">
+      <w:hyperlink w:anchor="_Toc242968127" w:history="1">
         <w:r>
           <w:rPr>
             <w:rStyle w:val="Hipervnculo"/>
@@ -1604,7 +1604,7 @@
             <w:noProof/>
             <w:webHidden/>
           </w:rPr>
-          <w:instrText xml:space="preserve"> PAGEREF _Toc242909145 \h </w:instrText>
+          <w:instrText xml:space="preserve"> PAGEREF _Toc242968127 \h </w:instrText>
         </w:r>
         <w:r>
           <w:rPr>
@@ -1645,7 +1645,7 @@
           <w:noProof/>
         </w:rPr>
       </w:pPr>
-      <w:hyperlink w:anchor="_Toc242909146" w:history="1">
+      <w:hyperlink w:anchor="_Toc242968128" w:history="1">
         <w:r>
           <w:rPr>
             <w:rStyle w:val="Hipervnculo"/>
@@ -1672,7 +1672,7 @@
             <w:noProof/>
             <w:webHidden/>
           </w:rPr>
-          <w:instrText xml:space="preserve"> PAGEREF _Toc242909146 \h </w:instrText>
+          <w:instrText xml:space="preserve"> PAGEREF _Toc242968128 \h </w:instrText>
         </w:r>
         <w:r>
           <w:rPr>
@@ -1713,7 +1713,7 @@
           <w:noProof/>
         </w:rPr>
       </w:pPr>
-      <w:hyperlink w:anchor="_Toc242909147" w:history="1">
+      <w:hyperlink w:anchor="_Toc242968129" w:history="1">
         <w:r>
           <w:rPr>
             <w:rStyle w:val="Hipervnculo"/>
@@ -1740,7 +1740,7 @@
             <w:noProof/>
             <w:webHidden/>
           </w:rPr>
-          <w:instrText xml:space="preserve"> PAGEREF _Toc242909147 \h </w:instrText>
+          <w:instrText xml:space="preserve"> PAGEREF _Toc242968129 \h </w:instrText>
         </w:r>
         <w:r>
           <w:rPr>
@@ -1785,7 +1785,7 @@
       <w:pPr>
         <w:pStyle w:val="Ttulo1"/>
       </w:pPr>
-      <w:bookmarkStart w:id="0" w:name="_Toc242909124"/>
+      <w:bookmarkStart w:id="0" w:name="_Toc242968106"/>
       <w:r>
         <w:lastRenderedPageBreak/>
         <w:t>Parte I. La base de datos</w:t>
@@ -1796,7 +1796,7 @@
       <w:pPr>
         <w:pStyle w:val="Ttulo2"/>
       </w:pPr>
-      <w:bookmarkStart w:id="1" w:name="_Toc242909125"/>
+      <w:bookmarkStart w:id="1" w:name="_Toc242968107"/>
       <w:r>
         <w:t>1. Qué es esta base</w:t>
       </w:r>
@@ -1825,7 +1825,7 @@
       <w:pPr>
         <w:pStyle w:val="Ttulo2"/>
       </w:pPr>
-      <w:bookmarkStart w:id="2" w:name="_Toc242909126"/>
+      <w:bookmarkStart w:id="2" w:name="_Toc242968108"/>
       <w:r>
         <w:t>2. De dónde salieron los datos</w:t>
       </w:r>
@@ -1896,7 +1896,7 @@
       <w:pPr>
         <w:pStyle w:val="Ttulo2"/>
       </w:pPr>
-      <w:bookmarkStart w:id="3" w:name="_Toc242909127"/>
+      <w:bookmarkStart w:id="3" w:name="_Toc242968109"/>
       <w:r>
         <w:t>3. Cómo se preparó</w:t>
       </w:r>
@@ -1968,7 +1968,7 @@
       <w:pPr>
         <w:pStyle w:val="Ttulo2"/>
       </w:pPr>
-      <w:bookmarkStart w:id="4" w:name="_Toc242909128"/>
+      <w:bookmarkStart w:id="4" w:name="_Toc242968110"/>
       <w:r>
         <w:t>4. Variables</w:t>
       </w:r>
@@ -2393,7 +2393,7 @@
       <w:pPr>
         <w:pStyle w:val="Ttulo2"/>
       </w:pPr>
-      <w:bookmarkStart w:id="5" w:name="_Toc242909129"/>
+      <w:bookmarkStart w:id="5" w:name="_Toc242968111"/>
       <w:r>
         <w:t>5. Requisitos del trabajo</w:t>
       </w:r>
@@ -2639,7 +2639,7 @@
       <w:pPr>
         <w:pStyle w:val="Ttulo2"/>
       </w:pPr>
-      <w:bookmarkStart w:id="6" w:name="_Toc242909130"/>
+      <w:bookmarkStart w:id="6" w:name="_Toc242968112"/>
       <w:r>
         <w:t>6. Limitaciones que conviene conocer</w:t>
       </w:r>
@@ -2697,7 +2697,7 @@
       <w:pPr>
         <w:pStyle w:val="Ttulo2"/>
       </w:pPr>
-      <w:bookmarkStart w:id="7" w:name="_Toc242909131"/>
+      <w:bookmarkStart w:id="7" w:name="_Toc242968113"/>
       <w:r>
         <w:t>7. Acceso y cita</w:t>
       </w:r>
@@ -2738,7 +2738,7 @@
       <w:pPr>
         <w:pStyle w:val="Ttulo1"/>
       </w:pPr>
-      <w:bookmarkStart w:id="8" w:name="_Toc242909132"/>
+      <w:bookmarkStart w:id="8" w:name="_Toc242968114"/>
       <w:r>
         <w:lastRenderedPageBreak/>
         <w:t>Parte II. Estadística descriptiva</w:t>
@@ -2754,7 +2754,7 @@
       <w:pPr>
         <w:pStyle w:val="Ttulo2"/>
       </w:pPr>
-      <w:bookmarkStart w:id="9" w:name="_Toc242909133"/>
+      <w:bookmarkStart w:id="9" w:name="_Toc242968115"/>
       <w:r>
         <w:t>8. Por qué no sirvió la agrupación por defecto</w:t>
       </w:r>
@@ -2774,7 +2774,7 @@
           <w:noProof/>
         </w:rPr>
         <w:drawing>
-          <wp:inline distT="0" distB="0" distL="0" distR="0" wp14:anchorId="3286CB9E" wp14:editId="783E31B4">
+          <wp:inline distT="0" distB="0" distL="0" distR="0" wp14:anchorId="4EC35390" wp14:editId="3669978D">
             <wp:extent cx="5760000" cy="2496000"/>
             <wp:effectExtent l="0" t="0" r="0" b="0"/>
             <wp:docPr id="1" name="Picture 1"/>
@@ -2827,7 +2827,7 @@
       <w:pPr>
         <w:pStyle w:val="Ttulo2"/>
       </w:pPr>
-      <w:bookmarkStart w:id="10" w:name="_Toc242909134"/>
+      <w:bookmarkStart w:id="10" w:name="_Toc242968116"/>
       <w:r>
         <w:t>9. Outliers: otras rocas, no errores</w:t>
       </w:r>
@@ -2851,7 +2851,7 @@
         </w:rPr>
         <w:lastRenderedPageBreak/>
         <w:drawing>
-          <wp:inline distT="0" distB="0" distL="0" distR="0" wp14:anchorId="0505C745" wp14:editId="49BA65BA">
+          <wp:inline distT="0" distB="0" distL="0" distR="0" wp14:anchorId="0BE7C6B4" wp14:editId="55BEAFFF">
             <wp:extent cx="5760000" cy="3840000"/>
             <wp:effectExtent l="0" t="0" r="0" b="0"/>
             <wp:docPr id="2" name="Picture 2"/>
@@ -2924,7 +2924,7 @@
       <w:pPr>
         <w:pStyle w:val="Ttulo1"/>
       </w:pPr>
-      <w:bookmarkStart w:id="11" w:name="_Toc242909135"/>
+      <w:bookmarkStart w:id="11" w:name="_Toc242968117"/>
       <w:r>
         <w:lastRenderedPageBreak/>
         <w:t>Parte III. Cómo se construyó: documentación técnica</w:t>
@@ -2940,7 +2940,7 @@
       <w:pPr>
         <w:pStyle w:val="Ttulo2"/>
       </w:pPr>
-      <w:bookmarkStart w:id="12" w:name="_Toc242909136"/>
+      <w:bookmarkStart w:id="12" w:name="_Toc242968118"/>
       <w:r>
         <w:t>10. Arquitectura general</w:t>
       </w:r>
@@ -3133,7 +3133,7 @@
       <w:pPr>
         <w:pStyle w:val="Ttulo2"/>
       </w:pPr>
-      <w:bookmarkStart w:id="13" w:name="_Toc242909137"/>
+      <w:bookmarkStart w:id="13" w:name="_Toc242968119"/>
       <w:r>
         <w:t>11. Herramientas y librerías</w:t>
       </w:r>
@@ -4121,7 +4121,7 @@
       <w:pPr>
         <w:pStyle w:val="Ttulo2"/>
       </w:pPr>
-      <w:bookmarkStart w:id="14" w:name="_Toc242909138"/>
+      <w:bookmarkStart w:id="14" w:name="_Toc242968120"/>
       <w:r>
         <w:t>12. Limpieza de la base (scripts/limpiar.py)</w:t>
       </w:r>
@@ -4263,7 +4263,7 @@
       <w:pPr>
         <w:pStyle w:val="Ttulo2"/>
       </w:pPr>
-      <w:bookmarkStart w:id="15" w:name="_Toc242909139"/>
+      <w:bookmarkStart w:id="15" w:name="_Toc242968121"/>
       <w:r>
         <w:t>13. Mapa de ubicación (Python y QGIS)</w:t>
       </w:r>
@@ -4313,7 +4313,7 @@
         </w:rPr>
         <w:lastRenderedPageBreak/>
         <w:drawing>
-          <wp:inline distT="0" distB="0" distL="0" distR="0" wp14:anchorId="0EDD6B3D" wp14:editId="5F67AE64">
+          <wp:inline distT="0" distB="0" distL="0" distR="0" wp14:anchorId="0F72A3DB" wp14:editId="3C04B059">
             <wp:extent cx="5760000" cy="4073225"/>
             <wp:effectExtent l="0" t="0" r="0" b="0"/>
             <wp:docPr id="3" name="Picture 3"/>
@@ -4366,7 +4366,7 @@
       <w:pPr>
         <w:pStyle w:val="Ttulo2"/>
       </w:pPr>
-      <w:bookmarkStart w:id="16" w:name="_Toc242909140"/>
+      <w:bookmarkStart w:id="16" w:name="_Toc242968122"/>
       <w:r>
         <w:t>14. Estadística en R (carpeta R/)</w:t>
       </w:r>
@@ -4523,7 +4523,7 @@
       <w:pPr>
         <w:pStyle w:val="Ttulo2"/>
       </w:pPr>
-      <w:bookmarkStart w:id="17" w:name="_Toc242909141"/>
+      <w:bookmarkStart w:id="17" w:name="_Toc242968123"/>
       <w:r>
         <w:t>15. La página web</w:t>
       </w:r>
@@ -5355,7 +5355,7 @@
       <w:pPr>
         <w:pStyle w:val="Ttulo2"/>
       </w:pPr>
-      <w:bookmarkStart w:id="18" w:name="_Toc242909142"/>
+      <w:bookmarkStart w:id="18" w:name="_Toc242968124"/>
       <w:r>
         <w:t>16. Publicación y control de versiones</w:t>
       </w:r>
@@ -5378,7 +5378,7 @@
       <w:pPr>
         <w:pStyle w:val="Ttulo2"/>
       </w:pPr>
-      <w:bookmarkStart w:id="19" w:name="_Toc242909143"/>
+      <w:bookmarkStart w:id="19" w:name="_Toc242968125"/>
       <w:r>
         <w:t>17. Documentación del proyecto</w:t>
       </w:r>
@@ -5458,7 +5458,7 @@
       <w:pPr>
         <w:pStyle w:val="Ttulo2"/>
       </w:pPr>
-      <w:bookmarkStart w:id="20" w:name="_Toc242909144"/>
+      <w:bookmarkStart w:id="20" w:name="_Toc242968126"/>
       <w:r>
         <w:t>18. Cómo reproducir todo</w:t>
       </w:r>
@@ -5643,7 +5643,7 @@
       <w:pPr>
         <w:pStyle w:val="Ttulo2"/>
       </w:pPr>
-      <w:bookmarkStart w:id="21" w:name="_Toc242909145"/>
+      <w:bookmarkStart w:id="21" w:name="_Toc242968127"/>
       <w:r>
         <w:t>19. Limitaciones técnicas y mantenimiento</w:t>
       </w:r>
@@ -5698,7 +5698,7 @@
       <w:pPr>
         <w:pStyle w:val="Ttulo1"/>
       </w:pPr>
-      <w:bookmarkStart w:id="22" w:name="_Toc242909146"/>
+      <w:bookmarkStart w:id="22" w:name="_Toc242968128"/>
       <w:r>
         <w:lastRenderedPageBreak/>
         <w:t>Anexo A. Diccionario de variables</w:t>
@@ -9762,7 +9762,7 @@
       <w:pPr>
         <w:pStyle w:val="Ttulo1"/>
       </w:pPr>
-      <w:bookmarkStart w:id="23" w:name="_Toc242909147"/>
+      <w:bookmarkStart w:id="23" w:name="_Toc242968129"/>
       <w:r>
         <w:t>Anexo B. Estructura del repositorio</w:t>
       </w:r>
@@ -10216,31 +10216,31 @@
       </w:rPr>
     </w:lvl>
   </w:abstractNum>
-  <w:num w:numId="1" w16cid:durableId="1506551736">
+  <w:num w:numId="1" w16cid:durableId="750783126">
     <w:abstractNumId w:val="8"/>
   </w:num>
-  <w:num w:numId="2" w16cid:durableId="439029613">
+  <w:num w:numId="2" w16cid:durableId="1481001743">
     <w:abstractNumId w:val="6"/>
   </w:num>
-  <w:num w:numId="3" w16cid:durableId="737553602">
+  <w:num w:numId="3" w16cid:durableId="356929789">
     <w:abstractNumId w:val="5"/>
   </w:num>
-  <w:num w:numId="4" w16cid:durableId="1027289246">
+  <w:num w:numId="4" w16cid:durableId="1855533336">
     <w:abstractNumId w:val="4"/>
   </w:num>
-  <w:num w:numId="5" w16cid:durableId="904334756">
+  <w:num w:numId="5" w16cid:durableId="693383804">
     <w:abstractNumId w:val="7"/>
   </w:num>
-  <w:num w:numId="6" w16cid:durableId="1044721374">
+  <w:num w:numId="6" w16cid:durableId="742142239">
     <w:abstractNumId w:val="3"/>
   </w:num>
-  <w:num w:numId="7" w16cid:durableId="616109110">
+  <w:num w:numId="7" w16cid:durableId="806900790">
     <w:abstractNumId w:val="2"/>
   </w:num>
-  <w:num w:numId="8" w16cid:durableId="553547641">
+  <w:num w:numId="8" w16cid:durableId="2132287217">
     <w:abstractNumId w:val="1"/>
   </w:num>
-  <w:num w:numId="9" w16cid:durableId="1122069542">
+  <w:num w:numId="9" w16cid:durableId="2125995118">
     <w:abstractNumId w:val="0"/>
   </w:num>
 </w:numbering>
@@ -21631,7 +21631,7 @@
     <w:autoRedefine/>
     <w:uiPriority w:val="39"/>
     <w:unhideWhenUsed/>
-    <w:rsid w:val="00774C91"/>
+    <w:rsid w:val="00F70B7A"/>
     <w:pPr>
       <w:spacing w:after="100"/>
     </w:pPr>
@@ -21643,7 +21643,7 @@
     <w:autoRedefine/>
     <w:uiPriority w:val="39"/>
     <w:unhideWhenUsed/>
-    <w:rsid w:val="00774C91"/>
+    <w:rsid w:val="00F70B7A"/>
     <w:pPr>
       <w:spacing w:after="100"/>
       <w:ind w:left="220"/>
@@ -21654,7 +21654,7 @@
     <w:basedOn w:val="Fuentedeprrafopredeter"/>
     <w:uiPriority w:val="99"/>
     <w:unhideWhenUsed/>
-    <w:rsid w:val="00774C91"/>
+    <w:rsid w:val="00F70B7A"/>
     <w:rPr>
       <w:color w:val="0000FF" w:themeColor="hyperlink"/>
       <w:u w:val="single"/>

</xml_diff>

<commit_message>
feat: tabla de variables con el formato del curso (dominio como definición y conjunto, rango)
Co-Authored-By: Claude Opus 5.5 <noreply@anthropic.com>
</commit_message>
<xml_diff>
--- a/docs/informe_proyecto.docx
+++ b/docs/informe_proyecto.docx
@@ -149,7 +149,7 @@
       <w:r>
         <w:fldChar w:fldCharType="separate"/>
       </w:r>
-      <w:hyperlink w:anchor="_Toc242968106" w:history="1">
+      <w:hyperlink w:anchor="_Toc242990525" w:history="1">
         <w:r>
           <w:rPr>
             <w:rStyle w:val="Hipervnculo"/>
@@ -176,7 +176,7 @@
             <w:noProof/>
             <w:webHidden/>
           </w:rPr>
-          <w:instrText xml:space="preserve"> PAGEREF _Toc242968106 \h </w:instrText>
+          <w:instrText xml:space="preserve"> PAGEREF _Toc242990525 \h </w:instrText>
         </w:r>
         <w:r>
           <w:rPr>
@@ -217,7 +217,7 @@
           <w:noProof/>
         </w:rPr>
       </w:pPr>
-      <w:hyperlink w:anchor="_Toc242968107" w:history="1">
+      <w:hyperlink w:anchor="_Toc242990526" w:history="1">
         <w:r>
           <w:rPr>
             <w:rStyle w:val="Hipervnculo"/>
@@ -244,7 +244,7 @@
             <w:noProof/>
             <w:webHidden/>
           </w:rPr>
-          <w:instrText xml:space="preserve"> PAGEREF _Toc242968107 \h </w:instrText>
+          <w:instrText xml:space="preserve"> PAGEREF _Toc242990526 \h </w:instrText>
         </w:r>
         <w:r>
           <w:rPr>
@@ -285,7 +285,7 @@
           <w:noProof/>
         </w:rPr>
       </w:pPr>
-      <w:hyperlink w:anchor="_Toc242968108" w:history="1">
+      <w:hyperlink w:anchor="_Toc242990527" w:history="1">
         <w:r>
           <w:rPr>
             <w:rStyle w:val="Hipervnculo"/>
@@ -312,7 +312,7 @@
             <w:noProof/>
             <w:webHidden/>
           </w:rPr>
-          <w:instrText xml:space="preserve"> PAGEREF _Toc242968108 \h </w:instrText>
+          <w:instrText xml:space="preserve"> PAGEREF _Toc242990527 \h </w:instrText>
         </w:r>
         <w:r>
           <w:rPr>
@@ -353,7 +353,7 @@
           <w:noProof/>
         </w:rPr>
       </w:pPr>
-      <w:hyperlink w:anchor="_Toc242968109" w:history="1">
+      <w:hyperlink w:anchor="_Toc242990528" w:history="1">
         <w:r>
           <w:rPr>
             <w:rStyle w:val="Hipervnculo"/>
@@ -380,7 +380,7 @@
             <w:noProof/>
             <w:webHidden/>
           </w:rPr>
-          <w:instrText xml:space="preserve"> PAGEREF _Toc242968109 \h </w:instrText>
+          <w:instrText xml:space="preserve"> PAGEREF _Toc242990528 \h </w:instrText>
         </w:r>
         <w:r>
           <w:rPr>
@@ -421,7 +421,7 @@
           <w:noProof/>
         </w:rPr>
       </w:pPr>
-      <w:hyperlink w:anchor="_Toc242968110" w:history="1">
+      <w:hyperlink w:anchor="_Toc242990529" w:history="1">
         <w:r>
           <w:rPr>
             <w:rStyle w:val="Hipervnculo"/>
@@ -448,7 +448,7 @@
             <w:noProof/>
             <w:webHidden/>
           </w:rPr>
-          <w:instrText xml:space="preserve"> PAGEREF _Toc242968110 \h </w:instrText>
+          <w:instrText xml:space="preserve"> PAGEREF _Toc242990529 \h </w:instrText>
         </w:r>
         <w:r>
           <w:rPr>
@@ -489,7 +489,7 @@
           <w:noProof/>
         </w:rPr>
       </w:pPr>
-      <w:hyperlink w:anchor="_Toc242968111" w:history="1">
+      <w:hyperlink w:anchor="_Toc242990530" w:history="1">
         <w:r>
           <w:rPr>
             <w:rStyle w:val="Hipervnculo"/>
@@ -516,7 +516,7 @@
             <w:noProof/>
             <w:webHidden/>
           </w:rPr>
-          <w:instrText xml:space="preserve"> PAGEREF _Toc242968111 \h </w:instrText>
+          <w:instrText xml:space="preserve"> PAGEREF _Toc242990530 \h </w:instrText>
         </w:r>
         <w:r>
           <w:rPr>
@@ -557,7 +557,7 @@
           <w:noProof/>
         </w:rPr>
       </w:pPr>
-      <w:hyperlink w:anchor="_Toc242968112" w:history="1">
+      <w:hyperlink w:anchor="_Toc242990531" w:history="1">
         <w:r>
           <w:rPr>
             <w:rStyle w:val="Hipervnculo"/>
@@ -584,7 +584,7 @@
             <w:noProof/>
             <w:webHidden/>
           </w:rPr>
-          <w:instrText xml:space="preserve"> PAGEREF _Toc242968112 \h </w:instrText>
+          <w:instrText xml:space="preserve"> PAGEREF _Toc242990531 \h </w:instrText>
         </w:r>
         <w:r>
           <w:rPr>
@@ -625,7 +625,7 @@
           <w:noProof/>
         </w:rPr>
       </w:pPr>
-      <w:hyperlink w:anchor="_Toc242968113" w:history="1">
+      <w:hyperlink w:anchor="_Toc242990532" w:history="1">
         <w:r>
           <w:rPr>
             <w:rStyle w:val="Hipervnculo"/>
@@ -652,7 +652,7 @@
             <w:noProof/>
             <w:webHidden/>
           </w:rPr>
-          <w:instrText xml:space="preserve"> PAGEREF _Toc242968113 \h </w:instrText>
+          <w:instrText xml:space="preserve"> PAGEREF _Toc242990532 \h </w:instrText>
         </w:r>
         <w:r>
           <w:rPr>
@@ -693,7 +693,7 @@
           <w:noProof/>
         </w:rPr>
       </w:pPr>
-      <w:hyperlink w:anchor="_Toc242968114" w:history="1">
+      <w:hyperlink w:anchor="_Toc242990533" w:history="1">
         <w:r>
           <w:rPr>
             <w:rStyle w:val="Hipervnculo"/>
@@ -720,7 +720,7 @@
             <w:noProof/>
             <w:webHidden/>
           </w:rPr>
-          <w:instrText xml:space="preserve"> PAGEREF _Toc242968114 \h </w:instrText>
+          <w:instrText xml:space="preserve"> PAGEREF _Toc242990533 \h </w:instrText>
         </w:r>
         <w:r>
           <w:rPr>
@@ -761,7 +761,7 @@
           <w:noProof/>
         </w:rPr>
       </w:pPr>
-      <w:hyperlink w:anchor="_Toc242968115" w:history="1">
+      <w:hyperlink w:anchor="_Toc242990534" w:history="1">
         <w:r>
           <w:rPr>
             <w:rStyle w:val="Hipervnculo"/>
@@ -788,7 +788,7 @@
             <w:noProof/>
             <w:webHidden/>
           </w:rPr>
-          <w:instrText xml:space="preserve"> PAGEREF _Toc242968115 \h </w:instrText>
+          <w:instrText xml:space="preserve"> PAGEREF _Toc242990534 \h </w:instrText>
         </w:r>
         <w:r>
           <w:rPr>
@@ -829,7 +829,7 @@
           <w:noProof/>
         </w:rPr>
       </w:pPr>
-      <w:hyperlink w:anchor="_Toc242968116" w:history="1">
+      <w:hyperlink w:anchor="_Toc242990535" w:history="1">
         <w:r>
           <w:rPr>
             <w:rStyle w:val="Hipervnculo"/>
@@ -856,7 +856,7 @@
             <w:noProof/>
             <w:webHidden/>
           </w:rPr>
-          <w:instrText xml:space="preserve"> PAGEREF _Toc242968116 \h </w:instrText>
+          <w:instrText xml:space="preserve"> PAGEREF _Toc242990535 \h </w:instrText>
         </w:r>
         <w:r>
           <w:rPr>
@@ -897,7 +897,7 @@
           <w:noProof/>
         </w:rPr>
       </w:pPr>
-      <w:hyperlink w:anchor="_Toc242968117" w:history="1">
+      <w:hyperlink w:anchor="_Toc242990536" w:history="1">
         <w:r>
           <w:rPr>
             <w:rStyle w:val="Hipervnculo"/>
@@ -924,7 +924,7 @@
             <w:noProof/>
             <w:webHidden/>
           </w:rPr>
-          <w:instrText xml:space="preserve"> PAGEREF _Toc242968117 \h </w:instrText>
+          <w:instrText xml:space="preserve"> PAGEREF _Toc242990536 \h </w:instrText>
         </w:r>
         <w:r>
           <w:rPr>
@@ -965,7 +965,7 @@
           <w:noProof/>
         </w:rPr>
       </w:pPr>
-      <w:hyperlink w:anchor="_Toc242968118" w:history="1">
+      <w:hyperlink w:anchor="_Toc242990537" w:history="1">
         <w:r>
           <w:rPr>
             <w:rStyle w:val="Hipervnculo"/>
@@ -992,7 +992,7 @@
             <w:noProof/>
             <w:webHidden/>
           </w:rPr>
-          <w:instrText xml:space="preserve"> PAGEREF _Toc242968118 \h </w:instrText>
+          <w:instrText xml:space="preserve"> PAGEREF _Toc242990537 \h </w:instrText>
         </w:r>
         <w:r>
           <w:rPr>
@@ -1033,7 +1033,7 @@
           <w:noProof/>
         </w:rPr>
       </w:pPr>
-      <w:hyperlink w:anchor="_Toc242968119" w:history="1">
+      <w:hyperlink w:anchor="_Toc242990538" w:history="1">
         <w:r>
           <w:rPr>
             <w:rStyle w:val="Hipervnculo"/>
@@ -1060,7 +1060,7 @@
             <w:noProof/>
             <w:webHidden/>
           </w:rPr>
-          <w:instrText xml:space="preserve"> PAGEREF _Toc242968119 \h </w:instrText>
+          <w:instrText xml:space="preserve"> PAGEREF _Toc242990538 \h </w:instrText>
         </w:r>
         <w:r>
           <w:rPr>
@@ -1101,7 +1101,7 @@
           <w:noProof/>
         </w:rPr>
       </w:pPr>
-      <w:hyperlink w:anchor="_Toc242968120" w:history="1">
+      <w:hyperlink w:anchor="_Toc242990539" w:history="1">
         <w:r>
           <w:rPr>
             <w:rStyle w:val="Hipervnculo"/>
@@ -1128,7 +1128,7 @@
             <w:noProof/>
             <w:webHidden/>
           </w:rPr>
-          <w:instrText xml:space="preserve"> PAGEREF _Toc242968120 \h </w:instrText>
+          <w:instrText xml:space="preserve"> PAGEREF _Toc242990539 \h </w:instrText>
         </w:r>
         <w:r>
           <w:rPr>
@@ -1169,7 +1169,7 @@
           <w:noProof/>
         </w:rPr>
       </w:pPr>
-      <w:hyperlink w:anchor="_Toc242968121" w:history="1">
+      <w:hyperlink w:anchor="_Toc242990540" w:history="1">
         <w:r>
           <w:rPr>
             <w:rStyle w:val="Hipervnculo"/>
@@ -1196,7 +1196,7 @@
             <w:noProof/>
             <w:webHidden/>
           </w:rPr>
-          <w:instrText xml:space="preserve"> PAGEREF _Toc242968121 \h </w:instrText>
+          <w:instrText xml:space="preserve"> PAGEREF _Toc242990540 \h </w:instrText>
         </w:r>
         <w:r>
           <w:rPr>
@@ -1237,7 +1237,7 @@
           <w:noProof/>
         </w:rPr>
       </w:pPr>
-      <w:hyperlink w:anchor="_Toc242968122" w:history="1">
+      <w:hyperlink w:anchor="_Toc242990541" w:history="1">
         <w:r>
           <w:rPr>
             <w:rStyle w:val="Hipervnculo"/>
@@ -1264,7 +1264,7 @@
             <w:noProof/>
             <w:webHidden/>
           </w:rPr>
-          <w:instrText xml:space="preserve"> PAGEREF _Toc242968122 \h </w:instrText>
+          <w:instrText xml:space="preserve"> PAGEREF _Toc242990541 \h </w:instrText>
         </w:r>
         <w:r>
           <w:rPr>
@@ -1305,7 +1305,7 @@
           <w:noProof/>
         </w:rPr>
       </w:pPr>
-      <w:hyperlink w:anchor="_Toc242968123" w:history="1">
+      <w:hyperlink w:anchor="_Toc242990542" w:history="1">
         <w:r>
           <w:rPr>
             <w:rStyle w:val="Hipervnculo"/>
@@ -1332,7 +1332,7 @@
             <w:noProof/>
             <w:webHidden/>
           </w:rPr>
-          <w:instrText xml:space="preserve"> PAGEREF _Toc242968123 \h </w:instrText>
+          <w:instrText xml:space="preserve"> PAGEREF _Toc242990542 \h </w:instrText>
         </w:r>
         <w:r>
           <w:rPr>
@@ -1373,7 +1373,7 @@
           <w:noProof/>
         </w:rPr>
       </w:pPr>
-      <w:hyperlink w:anchor="_Toc242968124" w:history="1">
+      <w:hyperlink w:anchor="_Toc242990543" w:history="1">
         <w:r>
           <w:rPr>
             <w:rStyle w:val="Hipervnculo"/>
@@ -1400,7 +1400,7 @@
             <w:noProof/>
             <w:webHidden/>
           </w:rPr>
-          <w:instrText xml:space="preserve"> PAGEREF _Toc242968124 \h </w:instrText>
+          <w:instrText xml:space="preserve"> PAGEREF _Toc242990543 \h </w:instrText>
         </w:r>
         <w:r>
           <w:rPr>
@@ -1441,7 +1441,7 @@
           <w:noProof/>
         </w:rPr>
       </w:pPr>
-      <w:hyperlink w:anchor="_Toc242968125" w:history="1">
+      <w:hyperlink w:anchor="_Toc242990544" w:history="1">
         <w:r>
           <w:rPr>
             <w:rStyle w:val="Hipervnculo"/>
@@ -1468,7 +1468,7 @@
             <w:noProof/>
             <w:webHidden/>
           </w:rPr>
-          <w:instrText xml:space="preserve"> PAGEREF _Toc242968125 \h </w:instrText>
+          <w:instrText xml:space="preserve"> PAGEREF _Toc242990544 \h </w:instrText>
         </w:r>
         <w:r>
           <w:rPr>
@@ -1509,7 +1509,7 @@
           <w:noProof/>
         </w:rPr>
       </w:pPr>
-      <w:hyperlink w:anchor="_Toc242968126" w:history="1">
+      <w:hyperlink w:anchor="_Toc242990545" w:history="1">
         <w:r>
           <w:rPr>
             <w:rStyle w:val="Hipervnculo"/>
@@ -1536,7 +1536,7 @@
             <w:noProof/>
             <w:webHidden/>
           </w:rPr>
-          <w:instrText xml:space="preserve"> PAGEREF _Toc242968126 \h </w:instrText>
+          <w:instrText xml:space="preserve"> PAGEREF _Toc242990545 \h </w:instrText>
         </w:r>
         <w:r>
           <w:rPr>
@@ -1577,7 +1577,7 @@
           <w:noProof/>
         </w:rPr>
       </w:pPr>
-      <w:hyperlink w:anchor="_Toc242968127" w:history="1">
+      <w:hyperlink w:anchor="_Toc242990546" w:history="1">
         <w:r>
           <w:rPr>
             <w:rStyle w:val="Hipervnculo"/>
@@ -1604,7 +1604,7 @@
             <w:noProof/>
             <w:webHidden/>
           </w:rPr>
-          <w:instrText xml:space="preserve"> PAGEREF _Toc242968127 \h </w:instrText>
+          <w:instrText xml:space="preserve"> PAGEREF _Toc242990546 \h </w:instrText>
         </w:r>
         <w:r>
           <w:rPr>
@@ -1645,7 +1645,7 @@
           <w:noProof/>
         </w:rPr>
       </w:pPr>
-      <w:hyperlink w:anchor="_Toc242968128" w:history="1">
+      <w:hyperlink w:anchor="_Toc242990547" w:history="1">
         <w:r>
           <w:rPr>
             <w:rStyle w:val="Hipervnculo"/>
@@ -1672,7 +1672,7 @@
             <w:noProof/>
             <w:webHidden/>
           </w:rPr>
-          <w:instrText xml:space="preserve"> PAGEREF _Toc242968128 \h </w:instrText>
+          <w:instrText xml:space="preserve"> PAGEREF _Toc242990547 \h </w:instrText>
         </w:r>
         <w:r>
           <w:rPr>
@@ -1713,7 +1713,7 @@
           <w:noProof/>
         </w:rPr>
       </w:pPr>
-      <w:hyperlink w:anchor="_Toc242968129" w:history="1">
+      <w:hyperlink w:anchor="_Toc242990548" w:history="1">
         <w:r>
           <w:rPr>
             <w:rStyle w:val="Hipervnculo"/>
@@ -1740,7 +1740,7 @@
             <w:noProof/>
             <w:webHidden/>
           </w:rPr>
-          <w:instrText xml:space="preserve"> PAGEREF _Toc242968129 \h </w:instrText>
+          <w:instrText xml:space="preserve"> PAGEREF _Toc242990548 \h </w:instrText>
         </w:r>
         <w:r>
           <w:rPr>
@@ -1785,7 +1785,7 @@
       <w:pPr>
         <w:pStyle w:val="Ttulo1"/>
       </w:pPr>
-      <w:bookmarkStart w:id="0" w:name="_Toc242968106"/>
+      <w:bookmarkStart w:id="0" w:name="_Toc242990525"/>
       <w:r>
         <w:lastRenderedPageBreak/>
         <w:t>Parte I. La base de datos</w:t>
@@ -1796,7 +1796,7 @@
       <w:pPr>
         <w:pStyle w:val="Ttulo2"/>
       </w:pPr>
-      <w:bookmarkStart w:id="1" w:name="_Toc242968107"/>
+      <w:bookmarkStart w:id="1" w:name="_Toc242990526"/>
       <w:r>
         <w:t>1. Qué es esta base</w:t>
       </w:r>
@@ -1825,7 +1825,7 @@
       <w:pPr>
         <w:pStyle w:val="Ttulo2"/>
       </w:pPr>
-      <w:bookmarkStart w:id="2" w:name="_Toc242968108"/>
+      <w:bookmarkStart w:id="2" w:name="_Toc242990527"/>
       <w:r>
         <w:t>2. De dónde salieron los datos</w:t>
       </w:r>
@@ -1896,7 +1896,7 @@
       <w:pPr>
         <w:pStyle w:val="Ttulo2"/>
       </w:pPr>
-      <w:bookmarkStart w:id="3" w:name="_Toc242968109"/>
+      <w:bookmarkStart w:id="3" w:name="_Toc242990528"/>
       <w:r>
         <w:t>3. Cómo se preparó</w:t>
       </w:r>
@@ -1968,7 +1968,7 @@
       <w:pPr>
         <w:pStyle w:val="Ttulo2"/>
       </w:pPr>
-      <w:bookmarkStart w:id="4" w:name="_Toc242968110"/>
+      <w:bookmarkStart w:id="4" w:name="_Toc242990529"/>
       <w:r>
         <w:t>4. Variables</w:t>
       </w:r>
@@ -2376,7 +2376,7 @@
     </w:p>
     <w:p>
       <w:r>
-        <w:t xml:space="preserve">La tabla de variables completa, con tipo, subtipo, escala de medición, instrumento analítico, unidad, dominio y porcentaje con dato, está en la página web (Estadística descriptiva) y en </w:t>
+        <w:t xml:space="preserve">La tabla de variables completa sigue el formato de la plantilla del curso: nombre, descripción, tipo, subtipo, dominio (como definición y como conjunto, por ejemplo D={x/x es concentración ^ x ∈ R} y D={x/x ∈ R+ ∪ {0}}), rango observado (por ejemplo R={y/ 0.0011 ≤ y ≤ 98.9} para el SiO2), instrumento analítico, unidad y escala de medición. Está en la página web (Estadística descriptiva) y en </w:t>
       </w:r>
       <w:r>
         <w:rPr>
@@ -2393,7 +2393,7 @@
       <w:pPr>
         <w:pStyle w:val="Ttulo2"/>
       </w:pPr>
-      <w:bookmarkStart w:id="5" w:name="_Toc242968111"/>
+      <w:bookmarkStart w:id="5" w:name="_Toc242990530"/>
       <w:r>
         <w:t>5. Requisitos del trabajo</w:t>
       </w:r>
@@ -2639,7 +2639,7 @@
       <w:pPr>
         <w:pStyle w:val="Ttulo2"/>
       </w:pPr>
-      <w:bookmarkStart w:id="6" w:name="_Toc242968112"/>
+      <w:bookmarkStart w:id="6" w:name="_Toc242990531"/>
       <w:r>
         <w:t>6. Limitaciones que conviene conocer</w:t>
       </w:r>
@@ -2683,21 +2683,18 @@
         <w:rPr>
           <w:b/>
         </w:rPr>
+        <w:lastRenderedPageBreak/>
         <w:t xml:space="preserve">Sesgos de origen. </w:t>
       </w:r>
       <w:r>
-        <w:t xml:space="preserve">Hay muchos más basaltos de fondo oceánico que rocas continentales y los métodos de laboratorio cambiaron en casi un siglo. El ambiente más frecuente, spreading center, reúne 26.621 </w:t>
-      </w:r>
-      <w:r>
-        <w:lastRenderedPageBreak/>
-        <w:t>muestras, mientras otros tienen apenas decenas. La muestra no es probabilística: la inferencia deberá hacerse con submuestras aleatorias estratificadas.</w:t>
+        <w:t>Hay muchos más basaltos de fondo oceánico que rocas continentales y los métodos de laboratorio cambiaron en casi un siglo. El ambiente más frecuente, spreading center, reúne 26.621 muestras, mientras otros tienen apenas decenas. La muestra no es probabilística: la inferencia deberá hacerse con submuestras aleatorias estratificadas.</w:t>
       </w:r>
     </w:p>
     <w:p>
       <w:pPr>
         <w:pStyle w:val="Ttulo2"/>
       </w:pPr>
-      <w:bookmarkStart w:id="7" w:name="_Toc242968113"/>
+      <w:bookmarkStart w:id="7" w:name="_Toc242990532"/>
       <w:r>
         <w:t>7. Acceso y cita</w:t>
       </w:r>
@@ -2738,7 +2735,7 @@
       <w:pPr>
         <w:pStyle w:val="Ttulo1"/>
       </w:pPr>
-      <w:bookmarkStart w:id="8" w:name="_Toc242968114"/>
+      <w:bookmarkStart w:id="8" w:name="_Toc242990533"/>
       <w:r>
         <w:lastRenderedPageBreak/>
         <w:t>Parte II. Estadística descriptiva</w:t>
@@ -2754,7 +2751,7 @@
       <w:pPr>
         <w:pStyle w:val="Ttulo2"/>
       </w:pPr>
-      <w:bookmarkStart w:id="9" w:name="_Toc242968115"/>
+      <w:bookmarkStart w:id="9" w:name="_Toc242990534"/>
       <w:r>
         <w:t>8. Por qué no sirvió la agrupación por defecto</w:t>
       </w:r>
@@ -2774,7 +2771,7 @@
           <w:noProof/>
         </w:rPr>
         <w:drawing>
-          <wp:inline distT="0" distB="0" distL="0" distR="0" wp14:anchorId="4EC35390" wp14:editId="3669978D">
+          <wp:inline distT="0" distB="0" distL="0" distR="0" wp14:anchorId="139146D0" wp14:editId="47564FE3">
             <wp:extent cx="5760000" cy="2496000"/>
             <wp:effectExtent l="0" t="0" r="0" b="0"/>
             <wp:docPr id="1" name="Picture 1"/>
@@ -2827,7 +2824,7 @@
       <w:pPr>
         <w:pStyle w:val="Ttulo2"/>
       </w:pPr>
-      <w:bookmarkStart w:id="10" w:name="_Toc242968116"/>
+      <w:bookmarkStart w:id="10" w:name="_Toc242990535"/>
       <w:r>
         <w:t>9. Outliers: otras rocas, no errores</w:t>
       </w:r>
@@ -2851,7 +2848,7 @@
         </w:rPr>
         <w:lastRenderedPageBreak/>
         <w:drawing>
-          <wp:inline distT="0" distB="0" distL="0" distR="0" wp14:anchorId="0BE7C6B4" wp14:editId="55BEAFFF">
+          <wp:inline distT="0" distB="0" distL="0" distR="0" wp14:anchorId="55438564" wp14:editId="1A612393">
             <wp:extent cx="5760000" cy="3840000"/>
             <wp:effectExtent l="0" t="0" r="0" b="0"/>
             <wp:docPr id="2" name="Picture 2"/>
@@ -2924,7 +2921,7 @@
       <w:pPr>
         <w:pStyle w:val="Ttulo1"/>
       </w:pPr>
-      <w:bookmarkStart w:id="11" w:name="_Toc242968117"/>
+      <w:bookmarkStart w:id="11" w:name="_Toc242990536"/>
       <w:r>
         <w:lastRenderedPageBreak/>
         <w:t>Parte III. Cómo se construyó: documentación técnica</w:t>
@@ -2940,7 +2937,7 @@
       <w:pPr>
         <w:pStyle w:val="Ttulo2"/>
       </w:pPr>
-      <w:bookmarkStart w:id="12" w:name="_Toc242968118"/>
+      <w:bookmarkStart w:id="12" w:name="_Toc242990537"/>
       <w:r>
         <w:t>10. Arquitectura general</w:t>
       </w:r>
@@ -3133,7 +3130,7 @@
       <w:pPr>
         <w:pStyle w:val="Ttulo2"/>
       </w:pPr>
-      <w:bookmarkStart w:id="13" w:name="_Toc242968119"/>
+      <w:bookmarkStart w:id="13" w:name="_Toc242990538"/>
       <w:r>
         <w:t>11. Herramientas y librerías</w:t>
       </w:r>
@@ -4121,7 +4118,7 @@
       <w:pPr>
         <w:pStyle w:val="Ttulo2"/>
       </w:pPr>
-      <w:bookmarkStart w:id="14" w:name="_Toc242968120"/>
+      <w:bookmarkStart w:id="14" w:name="_Toc242990539"/>
       <w:r>
         <w:t>12. Limpieza de la base (scripts/limpiar.py)</w:t>
       </w:r>
@@ -4263,7 +4260,7 @@
       <w:pPr>
         <w:pStyle w:val="Ttulo2"/>
       </w:pPr>
-      <w:bookmarkStart w:id="15" w:name="_Toc242968121"/>
+      <w:bookmarkStart w:id="15" w:name="_Toc242990540"/>
       <w:r>
         <w:t>13. Mapa de ubicación (Python y QGIS)</w:t>
       </w:r>
@@ -4313,7 +4310,7 @@
         </w:rPr>
         <w:lastRenderedPageBreak/>
         <w:drawing>
-          <wp:inline distT="0" distB="0" distL="0" distR="0" wp14:anchorId="0F72A3DB" wp14:editId="3C04B059">
+          <wp:inline distT="0" distB="0" distL="0" distR="0" wp14:anchorId="1B9E7481" wp14:editId="28E831E3">
             <wp:extent cx="5760000" cy="4073225"/>
             <wp:effectExtent l="0" t="0" r="0" b="0"/>
             <wp:docPr id="3" name="Picture 3"/>
@@ -4366,7 +4363,7 @@
       <w:pPr>
         <w:pStyle w:val="Ttulo2"/>
       </w:pPr>
-      <w:bookmarkStart w:id="16" w:name="_Toc242968122"/>
+      <w:bookmarkStart w:id="16" w:name="_Toc242990541"/>
       <w:r>
         <w:t>14. Estadística en R (carpeta R/)</w:t>
       </w:r>
@@ -4523,7 +4520,7 @@
       <w:pPr>
         <w:pStyle w:val="Ttulo2"/>
       </w:pPr>
-      <w:bookmarkStart w:id="17" w:name="_Toc242968123"/>
+      <w:bookmarkStart w:id="17" w:name="_Toc242990542"/>
       <w:r>
         <w:t>15. La página web</w:t>
       </w:r>
@@ -5355,7 +5352,7 @@
       <w:pPr>
         <w:pStyle w:val="Ttulo2"/>
       </w:pPr>
-      <w:bookmarkStart w:id="18" w:name="_Toc242968124"/>
+      <w:bookmarkStart w:id="18" w:name="_Toc242990543"/>
       <w:r>
         <w:t>16. Publicación y control de versiones</w:t>
       </w:r>
@@ -5378,7 +5375,7 @@
       <w:pPr>
         <w:pStyle w:val="Ttulo2"/>
       </w:pPr>
-      <w:bookmarkStart w:id="19" w:name="_Toc242968125"/>
+      <w:bookmarkStart w:id="19" w:name="_Toc242990544"/>
       <w:r>
         <w:t>17. Documentación del proyecto</w:t>
       </w:r>
@@ -5458,7 +5455,7 @@
       <w:pPr>
         <w:pStyle w:val="Ttulo2"/>
       </w:pPr>
-      <w:bookmarkStart w:id="20" w:name="_Toc242968126"/>
+      <w:bookmarkStart w:id="20" w:name="_Toc242990545"/>
       <w:r>
         <w:t>18. Cómo reproducir todo</w:t>
       </w:r>
@@ -5643,7 +5640,7 @@
       <w:pPr>
         <w:pStyle w:val="Ttulo2"/>
       </w:pPr>
-      <w:bookmarkStart w:id="21" w:name="_Toc242968127"/>
+      <w:bookmarkStart w:id="21" w:name="_Toc242990546"/>
       <w:r>
         <w:t>19. Limitaciones técnicas y mantenimiento</w:t>
       </w:r>
@@ -5698,7 +5695,7 @@
       <w:pPr>
         <w:pStyle w:val="Ttulo1"/>
       </w:pPr>
-      <w:bookmarkStart w:id="22" w:name="_Toc242968128"/>
+      <w:bookmarkStart w:id="22" w:name="_Toc242990547"/>
       <w:r>
         <w:lastRenderedPageBreak/>
         <w:t>Anexo A. Diccionario de variables</w:t>
@@ -9762,7 +9759,7 @@
       <w:pPr>
         <w:pStyle w:val="Ttulo1"/>
       </w:pPr>
-      <w:bookmarkStart w:id="23" w:name="_Toc242968129"/>
+      <w:bookmarkStart w:id="23" w:name="_Toc242990548"/>
       <w:r>
         <w:t>Anexo B. Estructura del repositorio</w:t>
       </w:r>
@@ -10216,31 +10213,31 @@
       </w:rPr>
     </w:lvl>
   </w:abstractNum>
-  <w:num w:numId="1" w16cid:durableId="750783126">
+  <w:num w:numId="1" w16cid:durableId="1307318255">
     <w:abstractNumId w:val="8"/>
   </w:num>
-  <w:num w:numId="2" w16cid:durableId="1481001743">
+  <w:num w:numId="2" w16cid:durableId="1952320731">
     <w:abstractNumId w:val="6"/>
   </w:num>
-  <w:num w:numId="3" w16cid:durableId="356929789">
+  <w:num w:numId="3" w16cid:durableId="246043030">
     <w:abstractNumId w:val="5"/>
   </w:num>
-  <w:num w:numId="4" w16cid:durableId="1855533336">
+  <w:num w:numId="4" w16cid:durableId="1083527925">
     <w:abstractNumId w:val="4"/>
   </w:num>
-  <w:num w:numId="5" w16cid:durableId="693383804">
+  <w:num w:numId="5" w16cid:durableId="1130975453">
     <w:abstractNumId w:val="7"/>
   </w:num>
-  <w:num w:numId="6" w16cid:durableId="742142239">
+  <w:num w:numId="6" w16cid:durableId="1708793512">
     <w:abstractNumId w:val="3"/>
   </w:num>
-  <w:num w:numId="7" w16cid:durableId="806900790">
+  <w:num w:numId="7" w16cid:durableId="157964927">
     <w:abstractNumId w:val="2"/>
   </w:num>
-  <w:num w:numId="8" w16cid:durableId="2132287217">
+  <w:num w:numId="8" w16cid:durableId="1015958962">
     <w:abstractNumId w:val="1"/>
   </w:num>
-  <w:num w:numId="9" w16cid:durableId="2125995118">
+  <w:num w:numId="9" w16cid:durableId="309362445">
     <w:abstractNumId w:val="0"/>
   </w:num>
 </w:numbering>
@@ -21631,7 +21628,7 @@
     <w:autoRedefine/>
     <w:uiPriority w:val="39"/>
     <w:unhideWhenUsed/>
-    <w:rsid w:val="00F70B7A"/>
+    <w:rsid w:val="00E9004F"/>
     <w:pPr>
       <w:spacing w:after="100"/>
     </w:pPr>
@@ -21643,7 +21640,7 @@
     <w:autoRedefine/>
     <w:uiPriority w:val="39"/>
     <w:unhideWhenUsed/>
-    <w:rsid w:val="00F70B7A"/>
+    <w:rsid w:val="00E9004F"/>
     <w:pPr>
       <w:spacing w:after="100"/>
       <w:ind w:left="220"/>
@@ -21654,7 +21651,7 @@
     <w:basedOn w:val="Fuentedeprrafopredeter"/>
     <w:uiPriority w:val="99"/>
     <w:unhideWhenUsed/>
-    <w:rsid w:val="00F70B7A"/>
+    <w:rsid w:val="00E9004F"/>
     <w:rPr>
       <w:color w:val="0000FF" w:themeColor="hyperlink"/>
       <w:u w:val="single"/>

</xml_diff>

<commit_message>
docs: informe con guía para el equipo, dominio y rango, y regresiones; datos crudos respaldados en Drive
- informe: guía rápida (enlaces, estado por lección, ideas clave, glosario), sección 4.1
  dominio y rango con ejemplos, sección 10 disponibilidad de datos para regresiones
- limpiar.py y tabla_variables.py leen por defecto data/raw/crudos (junction a Google Drive)
- AGENTS.md y openwiki con el estado actual: dueño del repo, respaldo, formato de la tabla

Co-Authored-By: Claude Opus 5.5 <noreply@anthropic.com>
</commit_message>
<xml_diff>
--- a/docs/informe_proyecto.docx
+++ b/docs/informe_proyecto.docx
@@ -149,13 +149,13 @@
       <w:r>
         <w:fldChar w:fldCharType="separate"/>
       </w:r>
-      <w:hyperlink w:anchor="_Toc242990525" w:history="1">
+      <w:hyperlink w:anchor="_Toc242992762" w:history="1">
         <w:r>
           <w:rPr>
             <w:rStyle w:val="Hipervnculo"/>
             <w:noProof/>
           </w:rPr>
-          <w:t>Parte I. La base de datos</w:t>
+          <w:t>Guía rápida para el equipo</w:t>
         </w:r>
         <w:r>
           <w:rPr>
@@ -176,7 +176,7 @@
             <w:noProof/>
             <w:webHidden/>
           </w:rPr>
-          <w:instrText xml:space="preserve"> PAGEREF _Toc242990525 \h </w:instrText>
+          <w:instrText xml:space="preserve"> PAGEREF _Toc242992762 \h </w:instrText>
         </w:r>
         <w:r>
           <w:rPr>
@@ -217,13 +217,13 @@
           <w:noProof/>
         </w:rPr>
       </w:pPr>
-      <w:hyperlink w:anchor="_Toc242990526" w:history="1">
+      <w:hyperlink w:anchor="_Toc242992763" w:history="1">
         <w:r>
           <w:rPr>
             <w:rStyle w:val="Hipervnculo"/>
             <w:noProof/>
           </w:rPr>
-          <w:t>1. Qué es esta base</w:t>
+          <w:t>Dónde está cada cosa</w:t>
         </w:r>
         <w:r>
           <w:rPr>
@@ -244,7 +244,7 @@
             <w:noProof/>
             <w:webHidden/>
           </w:rPr>
-          <w:instrText xml:space="preserve"> PAGEREF _Toc242990526 \h </w:instrText>
+          <w:instrText xml:space="preserve"> PAGEREF _Toc242992763 \h </w:instrText>
         </w:r>
         <w:r>
           <w:rPr>
@@ -285,13 +285,13 @@
           <w:noProof/>
         </w:rPr>
       </w:pPr>
-      <w:hyperlink w:anchor="_Toc242990527" w:history="1">
+      <w:hyperlink w:anchor="_Toc242992764" w:history="1">
         <w:r>
           <w:rPr>
             <w:rStyle w:val="Hipervnculo"/>
             <w:noProof/>
           </w:rPr>
-          <w:t>2. De dónde salieron los datos</w:t>
+          <w:t>Qué tiene la página web</w:t>
         </w:r>
         <w:r>
           <w:rPr>
@@ -312,7 +312,7 @@
             <w:noProof/>
             <w:webHidden/>
           </w:rPr>
-          <w:instrText xml:space="preserve"> PAGEREF _Toc242990527 \h </w:instrText>
+          <w:instrText xml:space="preserve"> PAGEREF _Toc242992764 \h </w:instrText>
         </w:r>
         <w:r>
           <w:rPr>
@@ -353,13 +353,13 @@
           <w:noProof/>
         </w:rPr>
       </w:pPr>
-      <w:hyperlink w:anchor="_Toc242990528" w:history="1">
+      <w:hyperlink w:anchor="_Toc242992765" w:history="1">
         <w:r>
           <w:rPr>
             <w:rStyle w:val="Hipervnculo"/>
             <w:noProof/>
           </w:rPr>
-          <w:t>3. Cómo se preparó</w:t>
+          <w:t>Estado por lección</w:t>
         </w:r>
         <w:r>
           <w:rPr>
@@ -380,7 +380,7 @@
             <w:noProof/>
             <w:webHidden/>
           </w:rPr>
-          <w:instrText xml:space="preserve"> PAGEREF _Toc242990528 \h </w:instrText>
+          <w:instrText xml:space="preserve"> PAGEREF _Toc242992765 \h </w:instrText>
         </w:r>
         <w:r>
           <w:rPr>
@@ -421,13 +421,13 @@
           <w:noProof/>
         </w:rPr>
       </w:pPr>
-      <w:hyperlink w:anchor="_Toc242990529" w:history="1">
+      <w:hyperlink w:anchor="_Toc242992766" w:history="1">
         <w:r>
           <w:rPr>
             <w:rStyle w:val="Hipervnculo"/>
             <w:noProof/>
           </w:rPr>
-          <w:t>4. Variables</w:t>
+          <w:t>Cinco ideas clave para la exposición</w:t>
         </w:r>
         <w:r>
           <w:rPr>
@@ -448,7 +448,7 @@
             <w:noProof/>
             <w:webHidden/>
           </w:rPr>
-          <w:instrText xml:space="preserve"> PAGEREF _Toc242990529 \h </w:instrText>
+          <w:instrText xml:space="preserve"> PAGEREF _Toc242992766 \h </w:instrText>
         </w:r>
         <w:r>
           <w:rPr>
@@ -489,13 +489,13 @@
           <w:noProof/>
         </w:rPr>
       </w:pPr>
-      <w:hyperlink w:anchor="_Toc242990530" w:history="1">
+      <w:hyperlink w:anchor="_Toc242992767" w:history="1">
         <w:r>
           <w:rPr>
             <w:rStyle w:val="Hipervnculo"/>
             <w:noProof/>
           </w:rPr>
-          <w:t>5. Requisitos del trabajo</w:t>
+          <w:t>Cómo trabajar con los archivos en tu computadora</w:t>
         </w:r>
         <w:r>
           <w:rPr>
@@ -516,7 +516,7 @@
             <w:noProof/>
             <w:webHidden/>
           </w:rPr>
-          <w:instrText xml:space="preserve"> PAGEREF _Toc242990530 \h </w:instrText>
+          <w:instrText xml:space="preserve"> PAGEREF _Toc242992767 \h </w:instrText>
         </w:r>
         <w:r>
           <w:rPr>
@@ -557,13 +557,13 @@
           <w:noProof/>
         </w:rPr>
       </w:pPr>
-      <w:hyperlink w:anchor="_Toc242990531" w:history="1">
+      <w:hyperlink w:anchor="_Toc242992768" w:history="1">
         <w:r>
           <w:rPr>
             <w:rStyle w:val="Hipervnculo"/>
             <w:noProof/>
           </w:rPr>
-          <w:t>6. Limitaciones que conviene conocer</w:t>
+          <w:t>Glosario</w:t>
         </w:r>
         <w:r>
           <w:rPr>
@@ -584,7 +584,7 @@
             <w:noProof/>
             <w:webHidden/>
           </w:rPr>
-          <w:instrText xml:space="preserve"> PAGEREF _Toc242990531 \h </w:instrText>
+          <w:instrText xml:space="preserve"> PAGEREF _Toc242992768 \h </w:instrText>
         </w:r>
         <w:r>
           <w:rPr>
@@ -605,6 +605,74 @@
             <w:webHidden/>
           </w:rPr>
           <w:t>4</w:t>
+        </w:r>
+        <w:r>
+          <w:rPr>
+            <w:noProof/>
+            <w:webHidden/>
+          </w:rPr>
+          <w:fldChar w:fldCharType="end"/>
+        </w:r>
+      </w:hyperlink>
+    </w:p>
+    <w:p>
+      <w:pPr>
+        <w:pStyle w:val="TDC1"/>
+        <w:tabs>
+          <w:tab w:val="right" w:leader="dot" w:pos="9288"/>
+        </w:tabs>
+        <w:rPr>
+          <w:noProof/>
+        </w:rPr>
+      </w:pPr>
+      <w:hyperlink w:anchor="_Toc242992769" w:history="1">
+        <w:r>
+          <w:rPr>
+            <w:rStyle w:val="Hipervnculo"/>
+            <w:noProof/>
+          </w:rPr>
+          <w:t>Parte I. La base de datos</w:t>
+        </w:r>
+        <w:r>
+          <w:rPr>
+            <w:noProof/>
+            <w:webHidden/>
+          </w:rPr>
+          <w:tab/>
+        </w:r>
+        <w:r>
+          <w:rPr>
+            <w:noProof/>
+            <w:webHidden/>
+          </w:rPr>
+          <w:fldChar w:fldCharType="begin"/>
+        </w:r>
+        <w:r>
+          <w:rPr>
+            <w:noProof/>
+            <w:webHidden/>
+          </w:rPr>
+          <w:instrText xml:space="preserve"> PAGEREF _Toc242992769 \h </w:instrText>
+        </w:r>
+        <w:r>
+          <w:rPr>
+            <w:noProof/>
+            <w:webHidden/>
+          </w:rPr>
+        </w:r>
+        <w:r>
+          <w:rPr>
+            <w:noProof/>
+            <w:webHidden/>
+          </w:rPr>
+          <w:fldChar w:fldCharType="separate"/>
+        </w:r>
+        <w:r>
+          <w:rPr>
+            <w:noProof/>
+            <w:webHidden/>
+          </w:rPr>
+          <w:t>5</w:t>
         </w:r>
         <w:r>
           <w:rPr>
@@ -625,12 +693,420 @@
           <w:noProof/>
         </w:rPr>
       </w:pPr>
-      <w:hyperlink w:anchor="_Toc242990532" w:history="1">
+      <w:hyperlink w:anchor="_Toc242992770" w:history="1">
         <w:r>
           <w:rPr>
             <w:rStyle w:val="Hipervnculo"/>
             <w:noProof/>
           </w:rPr>
+          <w:t>1. Qué es esta base</w:t>
+        </w:r>
+        <w:r>
+          <w:rPr>
+            <w:noProof/>
+            <w:webHidden/>
+          </w:rPr>
+          <w:tab/>
+        </w:r>
+        <w:r>
+          <w:rPr>
+            <w:noProof/>
+            <w:webHidden/>
+          </w:rPr>
+          <w:fldChar w:fldCharType="begin"/>
+        </w:r>
+        <w:r>
+          <w:rPr>
+            <w:noProof/>
+            <w:webHidden/>
+          </w:rPr>
+          <w:instrText xml:space="preserve"> PAGEREF _Toc242992770 \h </w:instrText>
+        </w:r>
+        <w:r>
+          <w:rPr>
+            <w:noProof/>
+            <w:webHidden/>
+          </w:rPr>
+        </w:r>
+        <w:r>
+          <w:rPr>
+            <w:noProof/>
+            <w:webHidden/>
+          </w:rPr>
+          <w:fldChar w:fldCharType="separate"/>
+        </w:r>
+        <w:r>
+          <w:rPr>
+            <w:noProof/>
+            <w:webHidden/>
+          </w:rPr>
+          <w:t>5</w:t>
+        </w:r>
+        <w:r>
+          <w:rPr>
+            <w:noProof/>
+            <w:webHidden/>
+          </w:rPr>
+          <w:fldChar w:fldCharType="end"/>
+        </w:r>
+      </w:hyperlink>
+    </w:p>
+    <w:p>
+      <w:pPr>
+        <w:pStyle w:val="TDC2"/>
+        <w:tabs>
+          <w:tab w:val="right" w:leader="dot" w:pos="9288"/>
+        </w:tabs>
+        <w:rPr>
+          <w:noProof/>
+        </w:rPr>
+      </w:pPr>
+      <w:hyperlink w:anchor="_Toc242992771" w:history="1">
+        <w:r>
+          <w:rPr>
+            <w:rStyle w:val="Hipervnculo"/>
+            <w:noProof/>
+          </w:rPr>
+          <w:t>2. De dónde salieron los datos</w:t>
+        </w:r>
+        <w:r>
+          <w:rPr>
+            <w:noProof/>
+            <w:webHidden/>
+          </w:rPr>
+          <w:tab/>
+        </w:r>
+        <w:r>
+          <w:rPr>
+            <w:noProof/>
+            <w:webHidden/>
+          </w:rPr>
+          <w:fldChar w:fldCharType="begin"/>
+        </w:r>
+        <w:r>
+          <w:rPr>
+            <w:noProof/>
+            <w:webHidden/>
+          </w:rPr>
+          <w:instrText xml:space="preserve"> PAGEREF _Toc242992771 \h </w:instrText>
+        </w:r>
+        <w:r>
+          <w:rPr>
+            <w:noProof/>
+            <w:webHidden/>
+          </w:rPr>
+        </w:r>
+        <w:r>
+          <w:rPr>
+            <w:noProof/>
+            <w:webHidden/>
+          </w:rPr>
+          <w:fldChar w:fldCharType="separate"/>
+        </w:r>
+        <w:r>
+          <w:rPr>
+            <w:noProof/>
+            <w:webHidden/>
+          </w:rPr>
+          <w:t>5</w:t>
+        </w:r>
+        <w:r>
+          <w:rPr>
+            <w:noProof/>
+            <w:webHidden/>
+          </w:rPr>
+          <w:fldChar w:fldCharType="end"/>
+        </w:r>
+      </w:hyperlink>
+    </w:p>
+    <w:p>
+      <w:pPr>
+        <w:pStyle w:val="TDC2"/>
+        <w:tabs>
+          <w:tab w:val="right" w:leader="dot" w:pos="9288"/>
+        </w:tabs>
+        <w:rPr>
+          <w:noProof/>
+        </w:rPr>
+      </w:pPr>
+      <w:hyperlink w:anchor="_Toc242992772" w:history="1">
+        <w:r>
+          <w:rPr>
+            <w:rStyle w:val="Hipervnculo"/>
+            <w:noProof/>
+          </w:rPr>
+          <w:t>3. Cómo se preparó</w:t>
+        </w:r>
+        <w:r>
+          <w:rPr>
+            <w:noProof/>
+            <w:webHidden/>
+          </w:rPr>
+          <w:tab/>
+        </w:r>
+        <w:r>
+          <w:rPr>
+            <w:noProof/>
+            <w:webHidden/>
+          </w:rPr>
+          <w:fldChar w:fldCharType="begin"/>
+        </w:r>
+        <w:r>
+          <w:rPr>
+            <w:noProof/>
+            <w:webHidden/>
+          </w:rPr>
+          <w:instrText xml:space="preserve"> PAGEREF _Toc242992772 \h </w:instrText>
+        </w:r>
+        <w:r>
+          <w:rPr>
+            <w:noProof/>
+            <w:webHidden/>
+          </w:rPr>
+        </w:r>
+        <w:r>
+          <w:rPr>
+            <w:noProof/>
+            <w:webHidden/>
+          </w:rPr>
+          <w:fldChar w:fldCharType="separate"/>
+        </w:r>
+        <w:r>
+          <w:rPr>
+            <w:noProof/>
+            <w:webHidden/>
+          </w:rPr>
+          <w:t>5</w:t>
+        </w:r>
+        <w:r>
+          <w:rPr>
+            <w:noProof/>
+            <w:webHidden/>
+          </w:rPr>
+          <w:fldChar w:fldCharType="end"/>
+        </w:r>
+      </w:hyperlink>
+    </w:p>
+    <w:p>
+      <w:pPr>
+        <w:pStyle w:val="TDC2"/>
+        <w:tabs>
+          <w:tab w:val="right" w:leader="dot" w:pos="9288"/>
+        </w:tabs>
+        <w:rPr>
+          <w:noProof/>
+        </w:rPr>
+      </w:pPr>
+      <w:hyperlink w:anchor="_Toc242992773" w:history="1">
+        <w:r>
+          <w:rPr>
+            <w:rStyle w:val="Hipervnculo"/>
+            <w:noProof/>
+          </w:rPr>
+          <w:t>4. Variables</w:t>
+        </w:r>
+        <w:r>
+          <w:rPr>
+            <w:noProof/>
+            <w:webHidden/>
+          </w:rPr>
+          <w:tab/>
+        </w:r>
+        <w:r>
+          <w:rPr>
+            <w:noProof/>
+            <w:webHidden/>
+          </w:rPr>
+          <w:fldChar w:fldCharType="begin"/>
+        </w:r>
+        <w:r>
+          <w:rPr>
+            <w:noProof/>
+            <w:webHidden/>
+          </w:rPr>
+          <w:instrText xml:space="preserve"> PAGEREF _Toc242992773 \h </w:instrText>
+        </w:r>
+        <w:r>
+          <w:rPr>
+            <w:noProof/>
+            <w:webHidden/>
+          </w:rPr>
+        </w:r>
+        <w:r>
+          <w:rPr>
+            <w:noProof/>
+            <w:webHidden/>
+          </w:rPr>
+          <w:fldChar w:fldCharType="separate"/>
+        </w:r>
+        <w:r>
+          <w:rPr>
+            <w:noProof/>
+            <w:webHidden/>
+          </w:rPr>
+          <w:t>6</w:t>
+        </w:r>
+        <w:r>
+          <w:rPr>
+            <w:noProof/>
+            <w:webHidden/>
+          </w:rPr>
+          <w:fldChar w:fldCharType="end"/>
+        </w:r>
+      </w:hyperlink>
+    </w:p>
+    <w:p>
+      <w:pPr>
+        <w:pStyle w:val="TDC2"/>
+        <w:tabs>
+          <w:tab w:val="right" w:leader="dot" w:pos="9288"/>
+        </w:tabs>
+        <w:rPr>
+          <w:noProof/>
+        </w:rPr>
+      </w:pPr>
+      <w:hyperlink w:anchor="_Toc242992774" w:history="1">
+        <w:r>
+          <w:rPr>
+            <w:rStyle w:val="Hipervnculo"/>
+            <w:noProof/>
+          </w:rPr>
+          <w:t>5. Requisitos del trabajo</w:t>
+        </w:r>
+        <w:r>
+          <w:rPr>
+            <w:noProof/>
+            <w:webHidden/>
+          </w:rPr>
+          <w:tab/>
+        </w:r>
+        <w:r>
+          <w:rPr>
+            <w:noProof/>
+            <w:webHidden/>
+          </w:rPr>
+          <w:fldChar w:fldCharType="begin"/>
+        </w:r>
+        <w:r>
+          <w:rPr>
+            <w:noProof/>
+            <w:webHidden/>
+          </w:rPr>
+          <w:instrText xml:space="preserve"> PAGEREF _Toc242992774 \h </w:instrText>
+        </w:r>
+        <w:r>
+          <w:rPr>
+            <w:noProof/>
+            <w:webHidden/>
+          </w:rPr>
+        </w:r>
+        <w:r>
+          <w:rPr>
+            <w:noProof/>
+            <w:webHidden/>
+          </w:rPr>
+          <w:fldChar w:fldCharType="separate"/>
+        </w:r>
+        <w:r>
+          <w:rPr>
+            <w:noProof/>
+            <w:webHidden/>
+          </w:rPr>
+          <w:t>7</w:t>
+        </w:r>
+        <w:r>
+          <w:rPr>
+            <w:noProof/>
+            <w:webHidden/>
+          </w:rPr>
+          <w:fldChar w:fldCharType="end"/>
+        </w:r>
+      </w:hyperlink>
+    </w:p>
+    <w:p>
+      <w:pPr>
+        <w:pStyle w:val="TDC2"/>
+        <w:tabs>
+          <w:tab w:val="right" w:leader="dot" w:pos="9288"/>
+        </w:tabs>
+        <w:rPr>
+          <w:noProof/>
+        </w:rPr>
+      </w:pPr>
+      <w:hyperlink w:anchor="_Toc242992775" w:history="1">
+        <w:r>
+          <w:rPr>
+            <w:rStyle w:val="Hipervnculo"/>
+            <w:noProof/>
+          </w:rPr>
+          <w:t>6. Limitaciones que conviene conocer</w:t>
+        </w:r>
+        <w:r>
+          <w:rPr>
+            <w:noProof/>
+            <w:webHidden/>
+          </w:rPr>
+          <w:tab/>
+        </w:r>
+        <w:r>
+          <w:rPr>
+            <w:noProof/>
+            <w:webHidden/>
+          </w:rPr>
+          <w:fldChar w:fldCharType="begin"/>
+        </w:r>
+        <w:r>
+          <w:rPr>
+            <w:noProof/>
+            <w:webHidden/>
+          </w:rPr>
+          <w:instrText xml:space="preserve"> PAGEREF _Toc242992775 \h </w:instrText>
+        </w:r>
+        <w:r>
+          <w:rPr>
+            <w:noProof/>
+            <w:webHidden/>
+          </w:rPr>
+        </w:r>
+        <w:r>
+          <w:rPr>
+            <w:noProof/>
+            <w:webHidden/>
+          </w:rPr>
+          <w:fldChar w:fldCharType="separate"/>
+        </w:r>
+        <w:r>
+          <w:rPr>
+            <w:noProof/>
+            <w:webHidden/>
+          </w:rPr>
+          <w:t>7</w:t>
+        </w:r>
+        <w:r>
+          <w:rPr>
+            <w:noProof/>
+            <w:webHidden/>
+          </w:rPr>
+          <w:fldChar w:fldCharType="end"/>
+        </w:r>
+      </w:hyperlink>
+    </w:p>
+    <w:p>
+      <w:pPr>
+        <w:pStyle w:val="TDC2"/>
+        <w:tabs>
+          <w:tab w:val="right" w:leader="dot" w:pos="9288"/>
+        </w:tabs>
+        <w:rPr>
+          <w:noProof/>
+        </w:rPr>
+      </w:pPr>
+      <w:hyperlink w:anchor="_Toc242992776" w:history="1">
+        <w:r>
+          <w:rPr>
+            <w:rStyle w:val="Hipervnculo"/>
+            <w:noProof/>
+          </w:rPr>
           <w:t>7. Acceso y cita</w:t>
         </w:r>
         <w:r>
@@ -652,7 +1128,7 @@
             <w:noProof/>
             <w:webHidden/>
           </w:rPr>
-          <w:instrText xml:space="preserve"> PAGEREF _Toc242990532 \h </w:instrText>
+          <w:instrText xml:space="preserve"> PAGEREF _Toc242992776 \h </w:instrText>
         </w:r>
         <w:r>
           <w:rPr>
@@ -672,7 +1148,7 @@
             <w:noProof/>
             <w:webHidden/>
           </w:rPr>
-          <w:t>5</w:t>
+          <w:t>7</w:t>
         </w:r>
         <w:r>
           <w:rPr>
@@ -693,7 +1169,7 @@
           <w:noProof/>
         </w:rPr>
       </w:pPr>
-      <w:hyperlink w:anchor="_Toc242990533" w:history="1">
+      <w:hyperlink w:anchor="_Toc242992777" w:history="1">
         <w:r>
           <w:rPr>
             <w:rStyle w:val="Hipervnculo"/>
@@ -720,7 +1196,7 @@
             <w:noProof/>
             <w:webHidden/>
           </w:rPr>
-          <w:instrText xml:space="preserve"> PAGEREF _Toc242990533 \h </w:instrText>
+          <w:instrText xml:space="preserve"> PAGEREF _Toc242992777 \h </w:instrText>
         </w:r>
         <w:r>
           <w:rPr>
@@ -740,7 +1216,7 @@
             <w:noProof/>
             <w:webHidden/>
           </w:rPr>
-          <w:t>6</w:t>
+          <w:t>8</w:t>
         </w:r>
         <w:r>
           <w:rPr>
@@ -761,7 +1237,7 @@
           <w:noProof/>
         </w:rPr>
       </w:pPr>
-      <w:hyperlink w:anchor="_Toc242990534" w:history="1">
+      <w:hyperlink w:anchor="_Toc242992778" w:history="1">
         <w:r>
           <w:rPr>
             <w:rStyle w:val="Hipervnculo"/>
@@ -788,7 +1264,7 @@
             <w:noProof/>
             <w:webHidden/>
           </w:rPr>
-          <w:instrText xml:space="preserve"> PAGEREF _Toc242990534 \h </w:instrText>
+          <w:instrText xml:space="preserve"> PAGEREF _Toc242992778 \h </w:instrText>
         </w:r>
         <w:r>
           <w:rPr>
@@ -808,7 +1284,7 @@
             <w:noProof/>
             <w:webHidden/>
           </w:rPr>
-          <w:t>6</w:t>
+          <w:t>8</w:t>
         </w:r>
         <w:r>
           <w:rPr>
@@ -829,7 +1305,7 @@
           <w:noProof/>
         </w:rPr>
       </w:pPr>
-      <w:hyperlink w:anchor="_Toc242990535" w:history="1">
+      <w:hyperlink w:anchor="_Toc242992779" w:history="1">
         <w:r>
           <w:rPr>
             <w:rStyle w:val="Hipervnculo"/>
@@ -856,7 +1332,7 @@
             <w:noProof/>
             <w:webHidden/>
           </w:rPr>
-          <w:instrText xml:space="preserve"> PAGEREF _Toc242990535 \h </w:instrText>
+          <w:instrText xml:space="preserve"> PAGEREF _Toc242992779 \h </w:instrText>
         </w:r>
         <w:r>
           <w:rPr>
@@ -876,7 +1352,75 @@
             <w:noProof/>
             <w:webHidden/>
           </w:rPr>
-          <w:t>6</w:t>
+          <w:t>8</w:t>
+        </w:r>
+        <w:r>
+          <w:rPr>
+            <w:noProof/>
+            <w:webHidden/>
+          </w:rPr>
+          <w:fldChar w:fldCharType="end"/>
+        </w:r>
+      </w:hyperlink>
+    </w:p>
+    <w:p>
+      <w:pPr>
+        <w:pStyle w:val="TDC2"/>
+        <w:tabs>
+          <w:tab w:val="right" w:leader="dot" w:pos="9288"/>
+        </w:tabs>
+        <w:rPr>
+          <w:noProof/>
+        </w:rPr>
+      </w:pPr>
+      <w:hyperlink w:anchor="_Toc242992780" w:history="1">
+        <w:r>
+          <w:rPr>
+            <w:rStyle w:val="Hipervnculo"/>
+            <w:noProof/>
+          </w:rPr>
+          <w:t>10. ¿Alcanzan los datos para las regresiones?</w:t>
+        </w:r>
+        <w:r>
+          <w:rPr>
+            <w:noProof/>
+            <w:webHidden/>
+          </w:rPr>
+          <w:tab/>
+        </w:r>
+        <w:r>
+          <w:rPr>
+            <w:noProof/>
+            <w:webHidden/>
+          </w:rPr>
+          <w:fldChar w:fldCharType="begin"/>
+        </w:r>
+        <w:r>
+          <w:rPr>
+            <w:noProof/>
+            <w:webHidden/>
+          </w:rPr>
+          <w:instrText xml:space="preserve"> PAGEREF _Toc242992780 \h </w:instrText>
+        </w:r>
+        <w:r>
+          <w:rPr>
+            <w:noProof/>
+            <w:webHidden/>
+          </w:rPr>
+        </w:r>
+        <w:r>
+          <w:rPr>
+            <w:noProof/>
+            <w:webHidden/>
+          </w:rPr>
+          <w:fldChar w:fldCharType="separate"/>
+        </w:r>
+        <w:r>
+          <w:rPr>
+            <w:noProof/>
+            <w:webHidden/>
+          </w:rPr>
+          <w:t>9</w:t>
         </w:r>
         <w:r>
           <w:rPr>
@@ -897,7 +1441,7 @@
           <w:noProof/>
         </w:rPr>
       </w:pPr>
-      <w:hyperlink w:anchor="_Toc242990536" w:history="1">
+      <w:hyperlink w:anchor="_Toc242992781" w:history="1">
         <w:r>
           <w:rPr>
             <w:rStyle w:val="Hipervnculo"/>
@@ -924,7 +1468,7 @@
             <w:noProof/>
             <w:webHidden/>
           </w:rPr>
-          <w:instrText xml:space="preserve"> PAGEREF _Toc242990536 \h </w:instrText>
+          <w:instrText xml:space="preserve"> PAGEREF _Toc242992781 \h </w:instrText>
         </w:r>
         <w:r>
           <w:rPr>
@@ -944,7 +1488,7 @@
             <w:noProof/>
             <w:webHidden/>
           </w:rPr>
-          <w:t>8</w:t>
+          <w:t>11</w:t>
         </w:r>
         <w:r>
           <w:rPr>
@@ -965,13 +1509,13 @@
           <w:noProof/>
         </w:rPr>
       </w:pPr>
-      <w:hyperlink w:anchor="_Toc242990537" w:history="1">
+      <w:hyperlink w:anchor="_Toc242992782" w:history="1">
         <w:r>
           <w:rPr>
             <w:rStyle w:val="Hipervnculo"/>
             <w:noProof/>
           </w:rPr>
-          <w:t>10. Arquitectura general</w:t>
+          <w:t>11. Arquitectura general</w:t>
         </w:r>
         <w:r>
           <w:rPr>
@@ -992,7 +1536,7 @@
             <w:noProof/>
             <w:webHidden/>
           </w:rPr>
-          <w:instrText xml:space="preserve"> PAGEREF _Toc242990537 \h </w:instrText>
+          <w:instrText xml:space="preserve"> PAGEREF _Toc242992782 \h </w:instrText>
         </w:r>
         <w:r>
           <w:rPr>
@@ -1012,7 +1556,7 @@
             <w:noProof/>
             <w:webHidden/>
           </w:rPr>
-          <w:t>8</w:t>
+          <w:t>11</w:t>
         </w:r>
         <w:r>
           <w:rPr>
@@ -1033,13 +1577,13 @@
           <w:noProof/>
         </w:rPr>
       </w:pPr>
-      <w:hyperlink w:anchor="_Toc242990538" w:history="1">
+      <w:hyperlink w:anchor="_Toc242992783" w:history="1">
         <w:r>
           <w:rPr>
             <w:rStyle w:val="Hipervnculo"/>
             <w:noProof/>
           </w:rPr>
-          <w:t>11. Herramientas y librerías</w:t>
+          <w:t>12. Herramientas y librerías</w:t>
         </w:r>
         <w:r>
           <w:rPr>
@@ -1060,7 +1604,7 @@
             <w:noProof/>
             <w:webHidden/>
           </w:rPr>
-          <w:instrText xml:space="preserve"> PAGEREF _Toc242990538 \h </w:instrText>
+          <w:instrText xml:space="preserve"> PAGEREF _Toc242992783 \h </w:instrText>
         </w:r>
         <w:r>
           <w:rPr>
@@ -1080,7 +1624,7 @@
             <w:noProof/>
             <w:webHidden/>
           </w:rPr>
-          <w:t>8</w:t>
+          <w:t>11</w:t>
         </w:r>
         <w:r>
           <w:rPr>
@@ -1101,13 +1645,13 @@
           <w:noProof/>
         </w:rPr>
       </w:pPr>
-      <w:hyperlink w:anchor="_Toc242990539" w:history="1">
+      <w:hyperlink w:anchor="_Toc242992784" w:history="1">
         <w:r>
           <w:rPr>
             <w:rStyle w:val="Hipervnculo"/>
             <w:noProof/>
           </w:rPr>
-          <w:t>12. Limpieza de la base (scripts/limpiar.py)</w:t>
+          <w:t>13. Limpieza de la base (scripts/limpiar.py)</w:t>
         </w:r>
         <w:r>
           <w:rPr>
@@ -1128,7 +1672,7 @@
             <w:noProof/>
             <w:webHidden/>
           </w:rPr>
-          <w:instrText xml:space="preserve"> PAGEREF _Toc242990539 \h </w:instrText>
+          <w:instrText xml:space="preserve"> PAGEREF _Toc242992784 \h </w:instrText>
         </w:r>
         <w:r>
           <w:rPr>
@@ -1148,7 +1692,7 @@
             <w:noProof/>
             <w:webHidden/>
           </w:rPr>
-          <w:t>8</w:t>
+          <w:t>11</w:t>
         </w:r>
         <w:r>
           <w:rPr>
@@ -1169,13 +1713,13 @@
           <w:noProof/>
         </w:rPr>
       </w:pPr>
-      <w:hyperlink w:anchor="_Toc242990540" w:history="1">
+      <w:hyperlink w:anchor="_Toc242992785" w:history="1">
         <w:r>
           <w:rPr>
             <w:rStyle w:val="Hipervnculo"/>
             <w:noProof/>
           </w:rPr>
-          <w:t>13. Mapa de ubicación (Python y QGIS)</w:t>
+          <w:t>14. Mapa de ubicación (Python y QGIS)</w:t>
         </w:r>
         <w:r>
           <w:rPr>
@@ -1196,7 +1740,7 @@
             <w:noProof/>
             <w:webHidden/>
           </w:rPr>
-          <w:instrText xml:space="preserve"> PAGEREF _Toc242990540 \h </w:instrText>
+          <w:instrText xml:space="preserve"> PAGEREF _Toc242992785 \h </w:instrText>
         </w:r>
         <w:r>
           <w:rPr>
@@ -1216,7 +1760,7 @@
             <w:noProof/>
             <w:webHidden/>
           </w:rPr>
-          <w:t>9</w:t>
+          <w:t>12</w:t>
         </w:r>
         <w:r>
           <w:rPr>
@@ -1237,13 +1781,13 @@
           <w:noProof/>
         </w:rPr>
       </w:pPr>
-      <w:hyperlink w:anchor="_Toc242990541" w:history="1">
+      <w:hyperlink w:anchor="_Toc242992786" w:history="1">
         <w:r>
           <w:rPr>
             <w:rStyle w:val="Hipervnculo"/>
             <w:noProof/>
           </w:rPr>
-          <w:t>14. Estadística en R (carpeta R/)</w:t>
+          <w:t>15. Estadística en R (carpeta R/)</w:t>
         </w:r>
         <w:r>
           <w:rPr>
@@ -1264,7 +1808,7 @@
             <w:noProof/>
             <w:webHidden/>
           </w:rPr>
-          <w:instrText xml:space="preserve"> PAGEREF _Toc242990541 \h </w:instrText>
+          <w:instrText xml:space="preserve"> PAGEREF _Toc242992786 \h </w:instrText>
         </w:r>
         <w:r>
           <w:rPr>
@@ -1284,7 +1828,7 @@
             <w:noProof/>
             <w:webHidden/>
           </w:rPr>
-          <w:t>10</w:t>
+          <w:t>13</w:t>
         </w:r>
         <w:r>
           <w:rPr>
@@ -1305,13 +1849,13 @@
           <w:noProof/>
         </w:rPr>
       </w:pPr>
-      <w:hyperlink w:anchor="_Toc242990542" w:history="1">
+      <w:hyperlink w:anchor="_Toc242992787" w:history="1">
         <w:r>
           <w:rPr>
             <w:rStyle w:val="Hipervnculo"/>
             <w:noProof/>
           </w:rPr>
-          <w:t>15. La página web</w:t>
+          <w:t>16. La página web</w:t>
         </w:r>
         <w:r>
           <w:rPr>
@@ -1332,7 +1876,7 @@
             <w:noProof/>
             <w:webHidden/>
           </w:rPr>
-          <w:instrText xml:space="preserve"> PAGEREF _Toc242990542 \h </w:instrText>
+          <w:instrText xml:space="preserve"> PAGEREF _Toc242992787 \h </w:instrText>
         </w:r>
         <w:r>
           <w:rPr>
@@ -1352,7 +1896,7 @@
             <w:noProof/>
             <w:webHidden/>
           </w:rPr>
-          <w:t>10</w:t>
+          <w:t>13</w:t>
         </w:r>
         <w:r>
           <w:rPr>
@@ -1373,13 +1917,13 @@
           <w:noProof/>
         </w:rPr>
       </w:pPr>
-      <w:hyperlink w:anchor="_Toc242990543" w:history="1">
+      <w:hyperlink w:anchor="_Toc242992788" w:history="1">
         <w:r>
           <w:rPr>
             <w:rStyle w:val="Hipervnculo"/>
             <w:noProof/>
           </w:rPr>
-          <w:t>16. Publicación y control de versiones</w:t>
+          <w:t>17. Publicación y control de versiones</w:t>
         </w:r>
         <w:r>
           <w:rPr>
@@ -1400,7 +1944,7 @@
             <w:noProof/>
             <w:webHidden/>
           </w:rPr>
-          <w:instrText xml:space="preserve"> PAGEREF _Toc242990543 \h </w:instrText>
+          <w:instrText xml:space="preserve"> PAGEREF _Toc242992788 \h </w:instrText>
         </w:r>
         <w:r>
           <w:rPr>
@@ -1420,7 +1964,7 @@
             <w:noProof/>
             <w:webHidden/>
           </w:rPr>
-          <w:t>12</w:t>
+          <w:t>15</w:t>
         </w:r>
         <w:r>
           <w:rPr>
@@ -1441,13 +1985,13 @@
           <w:noProof/>
         </w:rPr>
       </w:pPr>
-      <w:hyperlink w:anchor="_Toc242990544" w:history="1">
+      <w:hyperlink w:anchor="_Toc242992789" w:history="1">
         <w:r>
           <w:rPr>
             <w:rStyle w:val="Hipervnculo"/>
             <w:noProof/>
           </w:rPr>
-          <w:t>17. Documentación del proyecto</w:t>
+          <w:t>18. Documentación del proyecto</w:t>
         </w:r>
         <w:r>
           <w:rPr>
@@ -1468,7 +2012,7 @@
             <w:noProof/>
             <w:webHidden/>
           </w:rPr>
-          <w:instrText xml:space="preserve"> PAGEREF _Toc242990544 \h </w:instrText>
+          <w:instrText xml:space="preserve"> PAGEREF _Toc242992789 \h </w:instrText>
         </w:r>
         <w:r>
           <w:rPr>
@@ -1488,7 +2032,7 @@
             <w:noProof/>
             <w:webHidden/>
           </w:rPr>
-          <w:t>12</w:t>
+          <w:t>15</w:t>
         </w:r>
         <w:r>
           <w:rPr>
@@ -1509,13 +2053,13 @@
           <w:noProof/>
         </w:rPr>
       </w:pPr>
-      <w:hyperlink w:anchor="_Toc242990545" w:history="1">
+      <w:hyperlink w:anchor="_Toc242992790" w:history="1">
         <w:r>
           <w:rPr>
             <w:rStyle w:val="Hipervnculo"/>
             <w:noProof/>
           </w:rPr>
-          <w:t>18. Cómo reproducir todo</w:t>
+          <w:t>19. Cómo reproducir todo</w:t>
         </w:r>
         <w:r>
           <w:rPr>
@@ -1536,7 +2080,7 @@
             <w:noProof/>
             <w:webHidden/>
           </w:rPr>
-          <w:instrText xml:space="preserve"> PAGEREF _Toc242990545 \h </w:instrText>
+          <w:instrText xml:space="preserve"> PAGEREF _Toc242992790 \h </w:instrText>
         </w:r>
         <w:r>
           <w:rPr>
@@ -1556,7 +2100,7 @@
             <w:noProof/>
             <w:webHidden/>
           </w:rPr>
-          <w:t>12</w:t>
+          <w:t>16</w:t>
         </w:r>
         <w:r>
           <w:rPr>
@@ -1577,13 +2121,13 @@
           <w:noProof/>
         </w:rPr>
       </w:pPr>
-      <w:hyperlink w:anchor="_Toc242990546" w:history="1">
+      <w:hyperlink w:anchor="_Toc242992791" w:history="1">
         <w:r>
           <w:rPr>
             <w:rStyle w:val="Hipervnculo"/>
             <w:noProof/>
           </w:rPr>
-          <w:t>19. Limitaciones técnicas y mantenimiento</w:t>
+          <w:t>20. Limitaciones técnicas y mantenimiento</w:t>
         </w:r>
         <w:r>
           <w:rPr>
@@ -1604,7 +2148,7 @@
             <w:noProof/>
             <w:webHidden/>
           </w:rPr>
-          <w:instrText xml:space="preserve"> PAGEREF _Toc242990546 \h </w:instrText>
+          <w:instrText xml:space="preserve"> PAGEREF _Toc242992791 \h </w:instrText>
         </w:r>
         <w:r>
           <w:rPr>
@@ -1624,7 +2168,7 @@
             <w:noProof/>
             <w:webHidden/>
           </w:rPr>
-          <w:t>13</w:t>
+          <w:t>16</w:t>
         </w:r>
         <w:r>
           <w:rPr>
@@ -1645,7 +2189,7 @@
           <w:noProof/>
         </w:rPr>
       </w:pPr>
-      <w:hyperlink w:anchor="_Toc242990547" w:history="1">
+      <w:hyperlink w:anchor="_Toc242992792" w:history="1">
         <w:r>
           <w:rPr>
             <w:rStyle w:val="Hipervnculo"/>
@@ -1672,7 +2216,7 @@
             <w:noProof/>
             <w:webHidden/>
           </w:rPr>
-          <w:instrText xml:space="preserve"> PAGEREF _Toc242990547 \h </w:instrText>
+          <w:instrText xml:space="preserve"> PAGEREF _Toc242992792 \h </w:instrText>
         </w:r>
         <w:r>
           <w:rPr>
@@ -1692,7 +2236,7 @@
             <w:noProof/>
             <w:webHidden/>
           </w:rPr>
-          <w:t>14</w:t>
+          <w:t>17</w:t>
         </w:r>
         <w:r>
           <w:rPr>
@@ -1713,7 +2257,7 @@
           <w:noProof/>
         </w:rPr>
       </w:pPr>
-      <w:hyperlink w:anchor="_Toc242990548" w:history="1">
+      <w:hyperlink w:anchor="_Toc242992793" w:history="1">
         <w:r>
           <w:rPr>
             <w:rStyle w:val="Hipervnculo"/>
@@ -1740,7 +2284,7 @@
             <w:noProof/>
             <w:webHidden/>
           </w:rPr>
-          <w:instrText xml:space="preserve"> PAGEREF _Toc242990548 \h </w:instrText>
+          <w:instrText xml:space="preserve"> PAGEREF _Toc242992793 \h </w:instrText>
         </w:r>
         <w:r>
           <w:rPr>
@@ -1760,7 +2304,7 @@
             <w:noProof/>
             <w:webHidden/>
           </w:rPr>
-          <w:t>15</w:t>
+          <w:t>18</w:t>
         </w:r>
         <w:r>
           <w:rPr>
@@ -1775,6 +2319,1598 @@
       <w:r>
         <w:fldChar w:fldCharType="end"/>
       </w:r>
+    </w:p>
+    <w:p>
+      <w:pPr>
+        <w:pStyle w:val="Ttulo1"/>
+        <w:pageBreakBefore/>
+      </w:pPr>
+      <w:bookmarkStart w:id="0" w:name="_Toc242992762"/>
+      <w:r>
+        <w:lastRenderedPageBreak/>
+        <w:t>Guía rápida para el equipo</w:t>
+      </w:r>
+      <w:bookmarkEnd w:id="0"/>
+    </w:p>
+    <w:p>
+      <w:r>
+        <w:t>Esta guía resume, en pocas páginas, qué está hecho, dónde está cada cosa y qué hay que saber para la exposición. El resto del informe explica todo con detalle.</w:t>
+      </w:r>
+    </w:p>
+    <w:p>
+      <w:pPr>
+        <w:pStyle w:val="Ttulo2"/>
+      </w:pPr>
+      <w:bookmarkStart w:id="1" w:name="_Toc242992763"/>
+      <w:r>
+        <w:t>Dónde está cada cosa</w:t>
+      </w:r>
+      <w:bookmarkEnd w:id="1"/>
+    </w:p>
+    <w:tbl>
+      <w:tblPr>
+        <w:tblStyle w:val="Tablaconcuadrcula"/>
+        <w:tblW w:w="0" w:type="auto"/>
+        <w:jc w:val="center"/>
+        <w:tblLook w:val="04A0" w:firstRow="1" w:lastRow="0" w:firstColumn="1" w:lastColumn="0" w:noHBand="0" w:noVBand="1"/>
+      </w:tblPr>
+      <w:tblGrid>
+        <w:gridCol w:w="3402"/>
+        <w:gridCol w:w="5839"/>
+      </w:tblGrid>
+      <w:tr>
+        <w:trPr>
+          <w:jc w:val="center"/>
+        </w:trPr>
+        <w:tc>
+          <w:tcPr>
+            <w:tcW w:w="3402" w:type="dxa"/>
+            <w:shd w:val="clear" w:color="auto" w:fill="E8F0FB"/>
+          </w:tcPr>
+          <w:p>
+            <w:pPr>
+              <w:spacing w:after="0"/>
+            </w:pPr>
+            <w:r>
+              <w:rPr>
+                <w:b/>
+                <w:sz w:val="18"/>
+              </w:rPr>
+              <w:t>Qué</w:t>
+            </w:r>
+          </w:p>
+        </w:tc>
+        <w:tc>
+          <w:tcPr>
+            <w:tcW w:w="5839" w:type="dxa"/>
+            <w:shd w:val="clear" w:color="auto" w:fill="E8F0FB"/>
+          </w:tcPr>
+          <w:p>
+            <w:pPr>
+              <w:spacing w:after="0"/>
+            </w:pPr>
+            <w:r>
+              <w:rPr>
+                <w:b/>
+                <w:sz w:val="18"/>
+              </w:rPr>
+              <w:t>Dónde</w:t>
+            </w:r>
+          </w:p>
+        </w:tc>
+      </w:tr>
+      <w:tr>
+        <w:trPr>
+          <w:jc w:val="center"/>
+        </w:trPr>
+        <w:tc>
+          <w:tcPr>
+            <w:tcW w:w="3402" w:type="dxa"/>
+          </w:tcPr>
+          <w:p>
+            <w:pPr>
+              <w:spacing w:after="0"/>
+            </w:pPr>
+            <w:r>
+              <w:rPr>
+                <w:sz w:val="18"/>
+              </w:rPr>
+              <w:t>Página web del proyecto</w:t>
+            </w:r>
+          </w:p>
+        </w:tc>
+        <w:tc>
+          <w:tcPr>
+            <w:tcW w:w="5839" w:type="dxa"/>
+          </w:tcPr>
+          <w:p>
+            <w:pPr>
+              <w:spacing w:after="0"/>
+            </w:pPr>
+            <w:r>
+              <w:rPr>
+                <w:sz w:val="18"/>
+              </w:rPr>
+              <w:t>https://crisrumiguano-art.github.io/geoquimica-earthchem-ml/</w:t>
+            </w:r>
+          </w:p>
+        </w:tc>
+      </w:tr>
+      <w:tr>
+        <w:trPr>
+          <w:jc w:val="center"/>
+        </w:trPr>
+        <w:tc>
+          <w:tcPr>
+            <w:tcW w:w="3402" w:type="dxa"/>
+          </w:tcPr>
+          <w:p>
+            <w:pPr>
+              <w:spacing w:after="0"/>
+            </w:pPr>
+            <w:r>
+              <w:rPr>
+                <w:sz w:val="18"/>
+              </w:rPr>
+              <w:t>Estadística descriptiva (tablas y gráficas)</w:t>
+            </w:r>
+          </w:p>
+        </w:tc>
+        <w:tc>
+          <w:tcPr>
+            <w:tcW w:w="5839" w:type="dxa"/>
+          </w:tcPr>
+          <w:p>
+            <w:pPr>
+              <w:spacing w:after="0"/>
+            </w:pPr>
+            <w:r>
+              <w:rPr>
+                <w:sz w:val="18"/>
+              </w:rPr>
+              <w:t>https://crisrumiguano-art.github.io/geoquimica-earthchem-ml/descriptiva/</w:t>
+            </w:r>
+          </w:p>
+        </w:tc>
+      </w:tr>
+      <w:tr>
+        <w:trPr>
+          <w:jc w:val="center"/>
+        </w:trPr>
+        <w:tc>
+          <w:tcPr>
+            <w:tcW w:w="3402" w:type="dxa"/>
+          </w:tcPr>
+          <w:p>
+            <w:pPr>
+              <w:spacing w:after="0"/>
+            </w:pPr>
+            <w:r>
+              <w:rPr>
+                <w:sz w:val="18"/>
+              </w:rPr>
+              <w:t>Tabla de variables (dominio, rango, etc.)</w:t>
+            </w:r>
+          </w:p>
+        </w:tc>
+        <w:tc>
+          <w:tcPr>
+            <w:tcW w:w="5839" w:type="dxa"/>
+          </w:tcPr>
+          <w:p>
+            <w:pPr>
+              <w:spacing w:after="0"/>
+            </w:pPr>
+            <w:r>
+              <w:rPr>
+                <w:sz w:val="18"/>
+              </w:rPr>
+              <w:t>https://crisrumiguano-art.github.io/geoquimica-earthchem-ml/descriptiva/#variables  ·  data/tabla_variables.xlsx</w:t>
+            </w:r>
+          </w:p>
+        </w:tc>
+      </w:tr>
+      <w:tr>
+        <w:trPr>
+          <w:jc w:val="center"/>
+        </w:trPr>
+        <w:tc>
+          <w:tcPr>
+            <w:tcW w:w="3402" w:type="dxa"/>
+          </w:tcPr>
+          <w:p>
+            <w:pPr>
+              <w:spacing w:after="0"/>
+            </w:pPr>
+            <w:r>
+              <w:rPr>
+                <w:sz w:val="18"/>
+              </w:rPr>
+              <w:t>Este informe (PDF y Word)</w:t>
+            </w:r>
+          </w:p>
+        </w:tc>
+        <w:tc>
+          <w:tcPr>
+            <w:tcW w:w="5839" w:type="dxa"/>
+          </w:tcPr>
+          <w:p>
+            <w:pPr>
+              <w:spacing w:after="0"/>
+            </w:pPr>
+            <w:r>
+              <w:rPr>
+                <w:sz w:val="18"/>
+              </w:rPr>
+              <w:t>https://crisrumiguano-art.github.io/geoquimica-earthchem-ml/informe_proyecto.pdf  ·  https://crisrumiguano-art.github.io/geoquimica-earthchem-ml/informe_proyecto.docx</w:t>
+            </w:r>
+          </w:p>
+        </w:tc>
+      </w:tr>
+      <w:tr>
+        <w:trPr>
+          <w:jc w:val="center"/>
+        </w:trPr>
+        <w:tc>
+          <w:tcPr>
+            <w:tcW w:w="3402" w:type="dxa"/>
+          </w:tcPr>
+          <w:p>
+            <w:pPr>
+              <w:spacing w:after="0"/>
+            </w:pPr>
+            <w:r>
+              <w:rPr>
+                <w:sz w:val="18"/>
+              </w:rPr>
+              <w:t>Base limpia (159.760 × 75)</w:t>
+            </w:r>
+          </w:p>
+        </w:tc>
+        <w:tc>
+          <w:tcPr>
+            <w:tcW w:w="5839" w:type="dxa"/>
+          </w:tcPr>
+          <w:p>
+            <w:pPr>
+              <w:spacing w:after="0"/>
+            </w:pPr>
+            <w:r>
+              <w:rPr>
+                <w:sz w:val="18"/>
+              </w:rPr>
+              <w:t>data/earthchem_limpio.csv.gz en el repositorio</w:t>
+            </w:r>
+          </w:p>
+        </w:tc>
+      </w:tr>
+      <w:tr>
+        <w:trPr>
+          <w:jc w:val="center"/>
+        </w:trPr>
+        <w:tc>
+          <w:tcPr>
+            <w:tcW w:w="3402" w:type="dxa"/>
+          </w:tcPr>
+          <w:p>
+            <w:pPr>
+              <w:spacing w:after="0"/>
+            </w:pPr>
+            <w:r>
+              <w:rPr>
+                <w:sz w:val="18"/>
+              </w:rPr>
+              <w:t>Mapa en QGIS</w:t>
+            </w:r>
+          </w:p>
+        </w:tc>
+        <w:tc>
+          <w:tcPr>
+            <w:tcW w:w="5839" w:type="dxa"/>
+          </w:tcPr>
+          <w:p>
+            <w:pPr>
+              <w:spacing w:after="0"/>
+            </w:pPr>
+            <w:r>
+              <w:rPr>
+                <w:sz w:val="18"/>
+              </w:rPr>
+              <w:t>data/gis/mapa_ubicacion.qgz (abrir junto con mapa_ubicacion.gpkg)</w:t>
+            </w:r>
+          </w:p>
+        </w:tc>
+      </w:tr>
+      <w:tr>
+        <w:trPr>
+          <w:jc w:val="center"/>
+        </w:trPr>
+        <w:tc>
+          <w:tcPr>
+            <w:tcW w:w="3402" w:type="dxa"/>
+          </w:tcPr>
+          <w:p>
+            <w:pPr>
+              <w:spacing w:after="0"/>
+            </w:pPr>
+            <w:r>
+              <w:rPr>
+                <w:sz w:val="18"/>
+              </w:rPr>
+              <w:t>Código en R</w:t>
+            </w:r>
+          </w:p>
+        </w:tc>
+        <w:tc>
+          <w:tcPr>
+            <w:tcW w:w="5839" w:type="dxa"/>
+          </w:tcPr>
+          <w:p>
+            <w:pPr>
+              <w:spacing w:after="0"/>
+            </w:pPr>
+            <w:r>
+              <w:rPr>
+                <w:sz w:val="18"/>
+              </w:rPr>
+              <w:t>carpeta R/ del repositorio</w:t>
+            </w:r>
+          </w:p>
+        </w:tc>
+      </w:tr>
+      <w:tr>
+        <w:trPr>
+          <w:jc w:val="center"/>
+        </w:trPr>
+        <w:tc>
+          <w:tcPr>
+            <w:tcW w:w="3402" w:type="dxa"/>
+          </w:tcPr>
+          <w:p>
+            <w:pPr>
+              <w:spacing w:after="0"/>
+            </w:pPr>
+            <w:r>
+              <w:rPr>
+                <w:sz w:val="18"/>
+              </w:rPr>
+              <w:t>Repositorio (todo el código)</w:t>
+            </w:r>
+          </w:p>
+        </w:tc>
+        <w:tc>
+          <w:tcPr>
+            <w:tcW w:w="5839" w:type="dxa"/>
+          </w:tcPr>
+          <w:p>
+            <w:pPr>
+              <w:spacing w:after="0"/>
+            </w:pPr>
+            <w:r>
+              <w:rPr>
+                <w:sz w:val="18"/>
+              </w:rPr>
+              <w:t>https://github.com/crisrumiguano-art/geoquimica-earthchem-ml</w:t>
+            </w:r>
+          </w:p>
+        </w:tc>
+      </w:tr>
+      <w:tr>
+        <w:trPr>
+          <w:jc w:val="center"/>
+        </w:trPr>
+        <w:tc>
+          <w:tcPr>
+            <w:tcW w:w="3402" w:type="dxa"/>
+          </w:tcPr>
+          <w:p>
+            <w:pPr>
+              <w:spacing w:after="0"/>
+            </w:pPr>
+            <w:r>
+              <w:rPr>
+                <w:sz w:val="18"/>
+              </w:rPr>
+              <w:t>Datos originales de EarthChem (~600 MB)</w:t>
+            </w:r>
+          </w:p>
+        </w:tc>
+        <w:tc>
+          <w:tcPr>
+            <w:tcW w:w="5839" w:type="dxa"/>
+          </w:tcPr>
+          <w:p>
+            <w:pPr>
+              <w:spacing w:after="0"/>
+            </w:pPr>
+            <w:r>
+              <w:rPr>
+                <w:sz w:val="18"/>
+              </w:rPr>
+              <w:t>Google Drive de Dalember: TRABAJOS ESTADISTICA › 10-26 GDRIVE GEOQUIMICA ROCAS › datos_crudos_earthchem (pedir acceso)</w:t>
+            </w:r>
+          </w:p>
+        </w:tc>
+      </w:tr>
+    </w:tbl>
+    <w:p>
+      <w:pPr>
+        <w:spacing w:after="40"/>
+      </w:pPr>
+    </w:p>
+    <w:p>
+      <w:pPr>
+        <w:pStyle w:val="Ttulo2"/>
+      </w:pPr>
+      <w:bookmarkStart w:id="2" w:name="_Toc242992764"/>
+      <w:r>
+        <w:t>Qué tiene la página web</w:t>
+      </w:r>
+      <w:bookmarkEnd w:id="2"/>
+    </w:p>
+    <w:p>
+      <w:pPr>
+        <w:pStyle w:val="Listaconvietas"/>
+      </w:pPr>
+      <w:r>
+        <w:rPr>
+          <w:b/>
+        </w:rPr>
+        <w:t xml:space="preserve">Inicio: </w:t>
+      </w:r>
+      <w:r>
+        <w:t>introducción, planteamiento del problema, mapa de ubicación (QGIS, Python e interactivo) y objetivos.</w:t>
+      </w:r>
+    </w:p>
+    <w:p>
+      <w:pPr>
+        <w:pStyle w:val="Listaconvietas"/>
+      </w:pPr>
+      <w:r>
+        <w:rPr>
+          <w:b/>
+        </w:rPr>
+        <w:t xml:space="preserve">Descriptiva (Unidad 1): </w:t>
+      </w:r>
+      <w:r>
+        <w:t>población, individuo y muestra; tabla de variables; tablas de frecuencia y gráficas de las variables cualitativas, discretas y continuas; tratamiento de outliers; gráficos interactivos.</w:t>
+      </w:r>
+    </w:p>
+    <w:p>
+      <w:pPr>
+        <w:pStyle w:val="Listaconvietas"/>
+      </w:pPr>
+      <w:r>
+        <w:rPr>
+          <w:b/>
+        </w:rPr>
+        <w:t xml:space="preserve">Datos: </w:t>
+      </w:r>
+      <w:r>
+        <w:t>de dónde salieron los datos, cómo se prepararon y todas las descargas.</w:t>
+      </w:r>
+    </w:p>
+    <w:p>
+      <w:pPr>
+        <w:pStyle w:val="Listaconvietas"/>
+      </w:pPr>
+      <w:r>
+        <w:rPr>
+          <w:b/>
+        </w:rPr>
+        <w:t xml:space="preserve">Equipo: </w:t>
+      </w:r>
+      <w:r>
+        <w:t>integrantes y docente.</w:t>
+      </w:r>
+    </w:p>
+    <w:p>
+      <w:pPr>
+        <w:pStyle w:val="Listaconvietas"/>
+      </w:pPr>
+      <w:r>
+        <w:rPr>
+          <w:b/>
+        </w:rPr>
+        <w:t xml:space="preserve">Inferencial, Regresión y Machine learning: </w:t>
+      </w:r>
+      <w:r>
+        <w:t>aparecen como «pronto»; se completan en las próximas unidades.</w:t>
+      </w:r>
+    </w:p>
+    <w:p>
+      <w:pPr>
+        <w:pStyle w:val="Ttulo2"/>
+      </w:pPr>
+      <w:bookmarkStart w:id="3" w:name="_Toc242992765"/>
+      <w:r>
+        <w:t>Estado por lección</w:t>
+      </w:r>
+      <w:bookmarkEnd w:id="3"/>
+    </w:p>
+    <w:tbl>
+      <w:tblPr>
+        <w:tblStyle w:val="Tablaconcuadrcula"/>
+        <w:tblW w:w="0" w:type="auto"/>
+        <w:jc w:val="center"/>
+        <w:tblLook w:val="04A0" w:firstRow="1" w:lastRow="0" w:firstColumn="1" w:lastColumn="0" w:noHBand="0" w:noVBand="1"/>
+      </w:tblPr>
+      <w:tblGrid>
+        <w:gridCol w:w="1247"/>
+        <w:gridCol w:w="3969"/>
+        <w:gridCol w:w="4025"/>
+      </w:tblGrid>
+      <w:tr>
+        <w:trPr>
+          <w:jc w:val="center"/>
+        </w:trPr>
+        <w:tc>
+          <w:tcPr>
+            <w:tcW w:w="1247" w:type="dxa"/>
+            <w:shd w:val="clear" w:color="auto" w:fill="E8F0FB"/>
+          </w:tcPr>
+          <w:p>
+            <w:pPr>
+              <w:spacing w:after="0"/>
+            </w:pPr>
+            <w:r>
+              <w:rPr>
+                <w:b/>
+                <w:sz w:val="18"/>
+              </w:rPr>
+              <w:t>Lección</w:t>
+            </w:r>
+          </w:p>
+        </w:tc>
+        <w:tc>
+          <w:tcPr>
+            <w:tcW w:w="3969" w:type="dxa"/>
+            <w:shd w:val="clear" w:color="auto" w:fill="E8F0FB"/>
+          </w:tcPr>
+          <w:p>
+            <w:pPr>
+              <w:spacing w:after="0"/>
+            </w:pPr>
+            <w:r>
+              <w:rPr>
+                <w:b/>
+                <w:sz w:val="18"/>
+              </w:rPr>
+              <w:t>Qué pide</w:t>
+            </w:r>
+          </w:p>
+        </w:tc>
+        <w:tc>
+          <w:tcPr>
+            <w:tcW w:w="4025" w:type="dxa"/>
+            <w:shd w:val="clear" w:color="auto" w:fill="E8F0FB"/>
+          </w:tcPr>
+          <w:p>
+            <w:pPr>
+              <w:spacing w:after="0"/>
+            </w:pPr>
+            <w:r>
+              <w:rPr>
+                <w:b/>
+                <w:sz w:val="18"/>
+              </w:rPr>
+              <w:t>Estado</w:t>
+            </w:r>
+          </w:p>
+        </w:tc>
+      </w:tr>
+      <w:tr>
+        <w:trPr>
+          <w:jc w:val="center"/>
+        </w:trPr>
+        <w:tc>
+          <w:tcPr>
+            <w:tcW w:w="1247" w:type="dxa"/>
+          </w:tcPr>
+          <w:p>
+            <w:pPr>
+              <w:spacing w:after="0"/>
+            </w:pPr>
+            <w:r>
+              <w:rPr>
+                <w:sz w:val="18"/>
+              </w:rPr>
+              <w:t>L1–L2</w:t>
+            </w:r>
+          </w:p>
+        </w:tc>
+        <w:tc>
+          <w:tcPr>
+            <w:tcW w:w="3969" w:type="dxa"/>
+          </w:tcPr>
+          <w:p>
+            <w:pPr>
+              <w:spacing w:after="0"/>
+            </w:pPr>
+            <w:r>
+              <w:rPr>
+                <w:sz w:val="18"/>
+              </w:rPr>
+              <w:t>introducción, problema, objetivos; población, individuo y muestra</w:t>
+            </w:r>
+          </w:p>
+        </w:tc>
+        <w:tc>
+          <w:tcPr>
+            <w:tcW w:w="4025" w:type="dxa"/>
+          </w:tcPr>
+          <w:p>
+            <w:pPr>
+              <w:spacing w:after="0"/>
+            </w:pPr>
+            <w:r>
+              <w:rPr>
+                <w:sz w:val="18"/>
+              </w:rPr>
+              <w:t>Hecho (web: Inicio y Descriptiva 01)</w:t>
+            </w:r>
+          </w:p>
+        </w:tc>
+      </w:tr>
+      <w:tr>
+        <w:trPr>
+          <w:jc w:val="center"/>
+        </w:trPr>
+        <w:tc>
+          <w:tcPr>
+            <w:tcW w:w="1247" w:type="dxa"/>
+          </w:tcPr>
+          <w:p>
+            <w:pPr>
+              <w:spacing w:after="0"/>
+            </w:pPr>
+            <w:r>
+              <w:rPr>
+                <w:sz w:val="18"/>
+              </w:rPr>
+              <w:t>L3</w:t>
+            </w:r>
+          </w:p>
+        </w:tc>
+        <w:tc>
+          <w:tcPr>
+            <w:tcW w:w="3969" w:type="dxa"/>
+          </w:tcPr>
+          <w:p>
+            <w:pPr>
+              <w:spacing w:after="0"/>
+            </w:pPr>
+            <w:r>
+              <w:rPr>
+                <w:sz w:val="18"/>
+              </w:rPr>
+              <w:t>muestreo y mapa de ubicación en QGIS</w:t>
+            </w:r>
+          </w:p>
+        </w:tc>
+        <w:tc>
+          <w:tcPr>
+            <w:tcW w:w="4025" w:type="dxa"/>
+          </w:tcPr>
+          <w:p>
+            <w:pPr>
+              <w:spacing w:after="0"/>
+            </w:pPr>
+            <w:r>
+              <w:rPr>
+                <w:sz w:val="18"/>
+              </w:rPr>
+              <w:t>Mapa hecho (QGIS y Python). Falta el informe de muestreo estratificado</w:t>
+            </w:r>
+          </w:p>
+        </w:tc>
+      </w:tr>
+      <w:tr>
+        <w:trPr>
+          <w:jc w:val="center"/>
+        </w:trPr>
+        <w:tc>
+          <w:tcPr>
+            <w:tcW w:w="1247" w:type="dxa"/>
+          </w:tcPr>
+          <w:p>
+            <w:pPr>
+              <w:spacing w:after="0"/>
+            </w:pPr>
+            <w:r>
+              <w:rPr>
+                <w:sz w:val="18"/>
+              </w:rPr>
+              <w:t>L4</w:t>
+            </w:r>
+          </w:p>
+        </w:tc>
+        <w:tc>
+          <w:tcPr>
+            <w:tcW w:w="3969" w:type="dxa"/>
+          </w:tcPr>
+          <w:p>
+            <w:pPr>
+              <w:spacing w:after="0"/>
+            </w:pPr>
+            <w:r>
+              <w:rPr>
+                <w:sz w:val="18"/>
+              </w:rPr>
+              <w:t>tabla de variables: tipo, subtipo, dominio, rango, instrumento, unidad</w:t>
+            </w:r>
+          </w:p>
+        </w:tc>
+        <w:tc>
+          <w:tcPr>
+            <w:tcW w:w="4025" w:type="dxa"/>
+          </w:tcPr>
+          <w:p>
+            <w:pPr>
+              <w:spacing w:after="0"/>
+            </w:pPr>
+            <w:r>
+              <w:rPr>
+                <w:sz w:val="18"/>
+              </w:rPr>
+              <w:t>Hecho (web y Excel, formato del curso)</w:t>
+            </w:r>
+          </w:p>
+        </w:tc>
+      </w:tr>
+      <w:tr>
+        <w:trPr>
+          <w:jc w:val="center"/>
+        </w:trPr>
+        <w:tc>
+          <w:tcPr>
+            <w:tcW w:w="1247" w:type="dxa"/>
+          </w:tcPr>
+          <w:p>
+            <w:pPr>
+              <w:spacing w:after="0"/>
+            </w:pPr>
+            <w:r>
+              <w:rPr>
+                <w:sz w:val="18"/>
+              </w:rPr>
+              <w:t>L5</w:t>
+            </w:r>
+          </w:p>
+        </w:tc>
+        <w:tc>
+          <w:tcPr>
+            <w:tcW w:w="3969" w:type="dxa"/>
+          </w:tcPr>
+          <w:p>
+            <w:pPr>
+              <w:spacing w:after="0"/>
+            </w:pPr>
+            <w:r>
+              <w:rPr>
+                <w:sz w:val="18"/>
+              </w:rPr>
+              <w:t>tablas de frecuencia (TDF) y gráficas</w:t>
+            </w:r>
+          </w:p>
+        </w:tc>
+        <w:tc>
+          <w:tcPr>
+            <w:tcW w:w="4025" w:type="dxa"/>
+          </w:tcPr>
+          <w:p>
+            <w:pPr>
+              <w:spacing w:after="0"/>
+            </w:pPr>
+            <w:r>
+              <w:rPr>
+                <w:sz w:val="18"/>
+              </w:rPr>
+              <w:t>Hecho: 4 cualitativas, 2 discretas, 3 continuas (SiO2, MgO, Cr)</w:t>
+            </w:r>
+          </w:p>
+        </w:tc>
+      </w:tr>
+      <w:tr>
+        <w:trPr>
+          <w:jc w:val="center"/>
+        </w:trPr>
+        <w:tc>
+          <w:tcPr>
+            <w:tcW w:w="1247" w:type="dxa"/>
+          </w:tcPr>
+          <w:p>
+            <w:pPr>
+              <w:spacing w:after="0"/>
+            </w:pPr>
+            <w:r>
+              <w:rPr>
+                <w:sz w:val="18"/>
+              </w:rPr>
+              <w:t>L6</w:t>
+            </w:r>
+          </w:p>
+        </w:tc>
+        <w:tc>
+          <w:tcPr>
+            <w:tcW w:w="3969" w:type="dxa"/>
+          </w:tcPr>
+          <w:p>
+            <w:pPr>
+              <w:spacing w:after="0"/>
+            </w:pPr>
+            <w:r>
+              <w:rPr>
+                <w:sz w:val="18"/>
+              </w:rPr>
+              <w:t>indicadores de posición, dispersión y forma</w:t>
+            </w:r>
+          </w:p>
+        </w:tc>
+        <w:tc>
+          <w:tcPr>
+            <w:tcW w:w="4025" w:type="dxa"/>
+          </w:tcPr>
+          <w:p>
+            <w:pPr>
+              <w:spacing w:after="0"/>
+            </w:pPr>
+            <w:r>
+              <w:rPr>
+                <w:sz w:val="18"/>
+              </w:rPr>
+              <w:t>Hecho para esas variables; se puede ampliar a más</w:t>
+            </w:r>
+          </w:p>
+        </w:tc>
+      </w:tr>
+      <w:tr>
+        <w:trPr>
+          <w:jc w:val="center"/>
+        </w:trPr>
+        <w:tc>
+          <w:tcPr>
+            <w:tcW w:w="1247" w:type="dxa"/>
+          </w:tcPr>
+          <w:p>
+            <w:pPr>
+              <w:spacing w:after="0"/>
+            </w:pPr>
+            <w:r>
+              <w:rPr>
+                <w:sz w:val="18"/>
+              </w:rPr>
+              <w:t>L7</w:t>
+            </w:r>
+          </w:p>
+        </w:tc>
+        <w:tc>
+          <w:tcPr>
+            <w:tcW w:w="3969" w:type="dxa"/>
+          </w:tcPr>
+          <w:p>
+            <w:pPr>
+              <w:spacing w:after="0"/>
+            </w:pPr>
+            <w:r>
+              <w:rPr>
+                <w:sz w:val="18"/>
+              </w:rPr>
+              <w:t>exposición de la etapa descriptiva y conclusiones</w:t>
+            </w:r>
+          </w:p>
+        </w:tc>
+        <w:tc>
+          <w:tcPr>
+            <w:tcW w:w="4025" w:type="dxa"/>
+          </w:tcPr>
+          <w:p>
+            <w:pPr>
+              <w:spacing w:after="0"/>
+            </w:pPr>
+            <w:r>
+              <w:rPr>
+                <w:sz w:val="18"/>
+              </w:rPr>
+              <w:t>Pendiente: redactar conclusiones y preparar la exposición</w:t>
+            </w:r>
+          </w:p>
+        </w:tc>
+      </w:tr>
+      <w:tr>
+        <w:trPr>
+          <w:jc w:val="center"/>
+        </w:trPr>
+        <w:tc>
+          <w:tcPr>
+            <w:tcW w:w="1247" w:type="dxa"/>
+          </w:tcPr>
+          <w:p>
+            <w:pPr>
+              <w:spacing w:after="0"/>
+            </w:pPr>
+            <w:r>
+              <w:rPr>
+                <w:sz w:val="18"/>
+              </w:rPr>
+              <w:t>Unidades 2–4</w:t>
+            </w:r>
+          </w:p>
+        </w:tc>
+        <w:tc>
+          <w:tcPr>
+            <w:tcW w:w="3969" w:type="dxa"/>
+          </w:tcPr>
+          <w:p>
+            <w:pPr>
+              <w:spacing w:after="0"/>
+            </w:pPr>
+            <w:r>
+              <w:rPr>
+                <w:sz w:val="18"/>
+              </w:rPr>
+              <w:t>inferencia, regresión, red neuronal</w:t>
+            </w:r>
+          </w:p>
+        </w:tc>
+        <w:tc>
+          <w:tcPr>
+            <w:tcW w:w="4025" w:type="dxa"/>
+          </w:tcPr>
+          <w:p>
+            <w:pPr>
+              <w:spacing w:after="0"/>
+            </w:pPr>
+            <w:r>
+              <w:rPr>
+                <w:sz w:val="18"/>
+              </w:rPr>
+              <w:t>Pendiente</w:t>
+            </w:r>
+          </w:p>
+        </w:tc>
+      </w:tr>
+    </w:tbl>
+    <w:p>
+      <w:pPr>
+        <w:spacing w:after="40"/>
+      </w:pPr>
+    </w:p>
+    <w:p>
+      <w:pPr>
+        <w:pStyle w:val="Ttulo2"/>
+      </w:pPr>
+      <w:bookmarkStart w:id="4" w:name="_Toc242992766"/>
+      <w:r>
+        <w:lastRenderedPageBreak/>
+        <w:t>Cinco ideas clave para la exposición</w:t>
+      </w:r>
+      <w:bookmarkEnd w:id="4"/>
+    </w:p>
+    <w:p>
+      <w:pPr>
+        <w:pStyle w:val="Listaconnmeros"/>
+      </w:pPr>
+      <w:r>
+        <w:rPr>
+          <w:b/>
+        </w:rPr>
+        <w:t xml:space="preserve">La muestra no es aleatoria. </w:t>
+      </w:r>
+      <w:r>
+        <w:t>PetDB reúne lo que los investigadores decidieron estudiar durante casi un siglo, con más rocas del fondo del mar que de los continentes. Para la inferencia se usarán submuestras aleatorias por estrato.</w:t>
+      </w:r>
+    </w:p>
+    <w:p>
+      <w:pPr>
+        <w:pStyle w:val="Listaconnmeros"/>
+      </w:pPr>
+      <w:r>
+        <w:rPr>
+          <w:b/>
+        </w:rPr>
+        <w:t xml:space="preserve">Una celda vacía significa «no se midió», no cero. </w:t>
+      </w:r>
+      <w:r>
+        <w:t>Por eso cada análisis usa solo las filas que tienen medidas las variables de ese análisis, y siempre se informa cuántas son (n).</w:t>
+      </w:r>
+    </w:p>
+    <w:p>
+      <w:pPr>
+        <w:pStyle w:val="Listaconnmeros"/>
+      </w:pPr>
+      <w:r>
+        <w:rPr>
+          <w:b/>
+        </w:rPr>
+        <w:t xml:space="preserve">La agrupación por defecto no servía. </w:t>
+      </w:r>
+      <w:r>
+        <w:t>Con Sturges sobre el rango completo, el 99,9 % del cromo caía en un solo intervalo. Se usaron intervalos sobre el rango típico y dos clases abiertas para los extremos.</w:t>
+      </w:r>
+    </w:p>
+    <w:p>
+      <w:pPr>
+        <w:pStyle w:val="Listaconnmeros"/>
+      </w:pPr>
+      <w:r>
+        <w:rPr>
+          <w:b/>
+        </w:rPr>
+        <w:t xml:space="preserve">Los outliers no se borraron. </w:t>
+      </w:r>
+      <w:r>
+        <w:t>Casi todos son otras rocas (riolitas, peridotitas, cromititas), no errores. Borrarlos habría eliminado poblaciones enteras.</w:t>
+      </w:r>
+    </w:p>
+    <w:p>
+      <w:pPr>
+        <w:pStyle w:val="Listaconnmeros"/>
+      </w:pPr>
+      <w:r>
+        <w:rPr>
+          <w:b/>
+        </w:rPr>
+        <w:t xml:space="preserve">Los elementos traza se miran en escala logarítmica. </w:t>
+      </w:r>
+      <w:r>
+        <w:t>Así se ve su forma real y aparecen dos poblaciones en el cromo: basaltos y rocas ultramáficas.</w:t>
+      </w:r>
+    </w:p>
+    <w:p>
+      <w:pPr>
+        <w:pStyle w:val="Ttulo2"/>
+      </w:pPr>
+      <w:bookmarkStart w:id="5" w:name="_Toc242992767"/>
+      <w:r>
+        <w:t>Cómo trabajar con los archivos en tu computadora</w:t>
+      </w:r>
+      <w:bookmarkEnd w:id="5"/>
+    </w:p>
+    <w:p>
+      <w:r>
+        <w:rPr>
+          <w:b/>
+        </w:rPr>
+        <w:t xml:space="preserve">Ver la base en Excel. </w:t>
+      </w:r>
+      <w:r>
+        <w:t>Descarga data/earthchem_limpio.csv.gz desde la página Datos, descomprímela con 7-Zip y en Excel usa Datos › Desde texto/CSV, con origen UTF-8 y, en Transformar datos, configuración regional Inglés (Estados Unidos) para que el punto sea el separador decimal.</w:t>
+      </w:r>
+    </w:p>
+    <w:p>
+      <w:r>
+        <w:rPr>
+          <w:b/>
+        </w:rPr>
+        <w:t xml:space="preserve">Correr los scripts de R. </w:t>
+      </w:r>
+      <w:r>
+        <w:t>Instala R (4.4 o más nuevo) y RStudio. En GitHub, en el repositorio, usa Code › Download ZIP y descomprime. Abre RStudio, ve a Session › Set Working Directory y elige la carpeta del repositorio. La primera vez ejecuta install.packages(c("e1071", "openxlsx")). Después, por ejemplo, source("R/03_continuas.R"): las gráficas quedan en docs/img/r/ y las tablas en R/salidas/.</w:t>
+      </w:r>
+    </w:p>
+    <w:p>
+      <w:r>
+        <w:rPr>
+          <w:b/>
+        </w:rPr>
+        <w:t xml:space="preserve">Abrir el mapa en QGIS. </w:t>
+      </w:r>
+      <w:r>
+        <w:t>Descarga mapa_ubicacion.qgz y mapa_ubicacion.gpkg (página Datos) en la misma carpeta y abre el .qgz. La composición de impresión se llama «Mapa de ubicación A4».</w:t>
+      </w:r>
+    </w:p>
+    <w:p>
+      <w:pPr>
+        <w:pStyle w:val="Ttulo2"/>
+      </w:pPr>
+      <w:bookmarkStart w:id="6" w:name="_Toc242992768"/>
+      <w:r>
+        <w:t>Glosario</w:t>
+      </w:r>
+      <w:bookmarkEnd w:id="6"/>
+    </w:p>
+    <w:tbl>
+      <w:tblPr>
+        <w:tblStyle w:val="Tablaconcuadrcula"/>
+        <w:tblW w:w="0" w:type="auto"/>
+        <w:jc w:val="center"/>
+        <w:tblLook w:val="04A0" w:firstRow="1" w:lastRow="0" w:firstColumn="1" w:lastColumn="0" w:noHBand="0" w:noVBand="1"/>
+      </w:tblPr>
+      <w:tblGrid>
+        <w:gridCol w:w="2551"/>
+        <w:gridCol w:w="6690"/>
+      </w:tblGrid>
+      <w:tr>
+        <w:trPr>
+          <w:jc w:val="center"/>
+        </w:trPr>
+        <w:tc>
+          <w:tcPr>
+            <w:tcW w:w="2551" w:type="dxa"/>
+            <w:shd w:val="clear" w:color="auto" w:fill="E8F0FB"/>
+          </w:tcPr>
+          <w:p>
+            <w:pPr>
+              <w:spacing w:after="0"/>
+            </w:pPr>
+            <w:r>
+              <w:rPr>
+                <w:b/>
+                <w:sz w:val="18"/>
+              </w:rPr>
+              <w:t>Término</w:t>
+            </w:r>
+          </w:p>
+        </w:tc>
+        <w:tc>
+          <w:tcPr>
+            <w:tcW w:w="6690" w:type="dxa"/>
+            <w:shd w:val="clear" w:color="auto" w:fill="E8F0FB"/>
+          </w:tcPr>
+          <w:p>
+            <w:pPr>
+              <w:spacing w:after="0"/>
+            </w:pPr>
+            <w:r>
+              <w:rPr>
+                <w:b/>
+                <w:sz w:val="18"/>
+              </w:rPr>
+              <w:t>Qué significa</w:t>
+            </w:r>
+          </w:p>
+        </w:tc>
+      </w:tr>
+      <w:tr>
+        <w:trPr>
+          <w:jc w:val="center"/>
+        </w:trPr>
+        <w:tc>
+          <w:tcPr>
+            <w:tcW w:w="2551" w:type="dxa"/>
+          </w:tcPr>
+          <w:p>
+            <w:pPr>
+              <w:spacing w:after="0"/>
+            </w:pPr>
+            <w:r>
+              <w:rPr>
+                <w:sz w:val="18"/>
+              </w:rPr>
+              <w:t>TDF</w:t>
+            </w:r>
+          </w:p>
+        </w:tc>
+        <w:tc>
+          <w:tcPr>
+            <w:tcW w:w="6690" w:type="dxa"/>
+          </w:tcPr>
+          <w:p>
+            <w:pPr>
+              <w:spacing w:after="0"/>
+            </w:pPr>
+            <w:r>
+              <w:rPr>
+                <w:sz w:val="18"/>
+              </w:rPr>
+              <w:t>tabla de distribución de frecuencias: cuántos datos caen en cada clase o intervalo</w:t>
+            </w:r>
+          </w:p>
+        </w:tc>
+      </w:tr>
+      <w:tr>
+        <w:trPr>
+          <w:jc w:val="center"/>
+        </w:trPr>
+        <w:tc>
+          <w:tcPr>
+            <w:tcW w:w="2551" w:type="dxa"/>
+          </w:tcPr>
+          <w:p>
+            <w:pPr>
+              <w:spacing w:after="0"/>
+            </w:pPr>
+            <w:r>
+              <w:rPr>
+                <w:sz w:val="18"/>
+              </w:rPr>
+              <w:t>Li, Ls, MC</w:t>
+            </w:r>
+          </w:p>
+        </w:tc>
+        <w:tc>
+          <w:tcPr>
+            <w:tcW w:w="6690" w:type="dxa"/>
+          </w:tcPr>
+          <w:p>
+            <w:pPr>
+              <w:spacing w:after="0"/>
+            </w:pPr>
+            <w:r>
+              <w:rPr>
+                <w:sz w:val="18"/>
+              </w:rPr>
+              <w:t>límite inferior y superior del intervalo, y su marca de clase (el punto medio)</w:t>
+            </w:r>
+          </w:p>
+        </w:tc>
+      </w:tr>
+      <w:tr>
+        <w:trPr>
+          <w:jc w:val="center"/>
+        </w:trPr>
+        <w:tc>
+          <w:tcPr>
+            <w:tcW w:w="2551" w:type="dxa"/>
+          </w:tcPr>
+          <w:p>
+            <w:pPr>
+              <w:spacing w:after="0"/>
+            </w:pPr>
+            <w:r>
+              <w:rPr>
+                <w:sz w:val="18"/>
+              </w:rPr>
+              <w:t>ni, hi</w:t>
+            </w:r>
+          </w:p>
+        </w:tc>
+        <w:tc>
+          <w:tcPr>
+            <w:tcW w:w="6690" w:type="dxa"/>
+          </w:tcPr>
+          <w:p>
+            <w:pPr>
+              <w:spacing w:after="0"/>
+            </w:pPr>
+            <w:r>
+              <w:rPr>
+                <w:sz w:val="18"/>
+              </w:rPr>
+              <w:t>frecuencia absoluta (cuántos datos) y relativa (qué porcentaje)</w:t>
+            </w:r>
+          </w:p>
+        </w:tc>
+      </w:tr>
+      <w:tr>
+        <w:trPr>
+          <w:jc w:val="center"/>
+        </w:trPr>
+        <w:tc>
+          <w:tcPr>
+            <w:tcW w:w="2551" w:type="dxa"/>
+          </w:tcPr>
+          <w:p>
+            <w:pPr>
+              <w:spacing w:after="0"/>
+            </w:pPr>
+            <w:r>
+              <w:rPr>
+                <w:sz w:val="18"/>
+              </w:rPr>
+              <w:t>Ni, Hi ↑ / ↓</w:t>
+            </w:r>
+          </w:p>
+        </w:tc>
+        <w:tc>
+          <w:tcPr>
+            <w:tcW w:w="6690" w:type="dxa"/>
+          </w:tcPr>
+          <w:p>
+            <w:pPr>
+              <w:spacing w:after="0"/>
+            </w:pPr>
+            <w:r>
+              <w:rPr>
+                <w:sz w:val="18"/>
+              </w:rPr>
+              <w:t>frecuencias acumuladas ascendentes y descendentes; con ellas se dibuja la ojiva</w:t>
+            </w:r>
+          </w:p>
+        </w:tc>
+      </w:tr>
+      <w:tr>
+        <w:trPr>
+          <w:jc w:val="center"/>
+        </w:trPr>
+        <w:tc>
+          <w:tcPr>
+            <w:tcW w:w="2551" w:type="dxa"/>
+          </w:tcPr>
+          <w:p>
+            <w:pPr>
+              <w:spacing w:after="0"/>
+            </w:pPr>
+            <w:r>
+              <w:rPr>
+                <w:sz w:val="18"/>
+              </w:rPr>
+              <w:t>Sturges</w:t>
+            </w:r>
+          </w:p>
+        </w:tc>
+        <w:tc>
+          <w:tcPr>
+            <w:tcW w:w="6690" w:type="dxa"/>
+          </w:tcPr>
+          <w:p>
+            <w:pPr>
+              <w:spacing w:after="0"/>
+            </w:pPr>
+            <w:r>
+              <w:rPr>
+                <w:sz w:val="18"/>
+              </w:rPr>
+              <w:t>regla para el número de intervalos: k = 1 + 3,3 log n</w:t>
+            </w:r>
+          </w:p>
+        </w:tc>
+      </w:tr>
+      <w:tr>
+        <w:trPr>
+          <w:jc w:val="center"/>
+        </w:trPr>
+        <w:tc>
+          <w:tcPr>
+            <w:tcW w:w="2551" w:type="dxa"/>
+          </w:tcPr>
+          <w:p>
+            <w:pPr>
+              <w:spacing w:after="0"/>
+            </w:pPr>
+            <w:r>
+              <w:rPr>
+                <w:sz w:val="18"/>
+              </w:rPr>
+              <w:t>IQR (rango intercuartílico)</w:t>
+            </w:r>
+          </w:p>
+        </w:tc>
+        <w:tc>
+          <w:tcPr>
+            <w:tcW w:w="6690" w:type="dxa"/>
+          </w:tcPr>
+          <w:p>
+            <w:pPr>
+              <w:spacing w:after="0"/>
+            </w:pPr>
+            <w:r>
+              <w:rPr>
+                <w:sz w:val="18"/>
+              </w:rPr>
+              <w:t>Q3 − Q1; un dato es atípico si cae fuera de Q1 − 1,5·IQR o de Q3 + 1,5·IQR</w:t>
+            </w:r>
+          </w:p>
+        </w:tc>
+      </w:tr>
+      <w:tr>
+        <w:trPr>
+          <w:jc w:val="center"/>
+        </w:trPr>
+        <w:tc>
+          <w:tcPr>
+            <w:tcW w:w="2551" w:type="dxa"/>
+          </w:tcPr>
+          <w:p>
+            <w:pPr>
+              <w:spacing w:after="0"/>
+            </w:pPr>
+            <w:r>
+              <w:rPr>
+                <w:sz w:val="18"/>
+              </w:rPr>
+              <w:t>Clase abierta</w:t>
+            </w:r>
+          </w:p>
+        </w:tc>
+        <w:tc>
+          <w:tcPr>
+            <w:tcW w:w="6690" w:type="dxa"/>
+          </w:tcPr>
+          <w:p>
+            <w:pPr>
+              <w:spacing w:after="0"/>
+            </w:pPr>
+            <w:r>
+              <w:rPr>
+                <w:sz w:val="18"/>
+              </w:rPr>
+              <w:t>intervalo sin uno de sus límites («&lt; 36» o «≥ 66») que agrupa los valores extremos</w:t>
+            </w:r>
+          </w:p>
+        </w:tc>
+      </w:tr>
+      <w:tr>
+        <w:trPr>
+          <w:jc w:val="center"/>
+        </w:trPr>
+        <w:tc>
+          <w:tcPr>
+            <w:tcW w:w="2551" w:type="dxa"/>
+          </w:tcPr>
+          <w:p>
+            <w:pPr>
+              <w:spacing w:after="0"/>
+            </w:pPr>
+            <w:r>
+              <w:rPr>
+                <w:sz w:val="18"/>
+              </w:rPr>
+              <w:t>Error de agrupación</w:t>
+            </w:r>
+          </w:p>
+        </w:tc>
+        <w:tc>
+          <w:tcPr>
+            <w:tcW w:w="6690" w:type="dxa"/>
+          </w:tcPr>
+          <w:p>
+            <w:pPr>
+              <w:spacing w:after="0"/>
+            </w:pPr>
+            <w:r>
+              <w:rPr>
+                <w:sz w:val="18"/>
+              </w:rPr>
+              <w:t>diferencia entre la media (o desviación) calculada con la TDF y con los datos sin agrupar</w:t>
+            </w:r>
+          </w:p>
+        </w:tc>
+      </w:tr>
+      <w:tr>
+        <w:trPr>
+          <w:jc w:val="center"/>
+        </w:trPr>
+        <w:tc>
+          <w:tcPr>
+            <w:tcW w:w="2551" w:type="dxa"/>
+          </w:tcPr>
+          <w:p>
+            <w:pPr>
+              <w:spacing w:after="0"/>
+            </w:pPr>
+            <w:r>
+              <w:rPr>
+                <w:sz w:val="18"/>
+              </w:rPr>
+              <w:t>Escala log10</w:t>
+            </w:r>
+          </w:p>
+        </w:tc>
+        <w:tc>
+          <w:tcPr>
+            <w:tcW w:w="6690" w:type="dxa"/>
+          </w:tcPr>
+          <w:p>
+            <w:pPr>
+              <w:spacing w:after="0"/>
+            </w:pPr>
+            <w:r>
+              <w:rPr>
+                <w:sz w:val="18"/>
+              </w:rPr>
+              <w:t>trabajar con el logaritmo del valor; separa bien datos que van de 0,01 a 100.000</w:t>
+            </w:r>
+          </w:p>
+        </w:tc>
+      </w:tr>
+      <w:tr>
+        <w:trPr>
+          <w:jc w:val="center"/>
+        </w:trPr>
+        <w:tc>
+          <w:tcPr>
+            <w:tcW w:w="2551" w:type="dxa"/>
+          </w:tcPr>
+          <w:p>
+            <w:pPr>
+              <w:spacing w:after="0"/>
+            </w:pPr>
+            <w:r>
+              <w:rPr>
+                <w:sz w:val="18"/>
+              </w:rPr>
+              <w:t>Estrato</w:t>
+            </w:r>
+          </w:p>
+        </w:tc>
+        <w:tc>
+          <w:tcPr>
+            <w:tcW w:w="6690" w:type="dxa"/>
+          </w:tcPr>
+          <w:p>
+            <w:pPr>
+              <w:spacing w:after="0"/>
+            </w:pPr>
+            <w:r>
+              <w:rPr>
+                <w:sz w:val="18"/>
+              </w:rPr>
+              <w:t>subgrupo homogéneo de la muestra (por ejemplo, solo rocas volcánicas máficas)</w:t>
+            </w:r>
+          </w:p>
+        </w:tc>
+      </w:tr>
+      <w:tr>
+        <w:trPr>
+          <w:jc w:val="center"/>
+        </w:trPr>
+        <w:tc>
+          <w:tcPr>
+            <w:tcW w:w="2551" w:type="dxa"/>
+          </w:tcPr>
+          <w:p>
+            <w:pPr>
+              <w:spacing w:after="0"/>
+            </w:pPr>
+            <w:r>
+              <w:rPr>
+                <w:sz w:val="18"/>
+              </w:rPr>
+              <w:t>Dominio / rango</w:t>
+            </w:r>
+          </w:p>
+        </w:tc>
+        <w:tc>
+          <w:tcPr>
+            <w:tcW w:w="6690" w:type="dxa"/>
+          </w:tcPr>
+          <w:p>
+            <w:pPr>
+              <w:spacing w:after="0"/>
+            </w:pPr>
+            <w:r>
+              <w:rPr>
+                <w:sz w:val="18"/>
+              </w:rPr>
+              <w:t>valores que la variable puede tomar en teoría / valores que tomó en la muestra (ver sección 4.1)</w:t>
+            </w:r>
+          </w:p>
+        </w:tc>
+      </w:tr>
+      <w:tr>
+        <w:trPr>
+          <w:jc w:val="center"/>
+        </w:trPr>
+        <w:tc>
+          <w:tcPr>
+            <w:tcW w:w="2551" w:type="dxa"/>
+          </w:tcPr>
+          <w:p>
+            <w:pPr>
+              <w:spacing w:after="0"/>
+            </w:pPr>
+            <w:r>
+              <w:rPr>
+                <w:sz w:val="18"/>
+              </w:rPr>
+              <w:t>wt% / ppm</w:t>
+            </w:r>
+          </w:p>
+        </w:tc>
+        <w:tc>
+          <w:tcPr>
+            <w:tcW w:w="6690" w:type="dxa"/>
+          </w:tcPr>
+          <w:p>
+            <w:pPr>
+              <w:spacing w:after="0"/>
+            </w:pPr>
+            <w:r>
+              <w:rPr>
+                <w:sz w:val="18"/>
+              </w:rPr>
+              <w:t>porcentaje en peso / partes por millón (1 wt% = 10.000 ppm)</w:t>
+            </w:r>
+          </w:p>
+        </w:tc>
+      </w:tr>
+    </w:tbl>
+    <w:p>
+      <w:pPr>
+        <w:spacing w:after="40"/>
+      </w:pPr>
     </w:p>
     <w:p>
       <w:r>
@@ -1785,22 +3921,22 @@
       <w:pPr>
         <w:pStyle w:val="Ttulo1"/>
       </w:pPr>
-      <w:bookmarkStart w:id="0" w:name="_Toc242990525"/>
+      <w:bookmarkStart w:id="7" w:name="_Toc242992769"/>
       <w:r>
         <w:lastRenderedPageBreak/>
         <w:t>Parte I. La base de datos</w:t>
       </w:r>
-      <w:bookmarkEnd w:id="0"/>
+      <w:bookmarkEnd w:id="7"/>
     </w:p>
     <w:p>
       <w:pPr>
         <w:pStyle w:val="Ttulo2"/>
       </w:pPr>
-      <w:bookmarkStart w:id="1" w:name="_Toc242990526"/>
+      <w:bookmarkStart w:id="8" w:name="_Toc242992770"/>
       <w:r>
         <w:t>1. Qué es esta base</w:t>
       </w:r>
-      <w:bookmarkEnd w:id="1"/>
+      <w:bookmarkEnd w:id="8"/>
     </w:p>
     <w:p>
       <w:r>
@@ -1825,11 +3961,11 @@
       <w:pPr>
         <w:pStyle w:val="Ttulo2"/>
       </w:pPr>
-      <w:bookmarkStart w:id="2" w:name="_Toc242990527"/>
+      <w:bookmarkStart w:id="9" w:name="_Toc242992771"/>
       <w:r>
         <w:t>2. De dónde salieron los datos</w:t>
       </w:r>
-      <w:bookmarkEnd w:id="2"/>
+      <w:bookmarkEnd w:id="9"/>
     </w:p>
     <w:p>
       <w:r>
@@ -1896,11 +4032,11 @@
       <w:pPr>
         <w:pStyle w:val="Ttulo2"/>
       </w:pPr>
-      <w:bookmarkStart w:id="3" w:name="_Toc242990528"/>
+      <w:bookmarkStart w:id="10" w:name="_Toc242992772"/>
       <w:r>
         <w:t>3. Cómo se preparó</w:t>
       </w:r>
-      <w:bookmarkEnd w:id="3"/>
+      <w:bookmarkEnd w:id="10"/>
     </w:p>
     <w:p>
       <w:r>
@@ -1968,11 +4104,11 @@
       <w:pPr>
         <w:pStyle w:val="Ttulo2"/>
       </w:pPr>
-      <w:bookmarkStart w:id="4" w:name="_Toc242990529"/>
+      <w:bookmarkStart w:id="11" w:name="_Toc242992773"/>
       <w:r>
         <w:t>4. Variables</w:t>
       </w:r>
-      <w:bookmarkEnd w:id="4"/>
+      <w:bookmarkEnd w:id="11"/>
     </w:p>
     <w:p>
       <w:r>
@@ -2391,13 +4527,422 @@
     </w:p>
     <w:p>
       <w:pPr>
+        <w:pStyle w:val="Ttulo3"/>
+      </w:pPr>
+      <w:r>
+        <w:t>4.1 Dominio y rango: qué significan</w:t>
+      </w:r>
+    </w:p>
+    <w:p>
+      <w:r>
+        <w:t xml:space="preserve">La idea es la misma que con las funciones en matemáticas. El </w:t>
+      </w:r>
+      <w:r>
+        <w:rPr>
+          <w:b/>
+        </w:rPr>
+        <w:t>dominio</w:t>
+      </w:r>
+      <w:r>
+        <w:t xml:space="preserve"> son todos los valores que la variable podría tomar en teoría, por cómo es la variable. El </w:t>
+      </w:r>
+      <w:r>
+        <w:rPr>
+          <w:b/>
+        </w:rPr>
+        <w:t>rango</w:t>
+      </w:r>
+      <w:r>
+        <w:t xml:space="preserve"> son los valores que tomó de verdad en nuestros datos. La plantilla del curso escribe el dominio dos veces: en palabras (la definición) y como conjunto numérico. Por ejemplo, una concentración puede ser cualquier número real desde cero hacia arriba (dominio R+ ∪ {0}), pero en esta base el SiO2 va de 0,0011 % a 98,9 % (rango).</w:t>
+      </w:r>
+    </w:p>
+    <w:tbl>
+      <w:tblPr>
+        <w:tblStyle w:val="Tablaconcuadrcula"/>
+        <w:tblW w:w="0" w:type="auto"/>
+        <w:jc w:val="center"/>
+        <w:tblLook w:val="04A0" w:firstRow="1" w:lastRow="0" w:firstColumn="1" w:lastColumn="0" w:noHBand="0" w:noVBand="1"/>
+      </w:tblPr>
+      <w:tblGrid>
+        <w:gridCol w:w="1701"/>
+        <w:gridCol w:w="3175"/>
+        <w:gridCol w:w="1928"/>
+        <w:gridCol w:w="2438"/>
+      </w:tblGrid>
+      <w:tr>
+        <w:trPr>
+          <w:jc w:val="center"/>
+        </w:trPr>
+        <w:tc>
+          <w:tcPr>
+            <w:tcW w:w="1701" w:type="dxa"/>
+            <w:shd w:val="clear" w:color="auto" w:fill="E8F0FB"/>
+          </w:tcPr>
+          <w:p>
+            <w:pPr>
+              <w:spacing w:after="0"/>
+            </w:pPr>
+            <w:r>
+              <w:rPr>
+                <w:b/>
+                <w:sz w:val="18"/>
+              </w:rPr>
+              <w:t>Variable</w:t>
+            </w:r>
+          </w:p>
+        </w:tc>
+        <w:tc>
+          <w:tcPr>
+            <w:tcW w:w="3175" w:type="dxa"/>
+            <w:shd w:val="clear" w:color="auto" w:fill="E8F0FB"/>
+          </w:tcPr>
+          <w:p>
+            <w:pPr>
+              <w:spacing w:after="0"/>
+            </w:pPr>
+            <w:r>
+              <w:rPr>
+                <w:b/>
+                <w:sz w:val="18"/>
+              </w:rPr>
+              <w:t>Dominio (definición)</w:t>
+            </w:r>
+          </w:p>
+        </w:tc>
+        <w:tc>
+          <w:tcPr>
+            <w:tcW w:w="1928" w:type="dxa"/>
+            <w:shd w:val="clear" w:color="auto" w:fill="E8F0FB"/>
+          </w:tcPr>
+          <w:p>
+            <w:pPr>
+              <w:spacing w:after="0"/>
+            </w:pPr>
+            <w:r>
+              <w:rPr>
+                <w:b/>
+                <w:sz w:val="18"/>
+              </w:rPr>
+              <w:t>Dominio (conjunto)</w:t>
+            </w:r>
+          </w:p>
+        </w:tc>
+        <w:tc>
+          <w:tcPr>
+            <w:tcW w:w="2438" w:type="dxa"/>
+            <w:shd w:val="clear" w:color="auto" w:fill="E8F0FB"/>
+          </w:tcPr>
+          <w:p>
+            <w:pPr>
+              <w:spacing w:after="0"/>
+            </w:pPr>
+            <w:r>
+              <w:rPr>
+                <w:b/>
+                <w:sz w:val="18"/>
+              </w:rPr>
+              <w:t>Rango</w:t>
+            </w:r>
+          </w:p>
+        </w:tc>
+      </w:tr>
+      <w:tr>
+        <w:trPr>
+          <w:jc w:val="center"/>
+        </w:trPr>
+        <w:tc>
+          <w:tcPr>
+            <w:tcW w:w="1701" w:type="dxa"/>
+          </w:tcPr>
+          <w:p>
+            <w:pPr>
+              <w:spacing w:after="0"/>
+            </w:pPr>
+            <w:r>
+              <w:rPr>
+                <w:sz w:val="18"/>
+              </w:rPr>
+              <w:t>SiO2 (wt%)</w:t>
+            </w:r>
+          </w:p>
+        </w:tc>
+        <w:tc>
+          <w:tcPr>
+            <w:tcW w:w="3175" w:type="dxa"/>
+          </w:tcPr>
+          <w:p>
+            <w:pPr>
+              <w:spacing w:after="0"/>
+            </w:pPr>
+            <w:r>
+              <w:rPr>
+                <w:sz w:val="18"/>
+              </w:rPr>
+              <w:t>D={x/x es concentración ^ x ∈ R}</w:t>
+            </w:r>
+          </w:p>
+        </w:tc>
+        <w:tc>
+          <w:tcPr>
+            <w:tcW w:w="1928" w:type="dxa"/>
+          </w:tcPr>
+          <w:p>
+            <w:pPr>
+              <w:spacing w:after="0"/>
+            </w:pPr>
+            <w:r>
+              <w:rPr>
+                <w:sz w:val="18"/>
+              </w:rPr>
+              <w:t>D={x/x ∈ R+ ∪ {0}}</w:t>
+            </w:r>
+          </w:p>
+        </w:tc>
+        <w:tc>
+          <w:tcPr>
+            <w:tcW w:w="2438" w:type="dxa"/>
+          </w:tcPr>
+          <w:p>
+            <w:pPr>
+              <w:spacing w:after="0"/>
+            </w:pPr>
+            <w:r>
+              <w:rPr>
+                <w:sz w:val="18"/>
+              </w:rPr>
+              <w:t>R={y/ 0.0011 ≤ y ≤ 98.9}</w:t>
+            </w:r>
+          </w:p>
+        </w:tc>
+      </w:tr>
+      <w:tr>
+        <w:trPr>
+          <w:jc w:val="center"/>
+        </w:trPr>
+        <w:tc>
+          <w:tcPr>
+            <w:tcW w:w="1701" w:type="dxa"/>
+          </w:tcPr>
+          <w:p>
+            <w:pPr>
+              <w:spacing w:after="0"/>
+            </w:pPr>
+            <w:r>
+              <w:rPr>
+                <w:sz w:val="18"/>
+              </w:rPr>
+              <w:t>Publication Year</w:t>
+            </w:r>
+          </w:p>
+        </w:tc>
+        <w:tc>
+          <w:tcPr>
+            <w:tcW w:w="3175" w:type="dxa"/>
+          </w:tcPr>
+          <w:p>
+            <w:pPr>
+              <w:spacing w:after="0"/>
+            </w:pPr>
+            <w:r>
+              <w:rPr>
+                <w:sz w:val="18"/>
+              </w:rPr>
+              <w:t>D={x/x es tiempo ^ x ∈ N ^ Tipo(x)=años}</w:t>
+            </w:r>
+          </w:p>
+        </w:tc>
+        <w:tc>
+          <w:tcPr>
+            <w:tcW w:w="1928" w:type="dxa"/>
+          </w:tcPr>
+          <w:p>
+            <w:pPr>
+              <w:spacing w:after="0"/>
+            </w:pPr>
+            <w:r>
+              <w:rPr>
+                <w:sz w:val="18"/>
+              </w:rPr>
+              <w:t>D={x/x ∈ Z+}</w:t>
+            </w:r>
+          </w:p>
+        </w:tc>
+        <w:tc>
+          <w:tcPr>
+            <w:tcW w:w="2438" w:type="dxa"/>
+          </w:tcPr>
+          <w:p>
+            <w:pPr>
+              <w:spacing w:after="0"/>
+            </w:pPr>
+            <w:r>
+              <w:rPr>
+                <w:sz w:val="18"/>
+              </w:rPr>
+              <w:t>R={y/ 1932 ≤ y ≤ 2025}</w:t>
+            </w:r>
+          </w:p>
+        </w:tc>
+      </w:tr>
+      <w:tr>
+        <w:trPr>
+          <w:jc w:val="center"/>
+        </w:trPr>
+        <w:tc>
+          <w:tcPr>
+            <w:tcW w:w="1701" w:type="dxa"/>
+          </w:tcPr>
+          <w:p>
+            <w:pPr>
+              <w:spacing w:after="0"/>
+            </w:pPr>
+            <w:r>
+              <w:rPr>
+                <w:sz w:val="18"/>
+              </w:rPr>
+              <w:t>Alteration Grade</w:t>
+            </w:r>
+          </w:p>
+        </w:tc>
+        <w:tc>
+          <w:tcPr>
+            <w:tcW w:w="3175" w:type="dxa"/>
+          </w:tcPr>
+          <w:p>
+            <w:pPr>
+              <w:spacing w:after="0"/>
+            </w:pPr>
+            <w:r>
+              <w:rPr>
+                <w:sz w:val="18"/>
+              </w:rPr>
+              <w:t>D={x/x es grado de alteración ^ x ∈ N ^ 0 ≤ x ≤ 5}</w:t>
+            </w:r>
+          </w:p>
+        </w:tc>
+        <w:tc>
+          <w:tcPr>
+            <w:tcW w:w="1928" w:type="dxa"/>
+          </w:tcPr>
+          <w:p>
+            <w:pPr>
+              <w:spacing w:after="0"/>
+            </w:pPr>
+            <w:r>
+              <w:rPr>
+                <w:sz w:val="18"/>
+              </w:rPr>
+              <w:t>D={x/x ∈ Z+ ∪ {0}}</w:t>
+            </w:r>
+          </w:p>
+        </w:tc>
+        <w:tc>
+          <w:tcPr>
+            <w:tcW w:w="2438" w:type="dxa"/>
+          </w:tcPr>
+          <w:p>
+            <w:pPr>
+              <w:spacing w:after="0"/>
+            </w:pPr>
+            <w:r>
+              <w:rPr>
+                <w:sz w:val="18"/>
+              </w:rPr>
+              <w:t>R={y/y ∈ {0, 1, 2, 3, 4, 5}}</w:t>
+            </w:r>
+          </w:p>
+        </w:tc>
+      </w:tr>
+      <w:tr>
+        <w:trPr>
+          <w:jc w:val="center"/>
+        </w:trPr>
+        <w:tc>
+          <w:tcPr>
+            <w:tcW w:w="1701" w:type="dxa"/>
+          </w:tcPr>
+          <w:p>
+            <w:pPr>
+              <w:spacing w:after="0"/>
+            </w:pPr>
+            <w:r>
+              <w:rPr>
+                <w:sz w:val="18"/>
+              </w:rPr>
+              <w:t>Sample Type</w:t>
+            </w:r>
+          </w:p>
+        </w:tc>
+        <w:tc>
+          <w:tcPr>
+            <w:tcW w:w="3175" w:type="dxa"/>
+          </w:tcPr>
+          <w:p>
+            <w:pPr>
+              <w:spacing w:after="0"/>
+            </w:pPr>
+            <w:r>
+              <w:rPr>
+                <w:sz w:val="18"/>
+              </w:rPr>
+              <w:t>D={x/x es roca ^ Clasificación(x)=petrográfica}</w:t>
+            </w:r>
+          </w:p>
+        </w:tc>
+        <w:tc>
+          <w:tcPr>
+            <w:tcW w:w="1928" w:type="dxa"/>
+          </w:tcPr>
+          <w:p>
+            <w:pPr>
+              <w:spacing w:after="0"/>
+            </w:pPr>
+            <w:r>
+              <w:rPr>
+                <w:sz w:val="18"/>
+              </w:rPr>
+              <w:t>D={x/x ∈ Clase de roca}</w:t>
+            </w:r>
+          </w:p>
+        </w:tc>
+        <w:tc>
+          <w:tcPr>
+            <w:tcW w:w="2438" w:type="dxa"/>
+          </w:tcPr>
+          <w:p>
+            <w:pPr>
+              <w:spacing w:after="0"/>
+            </w:pPr>
+            <w:r>
+              <w:rPr>
+                <w:sz w:val="18"/>
+              </w:rPr>
+              <w:t>R={y/y ∈ Clase de roca} (27 categorías)</w:t>
+            </w:r>
+          </w:p>
+        </w:tc>
+      </w:tr>
+    </w:tbl>
+    <w:p>
+      <w:pPr>
+        <w:spacing w:after="40"/>
+      </w:pPr>
+    </w:p>
+    <w:p>
+      <w:r>
+        <w:t>En las variables cualitativas el rango son las categorías que aparecen en la base; cuando son pocas se enumeran y cuando son muchas se indica cuántas hay.</w:t>
+      </w:r>
+    </w:p>
+    <w:p>
+      <w:pPr>
         <w:pStyle w:val="Ttulo2"/>
       </w:pPr>
-      <w:bookmarkStart w:id="5" w:name="_Toc242990530"/>
+      <w:bookmarkStart w:id="12" w:name="_Toc242992774"/>
       <w:r>
+        <w:lastRenderedPageBreak/>
         <w:t>5. Requisitos del trabajo</w:t>
       </w:r>
-      <w:bookmarkEnd w:id="5"/>
+      <w:bookmarkEnd w:id="12"/>
     </w:p>
     <w:tbl>
       <w:tblPr>
@@ -2639,11 +5184,11 @@
       <w:pPr>
         <w:pStyle w:val="Ttulo2"/>
       </w:pPr>
-      <w:bookmarkStart w:id="6" w:name="_Toc242990531"/>
+      <w:bookmarkStart w:id="13" w:name="_Toc242992775"/>
       <w:r>
         <w:t>6. Limitaciones que conviene conocer</w:t>
       </w:r>
-      <w:bookmarkEnd w:id="6"/>
+      <w:bookmarkEnd w:id="13"/>
     </w:p>
     <w:p>
       <w:r>
@@ -2683,7 +5228,6 @@
         <w:rPr>
           <w:b/>
         </w:rPr>
-        <w:lastRenderedPageBreak/>
         <w:t xml:space="preserve">Sesgos de origen. </w:t>
       </w:r>
       <w:r>
@@ -2694,11 +5238,11 @@
       <w:pPr>
         <w:pStyle w:val="Ttulo2"/>
       </w:pPr>
-      <w:bookmarkStart w:id="7" w:name="_Toc242990532"/>
+      <w:bookmarkStart w:id="14" w:name="_Toc242992776"/>
       <w:r>
         <w:t>7. Acceso y cita</w:t>
       </w:r>
-      <w:bookmarkEnd w:id="7"/>
+      <w:bookmarkEnd w:id="14"/>
     </w:p>
     <w:p>
       <w:r>
@@ -2735,12 +5279,12 @@
       <w:pPr>
         <w:pStyle w:val="Ttulo1"/>
       </w:pPr>
-      <w:bookmarkStart w:id="8" w:name="_Toc242990533"/>
+      <w:bookmarkStart w:id="15" w:name="_Toc242992777"/>
       <w:r>
         <w:lastRenderedPageBreak/>
         <w:t>Parte II. Estadística descriptiva</w:t>
       </w:r>
-      <w:bookmarkEnd w:id="8"/>
+      <w:bookmarkEnd w:id="15"/>
     </w:p>
     <w:p>
       <w:r>
@@ -2751,11 +5295,11 @@
       <w:pPr>
         <w:pStyle w:val="Ttulo2"/>
       </w:pPr>
-      <w:bookmarkStart w:id="9" w:name="_Toc242990534"/>
+      <w:bookmarkStart w:id="16" w:name="_Toc242992778"/>
       <w:r>
         <w:t>8. Por qué no sirvió la agrupación por defecto</w:t>
       </w:r>
-      <w:bookmarkEnd w:id="9"/>
+      <w:bookmarkEnd w:id="16"/>
     </w:p>
     <w:p>
       <w:r>
@@ -2771,7 +5315,7 @@
           <w:noProof/>
         </w:rPr>
         <w:drawing>
-          <wp:inline distT="0" distB="0" distL="0" distR="0" wp14:anchorId="139146D0" wp14:editId="47564FE3">
+          <wp:inline distT="0" distB="0" distL="0" distR="0" wp14:anchorId="77FD002B" wp14:editId="3FFC599F">
             <wp:extent cx="5760000" cy="2496000"/>
             <wp:effectExtent l="0" t="0" r="0" b="0"/>
             <wp:docPr id="1" name="Picture 1"/>
@@ -2824,11 +5368,11 @@
       <w:pPr>
         <w:pStyle w:val="Ttulo2"/>
       </w:pPr>
-      <w:bookmarkStart w:id="10" w:name="_Toc242990535"/>
+      <w:bookmarkStart w:id="17" w:name="_Toc242992779"/>
       <w:r>
         <w:t>9. Outliers: otras rocas, no errores</w:t>
       </w:r>
-      <w:bookmarkEnd w:id="10"/>
+      <w:bookmarkEnd w:id="17"/>
     </w:p>
     <w:p>
       <w:r>
@@ -2848,7 +5392,7 @@
         </w:rPr>
         <w:lastRenderedPageBreak/>
         <w:drawing>
-          <wp:inline distT="0" distB="0" distL="0" distR="0" wp14:anchorId="55438564" wp14:editId="1A612393">
+          <wp:inline distT="0" distB="0" distL="0" distR="0" wp14:anchorId="4F070719" wp14:editId="5BA817DB">
             <wp:extent cx="5760000" cy="3840000"/>
             <wp:effectExtent l="0" t="0" r="0" b="0"/>
             <wp:docPr id="2" name="Picture 2"/>
@@ -2913,6 +5457,869 @@
       </w:r>
     </w:p>
     <w:p>
+      <w:pPr>
+        <w:pStyle w:val="Ttulo2"/>
+      </w:pPr>
+      <w:bookmarkStart w:id="18" w:name="_Toc242992780"/>
+      <w:r>
+        <w:t>10. ¿Alcanzan los datos para las regresiones?</w:t>
+      </w:r>
+      <w:bookmarkEnd w:id="18"/>
+    </w:p>
+    <w:p>
+      <w:r>
+        <w:t>Sí. Aunque hay muchos huecos, en una regresión solo cuentan las filas que tienen medidas las dos variables, y quedan miles. La tabla muestra algunos pares útiles para la Unidad 3, con el número de filas completas y la correlación (r), en escala original y en escala logarítmica:</w:t>
+      </w:r>
+    </w:p>
+    <w:tbl>
+      <w:tblPr>
+        <w:tblStyle w:val="Tablaconcuadrcula"/>
+        <w:tblW w:w="0" w:type="auto"/>
+        <w:jc w:val="center"/>
+        <w:tblLook w:val="04A0" w:firstRow="1" w:lastRow="0" w:firstColumn="1" w:lastColumn="0" w:noHBand="0" w:noVBand="1"/>
+      </w:tblPr>
+      <w:tblGrid>
+        <w:gridCol w:w="1871"/>
+        <w:gridCol w:w="1871"/>
+        <w:gridCol w:w="1701"/>
+        <w:gridCol w:w="1247"/>
+        <w:gridCol w:w="1247"/>
+      </w:tblGrid>
+      <w:tr>
+        <w:trPr>
+          <w:jc w:val="center"/>
+        </w:trPr>
+        <w:tc>
+          <w:tcPr>
+            <w:tcW w:w="1871" w:type="dxa"/>
+            <w:shd w:val="clear" w:color="auto" w:fill="E8F0FB"/>
+          </w:tcPr>
+          <w:p>
+            <w:pPr>
+              <w:spacing w:after="0"/>
+            </w:pPr>
+            <w:r>
+              <w:rPr>
+                <w:b/>
+                <w:sz w:val="18"/>
+              </w:rPr>
+              <w:t>Variable X</w:t>
+            </w:r>
+          </w:p>
+        </w:tc>
+        <w:tc>
+          <w:tcPr>
+            <w:tcW w:w="1871" w:type="dxa"/>
+            <w:shd w:val="clear" w:color="auto" w:fill="E8F0FB"/>
+          </w:tcPr>
+          <w:p>
+            <w:pPr>
+              <w:spacing w:after="0"/>
+            </w:pPr>
+            <w:r>
+              <w:rPr>
+                <w:b/>
+                <w:sz w:val="18"/>
+              </w:rPr>
+              <w:t>Variable Y</w:t>
+            </w:r>
+          </w:p>
+        </w:tc>
+        <w:tc>
+          <w:tcPr>
+            <w:tcW w:w="1701" w:type="dxa"/>
+            <w:shd w:val="clear" w:color="auto" w:fill="E8F0FB"/>
+          </w:tcPr>
+          <w:p>
+            <w:pPr>
+              <w:spacing w:after="0"/>
+            </w:pPr>
+            <w:r>
+              <w:rPr>
+                <w:b/>
+                <w:sz w:val="18"/>
+              </w:rPr>
+              <w:t>Filas completas</w:t>
+            </w:r>
+          </w:p>
+        </w:tc>
+        <w:tc>
+          <w:tcPr>
+            <w:tcW w:w="1247" w:type="dxa"/>
+            <w:shd w:val="clear" w:color="auto" w:fill="E8F0FB"/>
+          </w:tcPr>
+          <w:p>
+            <w:pPr>
+              <w:spacing w:after="0"/>
+            </w:pPr>
+            <w:r>
+              <w:rPr>
+                <w:b/>
+                <w:sz w:val="18"/>
+              </w:rPr>
+              <w:t>r</w:t>
+            </w:r>
+          </w:p>
+        </w:tc>
+        <w:tc>
+          <w:tcPr>
+            <w:tcW w:w="1247" w:type="dxa"/>
+            <w:shd w:val="clear" w:color="auto" w:fill="E8F0FB"/>
+          </w:tcPr>
+          <w:p>
+            <w:pPr>
+              <w:spacing w:after="0"/>
+            </w:pPr>
+            <w:r>
+              <w:rPr>
+                <w:b/>
+                <w:sz w:val="18"/>
+              </w:rPr>
+              <w:t>r (log10)</w:t>
+            </w:r>
+          </w:p>
+        </w:tc>
+      </w:tr>
+      <w:tr>
+        <w:trPr>
+          <w:jc w:val="center"/>
+        </w:trPr>
+        <w:tc>
+          <w:tcPr>
+            <w:tcW w:w="1871" w:type="dxa"/>
+          </w:tcPr>
+          <w:p>
+            <w:pPr>
+              <w:spacing w:after="0"/>
+            </w:pPr>
+            <w:r>
+              <w:rPr>
+                <w:sz w:val="18"/>
+              </w:rPr>
+              <w:t>MgO (wt%)</w:t>
+            </w:r>
+          </w:p>
+        </w:tc>
+        <w:tc>
+          <w:tcPr>
+            <w:tcW w:w="1871" w:type="dxa"/>
+          </w:tcPr>
+          <w:p>
+            <w:pPr>
+              <w:spacing w:after="0"/>
+            </w:pPr>
+            <w:r>
+              <w:rPr>
+                <w:sz w:val="18"/>
+              </w:rPr>
+              <w:t>Ni (ppm)</w:t>
+            </w:r>
+          </w:p>
+        </w:tc>
+        <w:tc>
+          <w:tcPr>
+            <w:tcW w:w="1701" w:type="dxa"/>
+          </w:tcPr>
+          <w:p>
+            <w:pPr>
+              <w:spacing w:after="0"/>
+            </w:pPr>
+            <w:r>
+              <w:rPr>
+                <w:sz w:val="18"/>
+              </w:rPr>
+              <w:t>9.379</w:t>
+            </w:r>
+          </w:p>
+        </w:tc>
+        <w:tc>
+          <w:tcPr>
+            <w:tcW w:w="1247" w:type="dxa"/>
+          </w:tcPr>
+          <w:p>
+            <w:pPr>
+              <w:spacing w:after="0"/>
+            </w:pPr>
+            <w:r>
+              <w:rPr>
+                <w:sz w:val="18"/>
+              </w:rPr>
+              <w:t>0,90</w:t>
+            </w:r>
+          </w:p>
+        </w:tc>
+        <w:tc>
+          <w:tcPr>
+            <w:tcW w:w="1247" w:type="dxa"/>
+          </w:tcPr>
+          <w:p>
+            <w:pPr>
+              <w:spacing w:after="0"/>
+            </w:pPr>
+            <w:r>
+              <w:rPr>
+                <w:sz w:val="18"/>
+              </w:rPr>
+              <w:t>0,85</w:t>
+            </w:r>
+          </w:p>
+        </w:tc>
+      </w:tr>
+      <w:tr>
+        <w:trPr>
+          <w:jc w:val="center"/>
+        </w:trPr>
+        <w:tc>
+          <w:tcPr>
+            <w:tcW w:w="1871" w:type="dxa"/>
+          </w:tcPr>
+          <w:p>
+            <w:pPr>
+              <w:spacing w:after="0"/>
+            </w:pPr>
+            <w:r>
+              <w:rPr>
+                <w:sz w:val="18"/>
+              </w:rPr>
+              <w:t>La (ppm)</w:t>
+            </w:r>
+          </w:p>
+        </w:tc>
+        <w:tc>
+          <w:tcPr>
+            <w:tcW w:w="1871" w:type="dxa"/>
+          </w:tcPr>
+          <w:p>
+            <w:pPr>
+              <w:spacing w:after="0"/>
+            </w:pPr>
+            <w:r>
+              <w:rPr>
+                <w:sz w:val="18"/>
+              </w:rPr>
+              <w:t>Ce (ppm)</w:t>
+            </w:r>
+          </w:p>
+        </w:tc>
+        <w:tc>
+          <w:tcPr>
+            <w:tcW w:w="1701" w:type="dxa"/>
+          </w:tcPr>
+          <w:p>
+            <w:pPr>
+              <w:spacing w:after="0"/>
+            </w:pPr>
+            <w:r>
+              <w:rPr>
+                <w:sz w:val="18"/>
+              </w:rPr>
+              <w:t>31.690</w:t>
+            </w:r>
+          </w:p>
+        </w:tc>
+        <w:tc>
+          <w:tcPr>
+            <w:tcW w:w="1247" w:type="dxa"/>
+          </w:tcPr>
+          <w:p>
+            <w:pPr>
+              <w:spacing w:after="0"/>
+            </w:pPr>
+            <w:r>
+              <w:rPr>
+                <w:sz w:val="18"/>
+              </w:rPr>
+              <w:t>0,91</w:t>
+            </w:r>
+          </w:p>
+        </w:tc>
+        <w:tc>
+          <w:tcPr>
+            <w:tcW w:w="1247" w:type="dxa"/>
+          </w:tcPr>
+          <w:p>
+            <w:pPr>
+              <w:spacing w:after="0"/>
+            </w:pPr>
+            <w:r>
+              <w:rPr>
+                <w:sz w:val="18"/>
+              </w:rPr>
+              <w:t>0,98</w:t>
+            </w:r>
+          </w:p>
+        </w:tc>
+      </w:tr>
+      <w:tr>
+        <w:trPr>
+          <w:jc w:val="center"/>
+        </w:trPr>
+        <w:tc>
+          <w:tcPr>
+            <w:tcW w:w="1871" w:type="dxa"/>
+          </w:tcPr>
+          <w:p>
+            <w:pPr>
+              <w:spacing w:after="0"/>
+            </w:pPr>
+            <w:r>
+              <w:rPr>
+                <w:sz w:val="18"/>
+              </w:rPr>
+              <w:t>Zr (ppm)</w:t>
+            </w:r>
+          </w:p>
+        </w:tc>
+        <w:tc>
+          <w:tcPr>
+            <w:tcW w:w="1871" w:type="dxa"/>
+          </w:tcPr>
+          <w:p>
+            <w:pPr>
+              <w:spacing w:after="0"/>
+            </w:pPr>
+            <w:r>
+              <w:rPr>
+                <w:sz w:val="18"/>
+              </w:rPr>
+              <w:t>Hf (ppm)</w:t>
+            </w:r>
+          </w:p>
+        </w:tc>
+        <w:tc>
+          <w:tcPr>
+            <w:tcW w:w="1701" w:type="dxa"/>
+          </w:tcPr>
+          <w:p>
+            <w:pPr>
+              <w:spacing w:after="0"/>
+            </w:pPr>
+            <w:r>
+              <w:rPr>
+                <w:sz w:val="18"/>
+              </w:rPr>
+              <w:t>20.521</w:t>
+            </w:r>
+          </w:p>
+        </w:tc>
+        <w:tc>
+          <w:tcPr>
+            <w:tcW w:w="1247" w:type="dxa"/>
+          </w:tcPr>
+          <w:p>
+            <w:pPr>
+              <w:spacing w:after="0"/>
+            </w:pPr>
+            <w:r>
+              <w:rPr>
+                <w:sz w:val="18"/>
+              </w:rPr>
+              <w:t>0,15</w:t>
+            </w:r>
+          </w:p>
+        </w:tc>
+        <w:tc>
+          <w:tcPr>
+            <w:tcW w:w="1247" w:type="dxa"/>
+          </w:tcPr>
+          <w:p>
+            <w:pPr>
+              <w:spacing w:after="0"/>
+            </w:pPr>
+            <w:r>
+              <w:rPr>
+                <w:sz w:val="18"/>
+              </w:rPr>
+              <w:t>0,97</w:t>
+            </w:r>
+          </w:p>
+        </w:tc>
+      </w:tr>
+      <w:tr>
+        <w:trPr>
+          <w:jc w:val="center"/>
+        </w:trPr>
+        <w:tc>
+          <w:tcPr>
+            <w:tcW w:w="1871" w:type="dxa"/>
+          </w:tcPr>
+          <w:p>
+            <w:pPr>
+              <w:spacing w:after="0"/>
+            </w:pPr>
+            <w:r>
+              <w:rPr>
+                <w:sz w:val="18"/>
+              </w:rPr>
+              <w:t>Nb (ppm)</w:t>
+            </w:r>
+          </w:p>
+        </w:tc>
+        <w:tc>
+          <w:tcPr>
+            <w:tcW w:w="1871" w:type="dxa"/>
+          </w:tcPr>
+          <w:p>
+            <w:pPr>
+              <w:spacing w:after="0"/>
+            </w:pPr>
+            <w:r>
+              <w:rPr>
+                <w:sz w:val="18"/>
+              </w:rPr>
+              <w:t>Ta (ppm)</w:t>
+            </w:r>
+          </w:p>
+        </w:tc>
+        <w:tc>
+          <w:tcPr>
+            <w:tcW w:w="1701" w:type="dxa"/>
+          </w:tcPr>
+          <w:p>
+            <w:pPr>
+              <w:spacing w:after="0"/>
+            </w:pPr>
+            <w:r>
+              <w:rPr>
+                <w:sz w:val="18"/>
+              </w:rPr>
+              <w:t>18.439</w:t>
+            </w:r>
+          </w:p>
+        </w:tc>
+        <w:tc>
+          <w:tcPr>
+            <w:tcW w:w="1247" w:type="dxa"/>
+          </w:tcPr>
+          <w:p>
+            <w:pPr>
+              <w:spacing w:after="0"/>
+            </w:pPr>
+            <w:r>
+              <w:rPr>
+                <w:sz w:val="18"/>
+              </w:rPr>
+              <w:t>-0,00</w:t>
+            </w:r>
+          </w:p>
+        </w:tc>
+        <w:tc>
+          <w:tcPr>
+            <w:tcW w:w="1247" w:type="dxa"/>
+          </w:tcPr>
+          <w:p>
+            <w:pPr>
+              <w:spacing w:after="0"/>
+            </w:pPr>
+            <w:r>
+              <w:rPr>
+                <w:sz w:val="18"/>
+              </w:rPr>
+              <w:t>0,92</w:t>
+            </w:r>
+          </w:p>
+        </w:tc>
+      </w:tr>
+      <w:tr>
+        <w:trPr>
+          <w:jc w:val="center"/>
+        </w:trPr>
+        <w:tc>
+          <w:tcPr>
+            <w:tcW w:w="1871" w:type="dxa"/>
+          </w:tcPr>
+          <w:p>
+            <w:pPr>
+              <w:spacing w:after="0"/>
+            </w:pPr>
+            <w:r>
+              <w:rPr>
+                <w:sz w:val="18"/>
+              </w:rPr>
+              <w:t>Rb (ppm)</w:t>
+            </w:r>
+          </w:p>
+        </w:tc>
+        <w:tc>
+          <w:tcPr>
+            <w:tcW w:w="1871" w:type="dxa"/>
+          </w:tcPr>
+          <w:p>
+            <w:pPr>
+              <w:spacing w:after="0"/>
+            </w:pPr>
+            <w:r>
+              <w:rPr>
+                <w:sz w:val="18"/>
+              </w:rPr>
+              <w:t>K2O (wt%)</w:t>
+            </w:r>
+          </w:p>
+        </w:tc>
+        <w:tc>
+          <w:tcPr>
+            <w:tcW w:w="1701" w:type="dxa"/>
+          </w:tcPr>
+          <w:p>
+            <w:pPr>
+              <w:spacing w:after="0"/>
+            </w:pPr>
+            <w:r>
+              <w:rPr>
+                <w:sz w:val="18"/>
+              </w:rPr>
+              <w:t>18.485</w:t>
+            </w:r>
+          </w:p>
+        </w:tc>
+        <w:tc>
+          <w:tcPr>
+            <w:tcW w:w="1247" w:type="dxa"/>
+          </w:tcPr>
+          <w:p>
+            <w:pPr>
+              <w:spacing w:after="0"/>
+            </w:pPr>
+            <w:r>
+              <w:rPr>
+                <w:sz w:val="18"/>
+              </w:rPr>
+              <w:t>0,73</w:t>
+            </w:r>
+          </w:p>
+        </w:tc>
+        <w:tc>
+          <w:tcPr>
+            <w:tcW w:w="1247" w:type="dxa"/>
+          </w:tcPr>
+          <w:p>
+            <w:pPr>
+              <w:spacing w:after="0"/>
+            </w:pPr>
+            <w:r>
+              <w:rPr>
+                <w:sz w:val="18"/>
+              </w:rPr>
+              <w:t>0,90</w:t>
+            </w:r>
+          </w:p>
+        </w:tc>
+      </w:tr>
+      <w:tr>
+        <w:trPr>
+          <w:jc w:val="center"/>
+        </w:trPr>
+        <w:tc>
+          <w:tcPr>
+            <w:tcW w:w="1871" w:type="dxa"/>
+          </w:tcPr>
+          <w:p>
+            <w:pPr>
+              <w:spacing w:after="0"/>
+            </w:pPr>
+            <w:r>
+              <w:rPr>
+                <w:sz w:val="18"/>
+              </w:rPr>
+              <w:t>Th (ppm)</w:t>
+            </w:r>
+          </w:p>
+        </w:tc>
+        <w:tc>
+          <w:tcPr>
+            <w:tcW w:w="1871" w:type="dxa"/>
+          </w:tcPr>
+          <w:p>
+            <w:pPr>
+              <w:spacing w:after="0"/>
+            </w:pPr>
+            <w:r>
+              <w:rPr>
+                <w:sz w:val="18"/>
+              </w:rPr>
+              <w:t>U (ppm)</w:t>
+            </w:r>
+          </w:p>
+        </w:tc>
+        <w:tc>
+          <w:tcPr>
+            <w:tcW w:w="1701" w:type="dxa"/>
+          </w:tcPr>
+          <w:p>
+            <w:pPr>
+              <w:spacing w:after="0"/>
+            </w:pPr>
+            <w:r>
+              <w:rPr>
+                <w:sz w:val="18"/>
+              </w:rPr>
+              <w:t>23.481</w:t>
+            </w:r>
+          </w:p>
+        </w:tc>
+        <w:tc>
+          <w:tcPr>
+            <w:tcW w:w="1247" w:type="dxa"/>
+          </w:tcPr>
+          <w:p>
+            <w:pPr>
+              <w:spacing w:after="0"/>
+            </w:pPr>
+            <w:r>
+              <w:rPr>
+                <w:sz w:val="18"/>
+              </w:rPr>
+              <w:t>0,65</w:t>
+            </w:r>
+          </w:p>
+        </w:tc>
+        <w:tc>
+          <w:tcPr>
+            <w:tcW w:w="1247" w:type="dxa"/>
+          </w:tcPr>
+          <w:p>
+            <w:pPr>
+              <w:spacing w:after="0"/>
+            </w:pPr>
+            <w:r>
+              <w:rPr>
+                <w:sz w:val="18"/>
+              </w:rPr>
+              <w:t>0,89</w:t>
+            </w:r>
+          </w:p>
+        </w:tc>
+      </w:tr>
+      <w:tr>
+        <w:trPr>
+          <w:jc w:val="center"/>
+        </w:trPr>
+        <w:tc>
+          <w:tcPr>
+            <w:tcW w:w="1871" w:type="dxa"/>
+          </w:tcPr>
+          <w:p>
+            <w:pPr>
+              <w:spacing w:after="0"/>
+            </w:pPr>
+            <w:r>
+              <w:rPr>
+                <w:sz w:val="18"/>
+              </w:rPr>
+              <w:t>MgO (wt%)</w:t>
+            </w:r>
+          </w:p>
+        </w:tc>
+        <w:tc>
+          <w:tcPr>
+            <w:tcW w:w="1871" w:type="dxa"/>
+          </w:tcPr>
+          <w:p>
+            <w:pPr>
+              <w:spacing w:after="0"/>
+            </w:pPr>
+            <w:r>
+              <w:rPr>
+                <w:sz w:val="18"/>
+              </w:rPr>
+              <w:t>Cr (ppm)</w:t>
+            </w:r>
+          </w:p>
+        </w:tc>
+        <w:tc>
+          <w:tcPr>
+            <w:tcW w:w="1701" w:type="dxa"/>
+          </w:tcPr>
+          <w:p>
+            <w:pPr>
+              <w:spacing w:after="0"/>
+            </w:pPr>
+            <w:r>
+              <w:rPr>
+                <w:sz w:val="18"/>
+              </w:rPr>
+              <w:t>20.074</w:t>
+            </w:r>
+          </w:p>
+        </w:tc>
+        <w:tc>
+          <w:tcPr>
+            <w:tcW w:w="1247" w:type="dxa"/>
+          </w:tcPr>
+          <w:p>
+            <w:pPr>
+              <w:spacing w:after="0"/>
+            </w:pPr>
+            <w:r>
+              <w:rPr>
+                <w:sz w:val="18"/>
+              </w:rPr>
+              <w:t>0,34</w:t>
+            </w:r>
+          </w:p>
+        </w:tc>
+        <w:tc>
+          <w:tcPr>
+            <w:tcW w:w="1247" w:type="dxa"/>
+          </w:tcPr>
+          <w:p>
+            <w:pPr>
+              <w:spacing w:after="0"/>
+            </w:pPr>
+            <w:r>
+              <w:rPr>
+                <w:sz w:val="18"/>
+              </w:rPr>
+              <w:t>0,78</w:t>
+            </w:r>
+          </w:p>
+        </w:tc>
+      </w:tr>
+      <w:tr>
+        <w:trPr>
+          <w:jc w:val="center"/>
+        </w:trPr>
+        <w:tc>
+          <w:tcPr>
+            <w:tcW w:w="1871" w:type="dxa"/>
+          </w:tcPr>
+          <w:p>
+            <w:pPr>
+              <w:spacing w:after="0"/>
+            </w:pPr>
+            <w:r>
+              <w:rPr>
+                <w:sz w:val="18"/>
+              </w:rPr>
+              <w:t>SiO2 (wt%)</w:t>
+            </w:r>
+          </w:p>
+        </w:tc>
+        <w:tc>
+          <w:tcPr>
+            <w:tcW w:w="1871" w:type="dxa"/>
+          </w:tcPr>
+          <w:p>
+            <w:pPr>
+              <w:spacing w:after="0"/>
+            </w:pPr>
+            <w:r>
+              <w:rPr>
+                <w:sz w:val="18"/>
+              </w:rPr>
+              <w:t>Na2O+K2O</w:t>
+            </w:r>
+          </w:p>
+        </w:tc>
+        <w:tc>
+          <w:tcPr>
+            <w:tcW w:w="1701" w:type="dxa"/>
+          </w:tcPr>
+          <w:p>
+            <w:pPr>
+              <w:spacing w:after="0"/>
+            </w:pPr>
+            <w:r>
+              <w:rPr>
+                <w:sz w:val="18"/>
+              </w:rPr>
+              <w:t>47.868</w:t>
+            </w:r>
+          </w:p>
+        </w:tc>
+        <w:tc>
+          <w:tcPr>
+            <w:tcW w:w="1247" w:type="dxa"/>
+          </w:tcPr>
+          <w:p>
+            <w:pPr>
+              <w:spacing w:after="0"/>
+            </w:pPr>
+            <w:r>
+              <w:rPr>
+                <w:sz w:val="18"/>
+              </w:rPr>
+              <w:t>0,55</w:t>
+            </w:r>
+          </w:p>
+        </w:tc>
+        <w:tc>
+          <w:tcPr>
+            <w:tcW w:w="1247" w:type="dxa"/>
+          </w:tcPr>
+          <w:p>
+            <w:pPr>
+              <w:spacing w:after="0"/>
+            </w:pPr>
+            <w:r>
+              <w:rPr>
+                <w:sz w:val="18"/>
+              </w:rPr>
+              <w:t>0,47</w:t>
+            </w:r>
+          </w:p>
+        </w:tc>
+      </w:tr>
+    </w:tbl>
+    <w:p>
+      <w:pPr>
+        <w:spacing w:after="40"/>
+      </w:pPr>
+    </w:p>
+    <w:p>
+      <w:r>
+        <w:t>Para una regresión múltiple con los seis óxidos mayores quedan 46.308 filas completas. Tres precauciones:</w:t>
+      </w:r>
+    </w:p>
+    <w:p>
+      <w:pPr>
+        <w:pStyle w:val="Listaconvietas"/>
+      </w:pPr>
+      <w:r>
+        <w:rPr>
+          <w:b/>
+        </w:rPr>
+        <w:t xml:space="preserve">Usar escala logarítmica en los elementos traza. </w:t>
+      </w:r>
+      <w:r>
+        <w:t>Zr y Hf parecen no relacionarse en escala normal (r bajo), pero en log10 la relación es casi perfecta: unos pocos valores extremos arruinan la regresión si no se transforma.</w:t>
+      </w:r>
+    </w:p>
+    <w:p>
+      <w:pPr>
+        <w:pStyle w:val="Listaconvietas"/>
+      </w:pPr>
+      <w:r>
+        <w:rPr>
+          <w:b/>
+        </w:rPr>
+        <w:t xml:space="preserve">No rellenar huecos con ceros ni promedios. </w:t>
+      </w:r>
+      <w:r>
+        <w:t>Trabajar con las filas completas de cada análisis e informar su n.</w:t>
+      </w:r>
+    </w:p>
+    <w:p>
+      <w:pPr>
+        <w:pStyle w:val="Listaconvietas"/>
+      </w:pPr>
+      <w:r>
+        <w:rPr>
+          <w:b/>
+        </w:rPr>
+        <w:t xml:space="preserve">Estratificar. </w:t>
+      </w:r>
+      <w:r>
+        <w:t>Mezclar basaltos con peridotitas puede inventar o esconder relaciones; conviene repetir cada regresión por tipo de roca o por grupo tectónico.</w:t>
+      </w:r>
+    </w:p>
+    <w:p>
+      <w:r>
+        <w:lastRenderedPageBreak/>
+        <w:t>Pares sugeridos por tipo de modelo: lineal simple, MgO frente a Ni; potencial o log-log, Zr frente a Hf y Nb frente a Ta; múltiple, los óxidos mayores.</w:t>
+      </w:r>
+    </w:p>
+    <w:p>
       <w:r>
         <w:br w:type="page"/>
       </w:r>
@@ -2921,12 +6328,12 @@
       <w:pPr>
         <w:pStyle w:val="Ttulo1"/>
       </w:pPr>
-      <w:bookmarkStart w:id="11" w:name="_Toc242990536"/>
+      <w:bookmarkStart w:id="19" w:name="_Toc242992781"/>
       <w:r>
         <w:lastRenderedPageBreak/>
         <w:t>Parte III. Cómo se construyó: documentación técnica</w:t>
       </w:r>
-      <w:bookmarkEnd w:id="11"/>
+      <w:bookmarkEnd w:id="19"/>
     </w:p>
     <w:p>
       <w:r>
@@ -2937,11 +6344,11 @@
       <w:pPr>
         <w:pStyle w:val="Ttulo2"/>
       </w:pPr>
-      <w:bookmarkStart w:id="12" w:name="_Toc242990537"/>
+      <w:bookmarkStart w:id="20" w:name="_Toc242992782"/>
       <w:r>
-        <w:t>10. Arquitectura general</w:t>
+        <w:t>11. Arquitectura general</w:t>
       </w:r>
-      <w:bookmarkEnd w:id="12"/>
+      <w:bookmarkEnd w:id="20"/>
     </w:p>
     <w:p>
       <w:r>
@@ -3130,11 +6537,11 @@
       <w:pPr>
         <w:pStyle w:val="Ttulo2"/>
       </w:pPr>
-      <w:bookmarkStart w:id="13" w:name="_Toc242990538"/>
+      <w:bookmarkStart w:id="21" w:name="_Toc242992783"/>
       <w:r>
-        <w:t>11. Herramientas y librerías</w:t>
+        <w:t>12. Herramientas y librerías</w:t>
       </w:r>
-      <w:bookmarkEnd w:id="13"/>
+      <w:bookmarkEnd w:id="21"/>
     </w:p>
     <w:tbl>
       <w:tblPr>
@@ -4118,11 +7525,11 @@
       <w:pPr>
         <w:pStyle w:val="Ttulo2"/>
       </w:pPr>
-      <w:bookmarkStart w:id="14" w:name="_Toc242990539"/>
+      <w:bookmarkStart w:id="22" w:name="_Toc242992784"/>
       <w:r>
-        <w:t>12. Limpieza de la base (scripts/limpiar.py)</w:t>
+        <w:t>13. Limpieza de la base (scripts/limpiar.py)</w:t>
       </w:r>
-      <w:bookmarkEnd w:id="14"/>
+      <w:bookmarkEnd w:id="22"/>
     </w:p>
     <w:p>
       <w:r>
@@ -4260,11 +7667,11 @@
       <w:pPr>
         <w:pStyle w:val="Ttulo2"/>
       </w:pPr>
-      <w:bookmarkStart w:id="15" w:name="_Toc242990540"/>
+      <w:bookmarkStart w:id="23" w:name="_Toc242992785"/>
       <w:r>
-        <w:t>13. Mapa de ubicación (Python y QGIS)</w:t>
+        <w:t>14. Mapa de ubicación (Python y QGIS)</w:t>
       </w:r>
-      <w:bookmarkEnd w:id="15"/>
+      <w:bookmarkEnd w:id="23"/>
     </w:p>
     <w:p>
       <w:r>
@@ -4310,7 +7717,7 @@
         </w:rPr>
         <w:lastRenderedPageBreak/>
         <w:drawing>
-          <wp:inline distT="0" distB="0" distL="0" distR="0" wp14:anchorId="1B9E7481" wp14:editId="28E831E3">
+          <wp:inline distT="0" distB="0" distL="0" distR="0" wp14:anchorId="5AA81B3A" wp14:editId="7E2964C5">
             <wp:extent cx="5760000" cy="4073225"/>
             <wp:effectExtent l="0" t="0" r="0" b="0"/>
             <wp:docPr id="3" name="Picture 3"/>
@@ -4363,11 +7770,11 @@
       <w:pPr>
         <w:pStyle w:val="Ttulo2"/>
       </w:pPr>
-      <w:bookmarkStart w:id="16" w:name="_Toc242990541"/>
+      <w:bookmarkStart w:id="24" w:name="_Toc242992786"/>
       <w:r>
-        <w:t>14. Estadística en R (carpeta R/)</w:t>
+        <w:t>15. Estadística en R (carpeta R/)</w:t>
       </w:r>
-      <w:bookmarkEnd w:id="16"/>
+      <w:bookmarkEnd w:id="24"/>
     </w:p>
     <w:p>
       <w:r>
@@ -4520,18 +7927,18 @@
       <w:pPr>
         <w:pStyle w:val="Ttulo2"/>
       </w:pPr>
-      <w:bookmarkStart w:id="17" w:name="_Toc242990542"/>
+      <w:bookmarkStart w:id="25" w:name="_Toc242992787"/>
       <w:r>
-        <w:t>15. La página web</w:t>
+        <w:t>16. La página web</w:t>
       </w:r>
-      <w:bookmarkEnd w:id="17"/>
+      <w:bookmarkEnd w:id="25"/>
     </w:p>
     <w:p>
       <w:pPr>
         <w:pStyle w:val="Ttulo3"/>
       </w:pPr>
       <w:r>
-        <w:t>15.1 Estructura y tecnología</w:t>
+        <w:t>16.1 Estructura y tecnología</w:t>
       </w:r>
     </w:p>
     <w:p>
@@ -4899,7 +8306,7 @@
         <w:pStyle w:val="Ttulo3"/>
       </w:pPr>
       <w:r>
-        <w:t>15.2 Cómo carga los datos</w:t>
+        <w:t>16.2 Cómo carga los datos</w:t>
       </w:r>
     </w:p>
     <w:p>
@@ -5033,7 +8440,7 @@
         <w:pStyle w:val="Ttulo3"/>
       </w:pPr>
       <w:r>
-        <w:t>15.3 Componentes y comportamiento</w:t>
+        <w:t>16.3 Componentes y comportamiento</w:t>
       </w:r>
     </w:p>
     <w:p>
@@ -5125,7 +8532,7 @@
         <w:pStyle w:val="Ttulo3"/>
       </w:pPr>
       <w:r>
-        <w:t>15.4 Diseño</w:t>
+        <w:t>16.4 Diseño</w:t>
       </w:r>
     </w:p>
     <w:p>
@@ -5241,7 +8648,7 @@
         <w:pStyle w:val="Ttulo3"/>
       </w:pPr>
       <w:r>
-        <w:t>15.5 Accesibilidad, celulares y rendimiento</w:t>
+        <w:t>16.5 Accesibilidad, celulares y rendimiento</w:t>
       </w:r>
     </w:p>
     <w:p>
@@ -5289,7 +8696,7 @@
         <w:pStyle w:val="Ttulo3"/>
       </w:pPr>
       <w:r>
-        <w:t>15.6 Imágenes</w:t>
+        <w:t>16.6 Imágenes</w:t>
       </w:r>
     </w:p>
     <w:p>
@@ -5352,11 +8759,11 @@
       <w:pPr>
         <w:pStyle w:val="Ttulo2"/>
       </w:pPr>
-      <w:bookmarkStart w:id="18" w:name="_Toc242990543"/>
+      <w:bookmarkStart w:id="26" w:name="_Toc242992788"/>
       <w:r>
-        <w:t>16. Publicación y control de versiones</w:t>
+        <w:t>17. Publicación y control de versiones</w:t>
       </w:r>
-      <w:bookmarkEnd w:id="18"/>
+      <w:bookmarkEnd w:id="26"/>
     </w:p>
     <w:p>
       <w:r>
@@ -5368,6 +8775,11 @@
     </w:p>
     <w:p>
       <w:r>
+        <w:t>El repositorio pertenece a la cuenta de Cristoffer Rumiguano (crisrumiguano-art), a quien se transfirió el 15 de octubre de 2026; Dalember (cuenta DalemberV) colabora con permiso de escritura. Cualquier integrante con acceso puede proponer cambios con un pull request.</w:t>
+      </w:r>
+    </w:p>
+    <w:p>
+      <w:r>
         <w:t>Límites a tener en cuenta: GitHub rechaza archivos de más de 100 MB, por eso los datos crudos (~600 MB) no están en el repositorio. Los archivos más pesados que sí están son las capas GIS (~35 MB) y la base limpia (~26 MB).</w:t>
       </w:r>
     </w:p>
@@ -5375,11 +8787,11 @@
       <w:pPr>
         <w:pStyle w:val="Ttulo2"/>
       </w:pPr>
-      <w:bookmarkStart w:id="19" w:name="_Toc242990544"/>
+      <w:bookmarkStart w:id="27" w:name="_Toc242992789"/>
       <w:r>
-        <w:t>17. Documentación del proyecto</w:t>
+        <w:t>18. Documentación del proyecto</w:t>
       </w:r>
-      <w:bookmarkEnd w:id="19"/>
+      <w:bookmarkEnd w:id="27"/>
     </w:p>
     <w:p>
       <w:pPr>
@@ -5455,15 +8867,16 @@
       <w:pPr>
         <w:pStyle w:val="Ttulo2"/>
       </w:pPr>
-      <w:bookmarkStart w:id="20" w:name="_Toc242990545"/>
+      <w:bookmarkStart w:id="28" w:name="_Toc242992790"/>
       <w:r>
-        <w:t>18. Cómo reproducir todo</w:t>
+        <w:lastRenderedPageBreak/>
+        <w:t>19. Cómo reproducir todo</w:t>
       </w:r>
-      <w:bookmarkEnd w:id="20"/>
+      <w:bookmarkEnd w:id="28"/>
     </w:p>
     <w:p>
       <w:r>
-        <w:t>Con los dos CSV crudos en una carpeta (o volviendo a descargarlos con la consulta guardada), desde la raíz del repositorio y en este orden:</w:t>
+        <w:t>Los dos CSV crudos están respaldados en Google Drive (carpeta 10-26 GDRIVE GEOQUIMICA ROCAS › datos_crudos_earthchem). En la computadora de Dalember, data/raw/crudos es un enlace (junction) a esa carpeta, y los scripts la usan por defecto. En otra computadora, basta con copiar ahí los CSV o pasar su carpeta como argumento. Desde la raíz del repositorio y en este orden:</w:t>
       </w:r>
     </w:p>
     <w:tbl>
@@ -5489,7 +8902,6 @@
                 <w:rFonts w:ascii="Consolas" w:hAnsi="Consolas"/>
                 <w:sz w:val="17"/>
               </w:rPr>
-              <w:lastRenderedPageBreak/>
               <w:t>pip install -r requirements.txt</w:t>
             </w:r>
           </w:p>
@@ -5502,7 +8914,7 @@
                 <w:rFonts w:ascii="Consolas" w:hAnsi="Consolas"/>
                 <w:sz w:val="17"/>
               </w:rPr>
-              <w:t>python -I scripts/limpiar.py "&lt;carpeta con los CSV crudos&gt;"</w:t>
+              <w:t>python -I scripts/limpiar.py            # usa data/raw/crudos</w:t>
             </w:r>
           </w:p>
           <w:p>
@@ -5526,7 +8938,7 @@
                 <w:rFonts w:ascii="Consolas" w:hAnsi="Consolas"/>
                 <w:sz w:val="17"/>
               </w:rPr>
-              <w:t>python scripts/tabla_variables.py "&lt;carpeta con los CSV crudos&gt;"</w:t>
+              <w:t>python scripts/tabla_variables.py      # usa data/raw/crudos</w:t>
             </w:r>
           </w:p>
           <w:p>
@@ -5640,11 +9052,11 @@
       <w:pPr>
         <w:pStyle w:val="Ttulo2"/>
       </w:pPr>
-      <w:bookmarkStart w:id="21" w:name="_Toc242990546"/>
+      <w:bookmarkStart w:id="29" w:name="_Toc242992791"/>
       <w:r>
-        <w:t>19. Limitaciones técnicas y mantenimiento</w:t>
+        <w:t>20. Limitaciones técnicas y mantenimiento</w:t>
       </w:r>
-      <w:bookmarkEnd w:id="21"/>
+      <w:bookmarkEnd w:id="29"/>
     </w:p>
     <w:p>
       <w:pPr>
@@ -5695,12 +9107,12 @@
       <w:pPr>
         <w:pStyle w:val="Ttulo1"/>
       </w:pPr>
-      <w:bookmarkStart w:id="22" w:name="_Toc242990547"/>
+      <w:bookmarkStart w:id="30" w:name="_Toc242992792"/>
       <w:r>
         <w:lastRenderedPageBreak/>
         <w:t>Anexo A. Diccionario de variables</w:t>
       </w:r>
-      <w:bookmarkEnd w:id="22"/>
+      <w:bookmarkEnd w:id="30"/>
     </w:p>
     <w:tbl>
       <w:tblPr>
@@ -9759,11 +13171,11 @@
       <w:pPr>
         <w:pStyle w:val="Ttulo1"/>
       </w:pPr>
-      <w:bookmarkStart w:id="23" w:name="_Toc242990548"/>
+      <w:bookmarkStart w:id="31" w:name="_Toc242992793"/>
       <w:r>
         <w:t>Anexo B. Estructura del repositorio</w:t>
       </w:r>
-      <w:bookmarkEnd w:id="23"/>
+      <w:bookmarkEnd w:id="31"/>
     </w:p>
     <w:tbl>
       <w:tblPr>
@@ -10213,31 +13625,31 @@
       </w:rPr>
     </w:lvl>
   </w:abstractNum>
-  <w:num w:numId="1" w16cid:durableId="1307318255">
+  <w:num w:numId="1" w16cid:durableId="529607741">
     <w:abstractNumId w:val="8"/>
   </w:num>
-  <w:num w:numId="2" w16cid:durableId="1952320731">
+  <w:num w:numId="2" w16cid:durableId="1641837195">
     <w:abstractNumId w:val="6"/>
   </w:num>
-  <w:num w:numId="3" w16cid:durableId="246043030">
+  <w:num w:numId="3" w16cid:durableId="1663043389">
     <w:abstractNumId w:val="5"/>
   </w:num>
-  <w:num w:numId="4" w16cid:durableId="1083527925">
+  <w:num w:numId="4" w16cid:durableId="192572123">
     <w:abstractNumId w:val="4"/>
   </w:num>
-  <w:num w:numId="5" w16cid:durableId="1130975453">
+  <w:num w:numId="5" w16cid:durableId="1883247886">
     <w:abstractNumId w:val="7"/>
   </w:num>
-  <w:num w:numId="6" w16cid:durableId="1708793512">
+  <w:num w:numId="6" w16cid:durableId="1115832117">
     <w:abstractNumId w:val="3"/>
   </w:num>
-  <w:num w:numId="7" w16cid:durableId="157964927">
+  <w:num w:numId="7" w16cid:durableId="354038571">
     <w:abstractNumId w:val="2"/>
   </w:num>
-  <w:num w:numId="8" w16cid:durableId="1015958962">
+  <w:num w:numId="8" w16cid:durableId="1245842650">
     <w:abstractNumId w:val="1"/>
   </w:num>
-  <w:num w:numId="9" w16cid:durableId="309362445">
+  <w:num w:numId="9" w16cid:durableId="1757551487">
     <w:abstractNumId w:val="0"/>
   </w:num>
 </w:numbering>
@@ -21628,7 +25040,7 @@
     <w:autoRedefine/>
     <w:uiPriority w:val="39"/>
     <w:unhideWhenUsed/>
-    <w:rsid w:val="00E9004F"/>
+    <w:rsid w:val="00B26720"/>
     <w:pPr>
       <w:spacing w:after="100"/>
     </w:pPr>
@@ -21640,7 +25052,7 @@
     <w:autoRedefine/>
     <w:uiPriority w:val="39"/>
     <w:unhideWhenUsed/>
-    <w:rsid w:val="00E9004F"/>
+    <w:rsid w:val="00B26720"/>
     <w:pPr>
       <w:spacing w:after="100"/>
       <w:ind w:left="220"/>
@@ -21651,7 +25063,7 @@
     <w:basedOn w:val="Fuentedeprrafopredeter"/>
     <w:uiPriority w:val="99"/>
     <w:unhideWhenUsed/>
-    <w:rsid w:val="00E9004F"/>
+    <w:rsid w:val="00B26720"/>
     <w:rPr>
       <w:color w:val="0000FF" w:themeColor="hyperlink"/>
       <w:u w:val="single"/>

</xml_diff>